<commit_message>
docs: refactor code comments for clarity and structure
</commit_message>
<xml_diff>
--- a/CE475_Term_Paper.docx
+++ b/CE475_Term_Paper.docx
@@ -42,7 +42,7 @@
     <w:p>
       <w:pPr>
         <w:spacing w:after="969" w:line="259" w:lineRule="auto"/>
-        <w:ind w:left="2778" w:firstLine="0"/>
+        <w:ind w:left="2835" w:right="2800" w:firstLine="0"/>
         <w:jc w:val="left"/>
         <w:rPr>
           <w:lang w:val="en-US"/>
@@ -58,9 +58,9 @@
         <mc:AlternateContent>
           <mc:Choice Requires="wpg">
             <w:drawing>
-              <wp:inline distT="0" distB="0" distL="0" distR="0" wp14:anchorId="6D9FB8C2" wp14:editId="237FCF55">
-                <wp:extent cx="3240024" cy="35941"/>
-                <wp:effectExtent l="0" t="0" r="0" b="0"/>
+              <wp:inline distT="0" distB="0" distL="0" distR="0" wp14:anchorId="6D9FB8C2" wp14:editId="32777775">
+                <wp:extent cx="2556000" cy="35941"/>
+                <wp:effectExtent l="25400" t="25400" r="34925" b="2540"/>
                 <wp:docPr id="6716" name="Group 6716"/>
                 <wp:cNvGraphicFramePr/>
                 <a:graphic xmlns:a="http://schemas.openxmlformats.org/drawingml/2006/main">
@@ -70,7 +70,7 @@
                       <wpg:grpSpPr>
                         <a:xfrm>
                           <a:off x="0" y="0"/>
-                          <a:ext cx="3240024" cy="35941"/>
+                          <a:ext cx="2556000" cy="35941"/>
                           <a:chOff x="0" y="0"/>
                           <a:chExt cx="3240024" cy="35941"/>
                         </a:xfrm>
@@ -126,13 +126,14 @@
               </wp:inline>
             </w:drawing>
           </mc:Choice>
-          <mc:Fallback xmlns:a="http://schemas.openxmlformats.org/drawingml/2006/main">
+          <mc:Fallback>
             <w:pict>
-              <v:group id="Group 6716" style="width:255.12pt;height:2.83pt;mso-position-horizontal-relative:char;mso-position-vertical-relative:line" coordsize="32400,359">
-                <v:shape id="Shape 11" style="position:absolute;width:32400;height:0;left:0;top:0;" coordsize="3240024,0" path="m0,0l3240024,0">
-                  <v:stroke weight="2.83pt" endcap="square" joinstyle="miter" miterlimit="10" on="true" color="#0066cc"/>
-                  <v:fill on="false" color="#000000" opacity="0"/>
+              <v:group w14:anchorId="394B44BB" id="Group 6716" o:spid="_x0000_s1026" style="width:201.25pt;height:2.85pt;mso-position-horizontal-relative:char;mso-position-vertical-relative:line" coordsize="32400,359" o:gfxdata="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">
+                <v:shape id="Shape 11" o:spid="_x0000_s1027" style="position:absolute;width:32400;height:0;visibility:visible;mso-wrap-style:square;v-text-anchor:top" coordsize="3240024,0" o:gfxdata="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" path="m,l3240024,e" filled="f" strokecolor="#06c" strokeweight="2.83pt">
+                  <v:stroke miterlimit="83231f" joinstyle="miter" endcap="square"/>
+                  <v:path arrowok="t" textboxrect="0,0,3240024,0"/>
                 </v:shape>
+                <w10:anchorlock/>
               </v:group>
             </w:pict>
           </mc:Fallback>
@@ -194,7 +195,7 @@
     <w:p>
       <w:pPr>
         <w:spacing w:after="418" w:line="259" w:lineRule="auto"/>
-        <w:ind w:left="-57" w:right="-56" w:firstLine="0"/>
+        <w:ind w:left="-57" w:right="-35" w:firstLine="0"/>
         <w:jc w:val="left"/>
         <w:rPr>
           <w:lang w:val="en-US"/>
@@ -210,9 +211,9 @@
         <mc:AlternateContent>
           <mc:Choice Requires="wpg">
             <w:drawing>
-              <wp:inline distT="0" distB="0" distL="0" distR="0" wp14:anchorId="7941B615" wp14:editId="68F34B66">
-                <wp:extent cx="6839966" cy="14351"/>
-                <wp:effectExtent l="0" t="0" r="0" b="0"/>
+              <wp:inline distT="0" distB="0" distL="0" distR="0" wp14:anchorId="7941B615" wp14:editId="12C1FEEA">
+                <wp:extent cx="6192000" cy="36000"/>
+                <wp:effectExtent l="12700" t="12700" r="31115" b="0"/>
                 <wp:docPr id="8779" name="Group 8779"/>
                 <wp:cNvGraphicFramePr/>
                 <a:graphic xmlns:a="http://schemas.openxmlformats.org/drawingml/2006/main">
@@ -222,7 +223,7 @@
                       <wpg:grpSpPr>
                         <a:xfrm>
                           <a:off x="0" y="0"/>
-                          <a:ext cx="6839966" cy="14351"/>
+                          <a:ext cx="6192000" cy="36000"/>
                           <a:chOff x="0" y="0"/>
                           <a:chExt cx="6839966" cy="14351"/>
                         </a:xfrm>
@@ -278,13 +279,14 @@
               </wp:inline>
             </w:drawing>
           </mc:Choice>
-          <mc:Fallback xmlns:a="http://schemas.openxmlformats.org/drawingml/2006/main">
+          <mc:Fallback>
             <w:pict>
-              <v:group id="Group 8779" style="width:538.58pt;height:1.13pt;mso-position-horizontal-relative:char;mso-position-vertical-relative:line" coordsize="68399,143">
-                <v:shape id="Shape 21" style="position:absolute;width:68399;height:0;left:0;top:0;" coordsize="6839966,0" path="m0,0l6839966,0">
-                  <v:stroke weight="1.13pt" endcap="square" joinstyle="miter" miterlimit="10" on="true" color="#0066cc"/>
-                  <v:fill on="false" color="#000000" opacity="0"/>
+              <v:group w14:anchorId="66759CAB" id="Group 8779" o:spid="_x0000_s1026" style="width:487.55pt;height:2.85pt;mso-position-horizontal-relative:char;mso-position-vertical-relative:line" coordsize="68399,143" o:gfxdata="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">
+                <v:shape id="Shape 21" o:spid="_x0000_s1027" style="position:absolute;width:68399;height:0;visibility:visible;mso-wrap-style:square;v-text-anchor:top" coordsize="6839966,0" o:gfxdata="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" path="m,l6839966,e" filled="f" strokecolor="#06c" strokeweight="1.13pt">
+                  <v:stroke miterlimit="83231f" joinstyle="miter" endcap="square"/>
+                  <v:path arrowok="t" textboxrect="0,0,6839966,0"/>
                 </v:shape>
+                <w10:anchorlock/>
               </v:group>
             </w:pict>
           </mc:Fallback>
@@ -303,7 +305,19 @@
         <w:rPr>
           <w:lang w:val="en-US"/>
         </w:rPr>
-        <w:t>This project addresses a supervised regression problem: predicting a continuous target variable Y from six independent features (X1 through X6). The training dataset comprises 100 labeled samples, while the test set contains 20 unlabeled samples (IDs 101-120) for which Y values must be predicted.</w:t>
+        <w:t>This project addresses a supervised regression problem: predicting a continuous target variable Y from six independent features (X1 through X6). The training dataset comprises 100 labeled samples, while the test set contains 20 unlabeled samples (ID</w:t>
+      </w:r>
+      <w:r>
+        <w:rPr>
+          <w:lang w:val="en-US"/>
+        </w:rPr>
+        <w:t>’s</w:t>
+      </w:r>
+      <w:r>
+        <w:rPr>
+          <w:lang w:val="en-US"/>
+        </w:rPr>
+        <w:t xml:space="preserve"> 101-120) for which Y values must be predicted.</w:t>
       </w:r>
     </w:p>
     <w:p>
@@ -318,8 +332,101 @@
         <w:rPr>
           <w:lang w:val="en-US"/>
         </w:rPr>
-        <w:t>A multi-model comparison strategy was adopted to identify the most accurate regression approach. Eight distinct regression algorithms were evaluated, spanning linear, instance-based, kernel-based, and ensemble methods. This breadth of coverage ensures that the best-performing paradigm is captured regardless of the underlying data structure.</w:t>
-      </w:r>
+        <w:t>A multi</w:t>
+      </w:r>
+      <w:r>
+        <w:rPr>
+          <w:lang w:val="en-US"/>
+        </w:rPr>
+        <w:t xml:space="preserve"> </w:t>
+      </w:r>
+      <w:r>
+        <w:rPr>
+          <w:lang w:val="en-US"/>
+        </w:rPr>
+        <w:t>model comparison strategy was adopted to identify the most accurate regression approach. Eight distinct regression algorithms were evaluated, spanning linear, instance</w:t>
+      </w:r>
+      <w:r>
+        <w:rPr>
+          <w:lang w:val="en-US"/>
+        </w:rPr>
+        <w:t xml:space="preserve"> </w:t>
+      </w:r>
+      <w:r>
+        <w:rPr>
+          <w:lang w:val="en-US"/>
+        </w:rPr>
+        <w:t>based, kernel</w:t>
+      </w:r>
+      <w:r>
+        <w:rPr>
+          <w:lang w:val="en-US"/>
+        </w:rPr>
+        <w:t xml:space="preserve"> </w:t>
+      </w:r>
+      <w:r>
+        <w:rPr>
+          <w:lang w:val="en-US"/>
+        </w:rPr>
+        <w:t>based, and ensemble methods. This breadth of coverage ensures that the best</w:t>
+      </w:r>
+      <w:r>
+        <w:rPr>
+          <w:lang w:val="en-US"/>
+        </w:rPr>
+        <w:t xml:space="preserve"> </w:t>
+      </w:r>
+      <w:r>
+        <w:rPr>
+          <w:lang w:val="en-US"/>
+        </w:rPr>
+        <w:t>performing paradigm is captured regardless of the underlying data structure.</w:t>
+      </w:r>
+    </w:p>
+    <w:p>
+      <w:pPr>
+        <w:spacing w:after="295"/>
+        <w:ind w:left="-5"/>
+        <w:rPr>
+          <w:lang w:val="en-US"/>
+        </w:rPr>
+      </w:pPr>
+    </w:p>
+    <w:p>
+      <w:pPr>
+        <w:spacing w:after="295"/>
+        <w:ind w:left="-5"/>
+        <w:rPr>
+          <w:lang w:val="en-US"/>
+        </w:rPr>
+      </w:pPr>
+    </w:p>
+    <w:p>
+      <w:pPr>
+        <w:spacing w:after="295"/>
+        <w:ind w:left="-5"/>
+        <w:rPr>
+          <w:lang w:val="en-US"/>
+        </w:rPr>
+      </w:pPr>
+    </w:p>
+    <w:p>
+      <w:pPr>
+        <w:spacing w:after="295"/>
+        <w:ind w:left="-5"/>
+        <w:rPr>
+          <w:lang w:val="en-US"/>
+        </w:rPr>
+      </w:pPr>
+    </w:p>
+    <w:p>
+      <w:pPr>
+        <w:spacing w:after="295"/>
+        <w:ind w:left="-5"/>
+        <w:rPr>
+          <w:lang w:val="en-US"/>
+        </w:rPr>
+      </w:pPr>
     </w:p>
     <w:p>
       <w:pPr>
@@ -333,6 +440,7 @@
         <w:rPr>
           <w:lang w:val="en-US"/>
         </w:rPr>
+        <w:lastRenderedPageBreak/>
         <w:t>Models Attempted</w:t>
       </w:r>
     </w:p>
@@ -354,12 +462,10 @@
     <w:tbl>
       <w:tblPr>
         <w:tblStyle w:val="TableGrid"/>
-        <w:tblW w:w="10772" w:type="dxa"/>
+        <w:tblW w:w="9766" w:type="dxa"/>
         <w:tblInd w:w="-57" w:type="dxa"/>
         <w:tblCellMar>
-          <w:top w:w="0" w:type="dxa"/>
           <w:left w:w="110" w:type="dxa"/>
-          <w:bottom w:w="0" w:type="dxa"/>
           <w:right w:w="110" w:type="dxa"/>
         </w:tblCellMar>
         <w:tblLook w:val="04A0" w:firstRow="1" w:lastRow="0" w:firstColumn="1" w:lastColumn="0" w:noHBand="0" w:noVBand="1"/>
@@ -367,8 +473,8 @@
       <w:tblGrid>
         <w:gridCol w:w="2154"/>
         <w:gridCol w:w="1021"/>
-        <w:gridCol w:w="3969"/>
-        <w:gridCol w:w="3628"/>
+        <w:gridCol w:w="3250"/>
+        <w:gridCol w:w="3341"/>
       </w:tblGrid>
       <w:tr>
         <w:trPr>
@@ -408,7 +514,7 @@
         </w:tc>
         <w:tc>
           <w:tcPr>
-            <w:tcW w:w="1020" w:type="dxa"/>
+            <w:tcW w:w="1021" w:type="dxa"/>
             <w:tcBorders>
               <w:top w:val="single" w:sz="9" w:space="0" w:color="0066CC"/>
               <w:left w:val="single" w:sz="9" w:space="0" w:color="0066CC"/>
@@ -440,7 +546,7 @@
         </w:tc>
         <w:tc>
           <w:tcPr>
-            <w:tcW w:w="3969" w:type="dxa"/>
+            <w:tcW w:w="3250" w:type="dxa"/>
             <w:tcBorders>
               <w:top w:val="single" w:sz="9" w:space="0" w:color="0066CC"/>
               <w:left w:val="single" w:sz="9" w:space="0" w:color="0066CC"/>
@@ -472,7 +578,7 @@
         </w:tc>
         <w:tc>
           <w:tcPr>
-            <w:tcW w:w="3628" w:type="dxa"/>
+            <w:tcW w:w="3341" w:type="dxa"/>
             <w:tcBorders>
               <w:top w:val="single" w:sz="9" w:space="0" w:color="0066CC"/>
               <w:left w:val="single" w:sz="9" w:space="0" w:color="0066CC"/>
@@ -539,7 +645,7 @@
         </w:tc>
         <w:tc>
           <w:tcPr>
-            <w:tcW w:w="1020" w:type="dxa"/>
+            <w:tcW w:w="1021" w:type="dxa"/>
             <w:tcBorders>
               <w:top w:val="single" w:sz="9" w:space="0" w:color="0066CC"/>
               <w:left w:val="single" w:sz="9" w:space="0" w:color="0066CC"/>
@@ -569,7 +675,7 @@
         </w:tc>
         <w:tc>
           <w:tcPr>
-            <w:tcW w:w="3969" w:type="dxa"/>
+            <w:tcW w:w="3250" w:type="dxa"/>
             <w:tcBorders>
               <w:top w:val="single" w:sz="9" w:space="0" w:color="0066CC"/>
               <w:left w:val="single" w:sz="9" w:space="0" w:color="0066CC"/>
@@ -599,7 +705,7 @@
         </w:tc>
         <w:tc>
           <w:tcPr>
-            <w:tcW w:w="3628" w:type="dxa"/>
+            <w:tcW w:w="3341" w:type="dxa"/>
             <w:tcBorders>
               <w:top w:val="single" w:sz="9" w:space="0" w:color="0066CC"/>
               <w:left w:val="single" w:sz="9" w:space="0" w:color="0066CC"/>
@@ -664,7 +770,7 @@
         </w:tc>
         <w:tc>
           <w:tcPr>
-            <w:tcW w:w="1020" w:type="dxa"/>
+            <w:tcW w:w="1021" w:type="dxa"/>
             <w:tcBorders>
               <w:top w:val="single" w:sz="9" w:space="0" w:color="0066CC"/>
               <w:left w:val="single" w:sz="9" w:space="0" w:color="0066CC"/>
@@ -694,7 +800,7 @@
         </w:tc>
         <w:tc>
           <w:tcPr>
-            <w:tcW w:w="3969" w:type="dxa"/>
+            <w:tcW w:w="3250" w:type="dxa"/>
             <w:tcBorders>
               <w:top w:val="single" w:sz="9" w:space="0" w:color="0066CC"/>
               <w:left w:val="single" w:sz="9" w:space="0" w:color="0066CC"/>
@@ -724,7 +830,7 @@
         </w:tc>
         <w:tc>
           <w:tcPr>
-            <w:tcW w:w="3628" w:type="dxa"/>
+            <w:tcW w:w="3341" w:type="dxa"/>
             <w:tcBorders>
               <w:top w:val="single" w:sz="9" w:space="0" w:color="0066CC"/>
               <w:left w:val="single" w:sz="9" w:space="0" w:color="0066CC"/>
@@ -791,7 +897,7 @@
         </w:tc>
         <w:tc>
           <w:tcPr>
-            <w:tcW w:w="1020" w:type="dxa"/>
+            <w:tcW w:w="1021" w:type="dxa"/>
             <w:tcBorders>
               <w:top w:val="single" w:sz="9" w:space="0" w:color="0066CC"/>
               <w:left w:val="single" w:sz="9" w:space="0" w:color="0066CC"/>
@@ -821,7 +927,7 @@
         </w:tc>
         <w:tc>
           <w:tcPr>
-            <w:tcW w:w="3969" w:type="dxa"/>
+            <w:tcW w:w="3250" w:type="dxa"/>
             <w:tcBorders>
               <w:top w:val="single" w:sz="9" w:space="0" w:color="0066CC"/>
               <w:left w:val="single" w:sz="9" w:space="0" w:color="0066CC"/>
@@ -851,7 +957,7 @@
         </w:tc>
         <w:tc>
           <w:tcPr>
-            <w:tcW w:w="3628" w:type="dxa"/>
+            <w:tcW w:w="3341" w:type="dxa"/>
             <w:tcBorders>
               <w:top w:val="single" w:sz="9" w:space="0" w:color="0066CC"/>
               <w:left w:val="single" w:sz="9" w:space="0" w:color="0066CC"/>
@@ -916,7 +1022,7 @@
         </w:tc>
         <w:tc>
           <w:tcPr>
-            <w:tcW w:w="1020" w:type="dxa"/>
+            <w:tcW w:w="1021" w:type="dxa"/>
             <w:tcBorders>
               <w:top w:val="single" w:sz="9" w:space="0" w:color="0066CC"/>
               <w:left w:val="single" w:sz="9" w:space="0" w:color="0066CC"/>
@@ -946,7 +1052,7 @@
         </w:tc>
         <w:tc>
           <w:tcPr>
-            <w:tcW w:w="3969" w:type="dxa"/>
+            <w:tcW w:w="3250" w:type="dxa"/>
             <w:tcBorders>
               <w:top w:val="single" w:sz="9" w:space="0" w:color="0066CC"/>
               <w:left w:val="single" w:sz="9" w:space="0" w:color="0066CC"/>
@@ -976,7 +1082,7 @@
         </w:tc>
         <w:tc>
           <w:tcPr>
-            <w:tcW w:w="3628" w:type="dxa"/>
+            <w:tcW w:w="3341" w:type="dxa"/>
             <w:tcBorders>
               <w:top w:val="single" w:sz="9" w:space="0" w:color="0066CC"/>
               <w:left w:val="single" w:sz="9" w:space="0" w:color="0066CC"/>
@@ -1041,7 +1147,7 @@
         </w:tc>
         <w:tc>
           <w:tcPr>
-            <w:tcW w:w="1020" w:type="dxa"/>
+            <w:tcW w:w="1021" w:type="dxa"/>
             <w:tcBorders>
               <w:top w:val="single" w:sz="9" w:space="0" w:color="0066CC"/>
               <w:left w:val="single" w:sz="9" w:space="0" w:color="0066CC"/>
@@ -1071,7 +1177,7 @@
         </w:tc>
         <w:tc>
           <w:tcPr>
-            <w:tcW w:w="3969" w:type="dxa"/>
+            <w:tcW w:w="3250" w:type="dxa"/>
             <w:tcBorders>
               <w:top w:val="single" w:sz="9" w:space="0" w:color="0066CC"/>
               <w:left w:val="single" w:sz="9" w:space="0" w:color="0066CC"/>
@@ -1101,7 +1207,7 @@
         </w:tc>
         <w:tc>
           <w:tcPr>
-            <w:tcW w:w="3628" w:type="dxa"/>
+            <w:tcW w:w="3341" w:type="dxa"/>
             <w:tcBorders>
               <w:top w:val="single" w:sz="9" w:space="0" w:color="0066CC"/>
               <w:left w:val="single" w:sz="9" w:space="0" w:color="0066CC"/>
@@ -1166,7 +1272,7 @@
         </w:tc>
         <w:tc>
           <w:tcPr>
-            <w:tcW w:w="1020" w:type="dxa"/>
+            <w:tcW w:w="1021" w:type="dxa"/>
             <w:tcBorders>
               <w:top w:val="single" w:sz="9" w:space="0" w:color="0066CC"/>
               <w:left w:val="single" w:sz="9" w:space="0" w:color="0066CC"/>
@@ -1196,7 +1302,7 @@
         </w:tc>
         <w:tc>
           <w:tcPr>
-            <w:tcW w:w="3969" w:type="dxa"/>
+            <w:tcW w:w="3250" w:type="dxa"/>
             <w:tcBorders>
               <w:top w:val="single" w:sz="9" w:space="0" w:color="0066CC"/>
               <w:left w:val="single" w:sz="9" w:space="0" w:color="0066CC"/>
@@ -1226,7 +1332,7 @@
         </w:tc>
         <w:tc>
           <w:tcPr>
-            <w:tcW w:w="3628" w:type="dxa"/>
+            <w:tcW w:w="3341" w:type="dxa"/>
             <w:tcBorders>
               <w:top w:val="single" w:sz="9" w:space="0" w:color="0066CC"/>
               <w:left w:val="single" w:sz="9" w:space="0" w:color="0066CC"/>
@@ -1291,7 +1397,7 @@
         </w:tc>
         <w:tc>
           <w:tcPr>
-            <w:tcW w:w="1020" w:type="dxa"/>
+            <w:tcW w:w="1021" w:type="dxa"/>
             <w:tcBorders>
               <w:top w:val="single" w:sz="9" w:space="0" w:color="0066CC"/>
               <w:left w:val="single" w:sz="9" w:space="0" w:color="0066CC"/>
@@ -1321,7 +1427,7 @@
         </w:tc>
         <w:tc>
           <w:tcPr>
-            <w:tcW w:w="3969" w:type="dxa"/>
+            <w:tcW w:w="3250" w:type="dxa"/>
             <w:tcBorders>
               <w:top w:val="single" w:sz="9" w:space="0" w:color="0066CC"/>
               <w:left w:val="single" w:sz="9" w:space="0" w:color="0066CC"/>
@@ -1351,7 +1457,7 @@
         </w:tc>
         <w:tc>
           <w:tcPr>
-            <w:tcW w:w="3628" w:type="dxa"/>
+            <w:tcW w:w="3341" w:type="dxa"/>
             <w:tcBorders>
               <w:top w:val="single" w:sz="9" w:space="0" w:color="0066CC"/>
               <w:left w:val="single" w:sz="9" w:space="0" w:color="0066CC"/>
@@ -1411,7 +1517,6 @@
                 <w:sz w:val="18"/>
                 <w:lang w:val="en-US"/>
               </w:rPr>
-              <w:lastRenderedPageBreak/>
               <w:t>XGBoost</w:t>
             </w:r>
             <w:proofErr w:type="spellEnd"/>
@@ -1419,7 +1524,7 @@
         </w:tc>
         <w:tc>
           <w:tcPr>
-            <w:tcW w:w="1020" w:type="dxa"/>
+            <w:tcW w:w="1021" w:type="dxa"/>
             <w:tcBorders>
               <w:top w:val="single" w:sz="9" w:space="0" w:color="0066CC"/>
               <w:left w:val="single" w:sz="9" w:space="0" w:color="0066CC"/>
@@ -1449,7 +1554,7 @@
         </w:tc>
         <w:tc>
           <w:tcPr>
-            <w:tcW w:w="3969" w:type="dxa"/>
+            <w:tcW w:w="3250" w:type="dxa"/>
             <w:tcBorders>
               <w:top w:val="single" w:sz="9" w:space="0" w:color="0066CC"/>
               <w:left w:val="single" w:sz="9" w:space="0" w:color="0066CC"/>
@@ -1479,7 +1584,7 @@
         </w:tc>
         <w:tc>
           <w:tcPr>
-            <w:tcW w:w="3628" w:type="dxa"/>
+            <w:tcW w:w="3341" w:type="dxa"/>
             <w:tcBorders>
               <w:top w:val="single" w:sz="9" w:space="0" w:color="0066CC"/>
               <w:left w:val="single" w:sz="9" w:space="0" w:color="0066CC"/>
@@ -1512,6 +1617,19 @@
     <w:p>
       <w:pPr>
         <w:pStyle w:val="Balk2"/>
+        <w:numPr>
+          <w:ilvl w:val="0"/>
+          <w:numId w:val="0"/>
+        </w:numPr>
+        <w:ind w:left="10" w:hanging="10"/>
+        <w:rPr>
+          <w:lang w:val="en-US"/>
+        </w:rPr>
+      </w:pPr>
+    </w:p>
+    <w:p>
+      <w:pPr>
+        <w:pStyle w:val="Balk2"/>
         <w:ind w:left="419" w:hanging="434"/>
         <w:rPr>
           <w:lang w:val="en-US"/>
@@ -1543,10 +1661,10 @@
       <w:pPr>
         <w:numPr>
           <w:ilvl w:val="0"/>
-          <w:numId w:val="1"/>
+          <w:numId w:val="8"/>
         </w:numPr>
         <w:spacing w:after="75" w:line="259" w:lineRule="auto"/>
-        <w:ind w:hanging="483"/>
+        <w:ind w:left="851" w:hanging="284"/>
         <w:rPr>
           <w:lang w:val="en-US"/>
         </w:rPr>
@@ -1560,81 +1678,136 @@
     </w:p>
     <w:p>
       <w:pPr>
-        <w:spacing w:after="124" w:line="259" w:lineRule="auto"/>
-        <w:ind w:left="1144"/>
-        <w:rPr>
-          <w:lang w:val="en-US"/>
-        </w:rPr>
-      </w:pPr>
-      <w:r>
-        <w:rPr>
-          <w:lang w:val="en-US"/>
-        </w:rPr>
-        <w:t>0.35 with the target Y, suggesting that simple linear models may be insufficient.</w:t>
-      </w:r>
-    </w:p>
-    <w:p>
-      <w:pPr>
+        <w:pStyle w:val="ListeParagraf"/>
         <w:numPr>
           <w:ilvl w:val="0"/>
-          <w:numId w:val="1"/>
+          <w:numId w:val="8"/>
         </w:numPr>
-        <w:ind w:hanging="483"/>
-        <w:rPr>
-          <w:lang w:val="en-US"/>
-        </w:rPr>
-      </w:pPr>
-      <w:r>
-        <w:rPr>
-          <w:lang w:val="en-US"/>
-        </w:rPr>
-        <w:t xml:space="preserve">High target skewness: Y has a skewness of 4.08 (range: -152 to 13,578), indicating a </w:t>
-      </w:r>
-      <w:proofErr w:type="spellStart"/>
-      <w:r>
-        <w:rPr>
-          <w:lang w:val="en-US"/>
-        </w:rPr>
-        <w:t>heavilyright</w:t>
-      </w:r>
-      <w:proofErr w:type="spellEnd"/>
-      <w:r>
-        <w:rPr>
-          <w:lang w:val="en-US"/>
-        </w:rPr>
-        <w:t>-skewed distribution with potential outliers.</w:t>
+        <w:spacing w:after="124" w:line="259" w:lineRule="auto"/>
+        <w:ind w:left="851" w:hanging="284"/>
+        <w:rPr>
+          <w:lang w:val="en-US"/>
+        </w:rPr>
+      </w:pPr>
+      <w:r>
+        <w:rPr>
+          <w:lang w:val="en-US"/>
+        </w:rPr>
+        <w:t>0.35 with the target Y, suggesting that simple linear models may be insufficient.</w:t>
       </w:r>
     </w:p>
     <w:p>
       <w:pPr>
         <w:numPr>
           <w:ilvl w:val="0"/>
-          <w:numId w:val="1"/>
+          <w:numId w:val="8"/>
         </w:numPr>
-        <w:ind w:hanging="483"/>
-        <w:rPr>
-          <w:lang w:val="en-US"/>
-        </w:rPr>
-      </w:pPr>
-      <w:r>
-        <w:rPr>
-          <w:lang w:val="en-US"/>
-        </w:rPr>
-        <w:t xml:space="preserve">Small sample size: With only 100 training samples and 6 features, overfitting is a </w:t>
+        <w:ind w:left="851" w:hanging="284"/>
+        <w:rPr>
+          <w:lang w:val="en-US"/>
+        </w:rPr>
+      </w:pPr>
+      <w:r>
+        <w:rPr>
+          <w:lang w:val="en-US"/>
+        </w:rPr>
+        <w:t>High target skewness: Y has a skewness of 4.08 (range: -152 to 13,578), indicating a heavily</w:t>
+      </w:r>
+      <w:r>
+        <w:rPr>
+          <w:lang w:val="en-US"/>
+        </w:rPr>
+        <w:t xml:space="preserve"> </w:t>
+      </w:r>
+      <w:r>
+        <w:rPr>
+          <w:lang w:val="en-US"/>
+        </w:rPr>
+        <w:t>right</w:t>
+      </w:r>
+      <w:r>
+        <w:rPr>
+          <w:lang w:val="en-US"/>
+        </w:rPr>
+        <w:t xml:space="preserve"> </w:t>
+      </w:r>
+      <w:r>
+        <w:rPr>
+          <w:lang w:val="en-US"/>
+        </w:rPr>
+        <w:t>skewed distribution with potential outliers.</w:t>
+      </w:r>
+    </w:p>
+    <w:p>
+      <w:pPr>
+        <w:numPr>
+          <w:ilvl w:val="0"/>
+          <w:numId w:val="8"/>
+        </w:numPr>
+        <w:ind w:left="851" w:hanging="284"/>
+        <w:rPr>
+          <w:lang w:val="en-US"/>
+        </w:rPr>
+      </w:pPr>
+      <w:r>
+        <w:rPr>
+          <w:lang w:val="en-US"/>
+        </w:rPr>
+        <w:t>Small sample size: With only 100 training samples and 6 features, overfitting is a primary</w:t>
+      </w:r>
+      <w:r>
+        <w:rPr>
+          <w:lang w:val="en-US"/>
+        </w:rPr>
+        <w:t xml:space="preserve"> </w:t>
+      </w:r>
+      <w:r>
+        <w:rPr>
+          <w:lang w:val="en-US"/>
+        </w:rPr>
+        <w:t>concern, favoring regularized and ensemble methods.</w:t>
+      </w:r>
+    </w:p>
+    <w:p>
+      <w:pPr>
+        <w:ind w:left="-5"/>
+        <w:rPr>
+          <w:lang w:val="en-US"/>
+        </w:rPr>
+      </w:pPr>
+      <w:r>
+        <w:rPr>
+          <w:lang w:val="en-US"/>
+        </w:rPr>
+        <w:t xml:space="preserve">Given these observations, the model selection emphasized non-linear and ensemble methods (Random Forest, Gradient Boosting, </w:t>
       </w:r>
       <w:proofErr w:type="spellStart"/>
       <w:r>
         <w:rPr>
           <w:lang w:val="en-US"/>
         </w:rPr>
-        <w:t>primaryconcern</w:t>
+        <w:t>XGBoost</w:t>
       </w:r>
       <w:proofErr w:type="spellEnd"/>
       <w:r>
         <w:rPr>
           <w:lang w:val="en-US"/>
         </w:rPr>
-        <w:t>, favoring regularized and ensemble methods.</w:t>
+        <w:t xml:space="preserve">, SVR) while retaining linear baselines (Ridge, Lasso, </w:t>
+      </w:r>
+      <w:proofErr w:type="spellStart"/>
+      <w:r>
+        <w:rPr>
+          <w:lang w:val="en-US"/>
+        </w:rPr>
+        <w:t>ElasticNet</w:t>
+      </w:r>
+      <w:proofErr w:type="spellEnd"/>
+      <w:r>
+        <w:rPr>
+          <w:lang w:val="en-US"/>
+        </w:rPr>
+        <w:t>) for comparison. Polynomial feature engineering (degree 2) was applied to linear models to enable them to capture interaction effects.</w:t>
       </w:r>
     </w:p>
     <w:p>
@@ -1644,40 +1817,62 @@
           <w:lang w:val="en-US"/>
         </w:rPr>
       </w:pPr>
-      <w:r>
-        <w:rPr>
-          <w:lang w:val="en-US"/>
-        </w:rPr>
-        <w:t xml:space="preserve">Given these observations, the model selection emphasized non-linear and ensemble methods (Random Forest, Gradient Boosting, </w:t>
-      </w:r>
-      <w:proofErr w:type="spellStart"/>
-      <w:r>
-        <w:rPr>
-          <w:lang w:val="en-US"/>
-        </w:rPr>
-        <w:t>XGBoost</w:t>
-      </w:r>
-      <w:proofErr w:type="spellEnd"/>
-      <w:r>
-        <w:rPr>
-          <w:lang w:val="en-US"/>
-        </w:rPr>
-        <w:t xml:space="preserve">, SVR) while retaining linear baselines (Ridge, Lasso, </w:t>
-      </w:r>
-      <w:proofErr w:type="spellStart"/>
-      <w:r>
-        <w:rPr>
-          <w:lang w:val="en-US"/>
-        </w:rPr>
-        <w:t>ElasticNet</w:t>
-      </w:r>
-      <w:proofErr w:type="spellEnd"/>
-      <w:r>
-        <w:rPr>
-          <w:lang w:val="en-US"/>
-        </w:rPr>
-        <w:t>) for comparison. Polynomial feature engineering (degree 2) was applied to linear models to enable them to capture interaction effects.</w:t>
-      </w:r>
+    </w:p>
+    <w:p>
+      <w:pPr>
+        <w:ind w:left="-5"/>
+        <w:rPr>
+          <w:lang w:val="en-US"/>
+        </w:rPr>
+      </w:pPr>
+    </w:p>
+    <w:p>
+      <w:pPr>
+        <w:ind w:left="-5"/>
+        <w:rPr>
+          <w:lang w:val="en-US"/>
+        </w:rPr>
+      </w:pPr>
+    </w:p>
+    <w:p>
+      <w:pPr>
+        <w:ind w:left="-5"/>
+        <w:rPr>
+          <w:lang w:val="en-US"/>
+        </w:rPr>
+      </w:pPr>
+    </w:p>
+    <w:p>
+      <w:pPr>
+        <w:ind w:left="-5"/>
+        <w:rPr>
+          <w:lang w:val="en-US"/>
+        </w:rPr>
+      </w:pPr>
+    </w:p>
+    <w:p>
+      <w:pPr>
+        <w:ind w:left="-5"/>
+        <w:rPr>
+          <w:lang w:val="en-US"/>
+        </w:rPr>
+      </w:pPr>
+    </w:p>
+    <w:p>
+      <w:pPr>
+        <w:ind w:left="-5"/>
+        <w:rPr>
+          <w:lang w:val="en-US"/>
+        </w:rPr>
+      </w:pPr>
+    </w:p>
+    <w:p>
+      <w:pPr>
+        <w:ind w:left="-5"/>
+        <w:rPr>
+          <w:lang w:val="en-US"/>
+        </w:rPr>
+      </w:pPr>
     </w:p>
     <w:p>
       <w:pPr>
@@ -1691,6 +1886,7 @@
         <w:rPr>
           <w:lang w:val="en-US"/>
         </w:rPr>
+        <w:lastRenderedPageBreak/>
         <w:t>Implementation</w:t>
       </w:r>
     </w:p>
@@ -1713,9 +1909,9 @@
         <mc:AlternateContent>
           <mc:Choice Requires="wpg">
             <w:drawing>
-              <wp:inline distT="0" distB="0" distL="0" distR="0" wp14:anchorId="58A066FD" wp14:editId="1C9BD712">
-                <wp:extent cx="6839966" cy="14351"/>
-                <wp:effectExtent l="0" t="0" r="0" b="0"/>
+              <wp:inline distT="0" distB="0" distL="0" distR="0" wp14:anchorId="58A066FD" wp14:editId="295F4509">
+                <wp:extent cx="6192000" cy="14351"/>
+                <wp:effectExtent l="12700" t="12700" r="31115" b="11430"/>
                 <wp:docPr id="8632" name="Group 8632"/>
                 <wp:cNvGraphicFramePr/>
                 <a:graphic xmlns:a="http://schemas.openxmlformats.org/drawingml/2006/main">
@@ -1725,7 +1921,7 @@
                       <wpg:grpSpPr>
                         <a:xfrm>
                           <a:off x="0" y="0"/>
-                          <a:ext cx="6839966" cy="14351"/>
+                          <a:ext cx="6192000" cy="14351"/>
                           <a:chOff x="0" y="0"/>
                           <a:chExt cx="6839966" cy="14351"/>
                         </a:xfrm>
@@ -1781,13 +1977,14 @@
               </wp:inline>
             </w:drawing>
           </mc:Choice>
-          <mc:Fallback xmlns:a="http://schemas.openxmlformats.org/drawingml/2006/main">
+          <mc:Fallback>
             <w:pict>
-              <v:group id="Group 8632" style="width:538.58pt;height:1.13pt;mso-position-horizontal-relative:char;mso-position-vertical-relative:line" coordsize="68399,143">
-                <v:shape id="Shape 133" style="position:absolute;width:68399;height:0;left:0;top:0;" coordsize="6839966,0" path="m0,0l6839966,0">
-                  <v:stroke weight="1.13pt" endcap="square" joinstyle="miter" miterlimit="10" on="true" color="#0066cc"/>
-                  <v:fill on="false" color="#000000" opacity="0"/>
+              <v:group w14:anchorId="60541E9B" id="Group 8632" o:spid="_x0000_s1026" style="width:487.55pt;height:1.15pt;mso-position-horizontal-relative:char;mso-position-vertical-relative:line" coordsize="68399,143" o:gfxdata="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">
+                <v:shape id="Shape 133" o:spid="_x0000_s1027" style="position:absolute;width:68399;height:0;visibility:visible;mso-wrap-style:square;v-text-anchor:top" coordsize="6839966,0" o:gfxdata="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" path="m,l6839966,e" filled="f" strokecolor="#06c" strokeweight="1.13pt">
+                  <v:stroke miterlimit="83231f" joinstyle="miter" endcap="square"/>
+                  <v:path arrowok="t" textboxrect="0,0,6839966,0"/>
                 </v:shape>
+                <w10:anchorlock/>
               </v:group>
             </w:pict>
           </mc:Fallback>
@@ -1827,12 +2024,10 @@
     <w:tbl>
       <w:tblPr>
         <w:tblStyle w:val="TableGrid"/>
-        <w:tblW w:w="10772" w:type="dxa"/>
+        <w:tblW w:w="9766" w:type="dxa"/>
         <w:tblInd w:w="-57" w:type="dxa"/>
         <w:tblCellMar>
-          <w:top w:w="0" w:type="dxa"/>
           <w:left w:w="115" w:type="dxa"/>
-          <w:bottom w:w="0" w:type="dxa"/>
           <w:right w:w="115" w:type="dxa"/>
         </w:tblCellMar>
         <w:tblLook w:val="04A0" w:firstRow="1" w:lastRow="0" w:firstColumn="1" w:lastColumn="0" w:noHBand="0" w:noVBand="1"/>
@@ -1840,7 +2035,7 @@
       <w:tblGrid>
         <w:gridCol w:w="2268"/>
         <w:gridCol w:w="1701"/>
-        <w:gridCol w:w="6803"/>
+        <w:gridCol w:w="5797"/>
       </w:tblGrid>
       <w:tr>
         <w:trPr>
@@ -1912,7 +2107,7 @@
         </w:tc>
         <w:tc>
           <w:tcPr>
-            <w:tcW w:w="6803" w:type="dxa"/>
+            <w:tcW w:w="5797" w:type="dxa"/>
             <w:tcBorders>
               <w:top w:val="single" w:sz="9" w:space="0" w:color="0066CC"/>
               <w:left w:val="single" w:sz="9" w:space="0" w:color="0066CC"/>
@@ -2009,7 +2204,7 @@
         </w:tc>
         <w:tc>
           <w:tcPr>
-            <w:tcW w:w="6803" w:type="dxa"/>
+            <w:tcW w:w="5797" w:type="dxa"/>
             <w:tcBorders>
               <w:top w:val="single" w:sz="9" w:space="0" w:color="0066CC"/>
               <w:left w:val="single" w:sz="9" w:space="0" w:color="0066CC"/>
@@ -2104,7 +2299,7 @@
         </w:tc>
         <w:tc>
           <w:tcPr>
-            <w:tcW w:w="6803" w:type="dxa"/>
+            <w:tcW w:w="5797" w:type="dxa"/>
             <w:tcBorders>
               <w:top w:val="single" w:sz="9" w:space="0" w:color="0066CC"/>
               <w:left w:val="single" w:sz="9" w:space="0" w:color="0066CC"/>
@@ -2199,7 +2394,7 @@
         </w:tc>
         <w:tc>
           <w:tcPr>
-            <w:tcW w:w="6803" w:type="dxa"/>
+            <w:tcW w:w="5797" w:type="dxa"/>
             <w:tcBorders>
               <w:top w:val="single" w:sz="9" w:space="0" w:color="0066CC"/>
               <w:left w:val="single" w:sz="9" w:space="0" w:color="0066CC"/>
@@ -2293,7 +2488,7 @@
         </w:tc>
         <w:tc>
           <w:tcPr>
-            <w:tcW w:w="6803" w:type="dxa"/>
+            <w:tcW w:w="5797" w:type="dxa"/>
             <w:tcBorders>
               <w:top w:val="single" w:sz="9" w:space="0" w:color="0066CC"/>
               <w:left w:val="single" w:sz="9" w:space="0" w:color="0066CC"/>
@@ -2389,7 +2584,7 @@
         </w:tc>
         <w:tc>
           <w:tcPr>
-            <w:tcW w:w="6803" w:type="dxa"/>
+            <w:tcW w:w="5797" w:type="dxa"/>
             <w:tcBorders>
               <w:top w:val="single" w:sz="9" w:space="0" w:color="0066CC"/>
               <w:left w:val="single" w:sz="9" w:space="0" w:color="0066CC"/>
@@ -2484,7 +2679,7 @@
         </w:tc>
         <w:tc>
           <w:tcPr>
-            <w:tcW w:w="6803" w:type="dxa"/>
+            <w:tcW w:w="5797" w:type="dxa"/>
             <w:tcBorders>
               <w:top w:val="single" w:sz="9" w:space="0" w:color="0066CC"/>
               <w:left w:val="single" w:sz="9" w:space="0" w:color="0066CC"/>
@@ -2579,7 +2774,7 @@
         </w:tc>
         <w:tc>
           <w:tcPr>
-            <w:tcW w:w="6803" w:type="dxa"/>
+            <w:tcW w:w="5797" w:type="dxa"/>
             <w:tcBorders>
               <w:top w:val="single" w:sz="9" w:space="0" w:color="0066CC"/>
               <w:left w:val="single" w:sz="9" w:space="0" w:color="0066CC"/>
@@ -2675,7 +2870,7 @@
         </w:tc>
         <w:tc>
           <w:tcPr>
-            <w:tcW w:w="6803" w:type="dxa"/>
+            <w:tcW w:w="5797" w:type="dxa"/>
             <w:tcBorders>
               <w:top w:val="single" w:sz="9" w:space="0" w:color="0066CC"/>
               <w:left w:val="single" w:sz="9" w:space="0" w:color="0066CC"/>
@@ -2774,7 +2969,19 @@
         <w:rPr>
           <w:lang w:val="en-US"/>
         </w:rPr>
-        <w:t>. This is essential for distance-based models (KNN, SVR) and gradient-based optimizers. The scaler was fitted exclusively on training data and then applied to test data to prevent data leakage.</w:t>
+        <w:t>. This is essential for distance-based models (KNN, SVR) and gradient</w:t>
+      </w:r>
+      <w:r>
+        <w:rPr>
+          <w:lang w:val="en-US"/>
+        </w:rPr>
+        <w:t xml:space="preserve"> </w:t>
+      </w:r>
+      <w:r>
+        <w:rPr>
+          <w:lang w:val="en-US"/>
+        </w:rPr>
+        <w:t>based optimizers. The scaler was fitted exclusively on training data and then applied to test data to prevent data leakage.</w:t>
       </w:r>
     </w:p>
     <w:p>
@@ -2789,7 +2996,6 @@
         <w:rPr>
           <w:lang w:val="en-US"/>
         </w:rPr>
-        <w:lastRenderedPageBreak/>
         <w:t xml:space="preserve">Stage 2 - Polynomial Feature Engineering: For linear models (Ridge, Lasso, </w:t>
       </w:r>
       <w:proofErr w:type="spellStart"/>
@@ -2804,7 +3010,19 @@
         <w:rPr>
           <w:lang w:val="en-US"/>
         </w:rPr>
-        <w:t>), degree-2 polynomial features were generated, expanding the feature space from 6 to 27 dimensions. This includes all pairwise interactions (e.g., X1*X2) and squared terms (e.g., X1^2), enabling linear models to capture non-linear relationships without changing their fundamental architecture.</w:t>
+        <w:t>), degree</w:t>
+      </w:r>
+      <w:r>
+        <w:rPr>
+          <w:lang w:val="en-US"/>
+        </w:rPr>
+        <w:t xml:space="preserve"> </w:t>
+      </w:r>
+      <w:r>
+        <w:rPr>
+          <w:lang w:val="en-US"/>
+        </w:rPr>
+        <w:t>2 polynomial features were generated, expanding the feature space from 6 to 27 dimensions. This includes all pairwise interactions (e.g., X1*X2) and squared terms (e.g., X1^2), enabling linear models to capture non-linear relationships without changing their fundamental architecture.</w:t>
       </w:r>
     </w:p>
     <w:p>
@@ -2834,7 +3052,19 @@
         <w:rPr>
           <w:lang w:val="en-US"/>
         </w:rPr>
-        <w:t>A rigorous 5-fold cross-validation (CV) scheme was employed as the primary evaluation method. The training data (100 samples) was split into 5 folds, with each fold serving as the validation set once. Three metrics were computed for each model:</w:t>
+        <w:t>A rigorous 5-fold cross</w:t>
+      </w:r>
+      <w:r>
+        <w:rPr>
+          <w:lang w:val="en-US"/>
+        </w:rPr>
+        <w:t xml:space="preserve"> </w:t>
+      </w:r>
+      <w:r>
+        <w:rPr>
+          <w:lang w:val="en-US"/>
+        </w:rPr>
+        <w:t>validation (CV) scheme was employed as the primary evaluation method. The training data (100 samples) was split into 5 folds, with each fold serving as the validation set once. Three metrics were computed for each model:</w:t>
       </w:r>
     </w:p>
     <w:p>
@@ -2844,7 +3074,7 @@
           <w:numId w:val="2"/>
         </w:numPr>
         <w:spacing w:after="153" w:line="259" w:lineRule="auto"/>
-        <w:ind w:hanging="406"/>
+        <w:ind w:left="567" w:firstLine="0"/>
         <w:rPr>
           <w:lang w:val="en-US"/>
         </w:rPr>
@@ -2863,7 +3093,7 @@
           <w:numId w:val="2"/>
         </w:numPr>
         <w:spacing w:after="153" w:line="259" w:lineRule="auto"/>
-        <w:ind w:hanging="406"/>
+        <w:ind w:left="567" w:firstLine="0"/>
         <w:rPr>
           <w:lang w:val="en-US"/>
         </w:rPr>
@@ -2882,7 +3112,7 @@
           <w:numId w:val="2"/>
         </w:numPr>
         <w:spacing w:after="132" w:line="259" w:lineRule="auto"/>
-        <w:ind w:hanging="406"/>
+        <w:ind w:left="567" w:firstLine="0"/>
         <w:rPr>
           <w:lang w:val="en-US"/>
         </w:rPr>
@@ -2906,6 +3136,7 @@
         <w:rPr>
           <w:lang w:val="en-US"/>
         </w:rPr>
+        <w:lastRenderedPageBreak/>
         <w:t>Cross-validation was chosen over a simple train/test split because the dataset is small (100 samples). A single split could yield unstable estimates due to the random partition. CV provides more robust performance estimates by averaging over all possible splits.</w:t>
       </w:r>
     </w:p>
@@ -2951,12 +3182,6 @@
         </w:rPr>
         <w:t>, (2) preprocess features, (3) evaluate all 8 models via 5-fold CV, (4) select the model with the lowest mean MAE, (5) retrain the selected model on all 100 training samples, and (6) predict Y values for the 20 test samples. This final retraining step maximizes the information available to the best model before generating predictions.</w:t>
       </w:r>
-      <w:r>
-        <w:rPr>
-          <w:lang w:val="en-US"/>
-        </w:rPr>
-        <w:br w:type="page"/>
-      </w:r>
     </w:p>
     <w:p>
       <w:pPr>
@@ -2970,7 +3195,6 @@
         <w:rPr>
           <w:lang w:val="en-US"/>
         </w:rPr>
-        <w:lastRenderedPageBreak/>
         <w:t>Exploratory Data Analysis</w:t>
       </w:r>
     </w:p>
@@ -2992,8 +3216,6 @@
     <w:p>
       <w:pPr>
         <w:spacing w:after="95" w:line="259" w:lineRule="auto"/>
-        <w:ind w:left="510" w:firstLine="0"/>
-        <w:jc w:val="left"/>
         <w:rPr>
           <w:lang w:val="en-US"/>
         </w:rPr>
@@ -3004,9 +3226,9 @@
           <w:lang w:val="en-US"/>
         </w:rPr>
         <w:drawing>
-          <wp:inline distT="0" distB="0" distL="0" distR="0" wp14:anchorId="21969B3E" wp14:editId="29CE5ADD">
-            <wp:extent cx="6120003" cy="4590034"/>
-            <wp:effectExtent l="0" t="0" r="0" b="0"/>
+          <wp:inline distT="0" distB="0" distL="0" distR="0" wp14:anchorId="21969B3E" wp14:editId="4FF84D0B">
+            <wp:extent cx="6156000" cy="4590034"/>
+            <wp:effectExtent l="0" t="0" r="3810" b="0"/>
             <wp:docPr id="249" name="Picture 249"/>
             <wp:cNvGraphicFramePr/>
             <a:graphic xmlns:a="http://schemas.openxmlformats.org/drawingml/2006/main">
@@ -3014,103 +3236,6 @@
                 <pic:pic xmlns:pic="http://schemas.openxmlformats.org/drawingml/2006/picture">
                   <pic:nvPicPr>
                     <pic:cNvPr id="249" name="Picture 249"/>
-                    <pic:cNvPicPr/>
-                  </pic:nvPicPr>
-                  <pic:blipFill>
-                    <a:blip r:embed="rId7"/>
-                    <a:stretch>
-                      <a:fillRect/>
-                    </a:stretch>
-                  </pic:blipFill>
-                  <pic:spPr>
-                    <a:xfrm>
-                      <a:off x="0" y="0"/>
-                      <a:ext cx="6120003" cy="4590034"/>
-                    </a:xfrm>
-                    <a:prstGeom prst="rect">
-                      <a:avLst/>
-                    </a:prstGeom>
-                  </pic:spPr>
-                </pic:pic>
-              </a:graphicData>
-            </a:graphic>
-          </wp:inline>
-        </w:drawing>
-      </w:r>
-    </w:p>
-    <w:p>
-      <w:pPr>
-        <w:spacing w:after="47" w:line="265" w:lineRule="auto"/>
-        <w:jc w:val="center"/>
-        <w:rPr>
-          <w:lang w:val="en-US"/>
-        </w:rPr>
-      </w:pPr>
-      <w:r>
-        <w:rPr>
-          <w:i/>
-          <w:color w:val="505050"/>
-          <w:sz w:val="18"/>
-          <w:lang w:val="en-US"/>
-        </w:rPr>
-        <w:t>Figure 1: Feature Correlation Heatmap</w:t>
-      </w:r>
-    </w:p>
-    <w:p>
-      <w:pPr>
-        <w:spacing w:after="0"/>
-        <w:ind w:left="-5"/>
-        <w:rPr>
-          <w:lang w:val="en-US"/>
-        </w:rPr>
-      </w:pPr>
-      <w:r>
-        <w:rPr>
-          <w:lang w:val="en-US"/>
-        </w:rPr>
-        <w:t xml:space="preserve">The target variable distribution confirms the extreme right skew (skewness = 4.08). </w:t>
-      </w:r>
-      <w:proofErr w:type="gramStart"/>
-      <w:r>
-        <w:rPr>
-          <w:lang w:val="en-US"/>
-        </w:rPr>
-        <w:t>The majority of</w:t>
-      </w:r>
-      <w:proofErr w:type="gramEnd"/>
-      <w:r>
-        <w:rPr>
-          <w:lang w:val="en-US"/>
-        </w:rPr>
-        <w:t xml:space="preserve"> Y values cluster below 500, with a long tail extending to 13,578. This distribution challenges models that assume normally distributed residuals.</w:t>
-      </w:r>
-    </w:p>
-    <w:p>
-      <w:pPr>
-        <w:spacing w:after="95" w:line="259" w:lineRule="auto"/>
-        <w:ind w:left="510" w:firstLine="0"/>
-        <w:jc w:val="left"/>
-        <w:rPr>
-          <w:lang w:val="en-US"/>
-        </w:rPr>
-      </w:pPr>
-      <w:r>
-        <w:rPr>
-          <w:noProof/>
-          <w:lang w:val="en-US"/>
-        </w:rPr>
-        <w:lastRenderedPageBreak/>
-        <w:drawing>
-          <wp:inline distT="0" distB="0" distL="0" distR="0" wp14:anchorId="6C8092BF" wp14:editId="1B8A87A6">
-            <wp:extent cx="6120003" cy="3824986"/>
-            <wp:effectExtent l="0" t="0" r="0" b="0"/>
-            <wp:docPr id="262" name="Picture 262"/>
-            <wp:cNvGraphicFramePr/>
-            <a:graphic xmlns:a="http://schemas.openxmlformats.org/drawingml/2006/main">
-              <a:graphicData uri="http://schemas.openxmlformats.org/drawingml/2006/picture">
-                <pic:pic xmlns:pic="http://schemas.openxmlformats.org/drawingml/2006/picture">
-                  <pic:nvPicPr>
-                    <pic:cNvPr id="262" name="Picture 262"/>
                     <pic:cNvPicPr/>
                   </pic:nvPicPr>
                   <pic:blipFill>
@@ -3122,7 +3247,7 @@
                   <pic:spPr>
                     <a:xfrm>
                       <a:off x="0" y="0"/>
-                      <a:ext cx="6120003" cy="3824986"/>
+                      <a:ext cx="6156000" cy="4590034"/>
                     </a:xfrm>
                     <a:prstGeom prst="rect">
                       <a:avLst/>
@@ -3150,8 +3275,112 @@
           <w:sz w:val="18"/>
           <w:lang w:val="en-US"/>
         </w:rPr>
+        <w:t>Figure 1: Feature Correlation Heatmap</w:t>
+      </w:r>
+    </w:p>
+    <w:p>
+      <w:pPr>
+        <w:spacing w:after="0"/>
+        <w:ind w:left="-5"/>
+        <w:rPr>
+          <w:lang w:val="en-US"/>
+        </w:rPr>
+      </w:pPr>
+      <w:r>
+        <w:rPr>
+          <w:lang w:val="en-US"/>
+        </w:rPr>
+        <w:t xml:space="preserve">The target variable distribution confirms the extreme right skew (skewness = 4.08). </w:t>
+      </w:r>
+      <w:proofErr w:type="gramStart"/>
+      <w:r>
+        <w:rPr>
+          <w:lang w:val="en-US"/>
+        </w:rPr>
+        <w:t>The majority of</w:t>
+      </w:r>
+      <w:proofErr w:type="gramEnd"/>
+      <w:r>
+        <w:rPr>
+          <w:lang w:val="en-US"/>
+        </w:rPr>
+        <w:t xml:space="preserve"> Y values cluster below 500, with a long tail extending to 13,578. This distribution challenges models that assume normally distributed residuals.</w:t>
+      </w:r>
+    </w:p>
+    <w:p>
+      <w:pPr>
+        <w:spacing w:after="95" w:line="259" w:lineRule="auto"/>
+        <w:jc w:val="left"/>
+        <w:rPr>
+          <w:lang w:val="en-US"/>
+        </w:rPr>
+      </w:pPr>
+      <w:r>
+        <w:rPr>
+          <w:noProof/>
+          <w:lang w:val="en-US"/>
+        </w:rPr>
+        <w:lastRenderedPageBreak/>
+        <w:drawing>
+          <wp:inline distT="0" distB="0" distL="0" distR="0" wp14:anchorId="6C8092BF" wp14:editId="01F8A998">
+            <wp:extent cx="6192000" cy="3824986"/>
+            <wp:effectExtent l="0" t="0" r="5715" b="0"/>
+            <wp:docPr id="262" name="Picture 262"/>
+            <wp:cNvGraphicFramePr/>
+            <a:graphic xmlns:a="http://schemas.openxmlformats.org/drawingml/2006/main">
+              <a:graphicData uri="http://schemas.openxmlformats.org/drawingml/2006/picture">
+                <pic:pic xmlns:pic="http://schemas.openxmlformats.org/drawingml/2006/picture">
+                  <pic:nvPicPr>
+                    <pic:cNvPr id="262" name="Picture 262"/>
+                    <pic:cNvPicPr/>
+                  </pic:nvPicPr>
+                  <pic:blipFill>
+                    <a:blip r:embed="rId9"/>
+                    <a:stretch>
+                      <a:fillRect/>
+                    </a:stretch>
+                  </pic:blipFill>
+                  <pic:spPr>
+                    <a:xfrm>
+                      <a:off x="0" y="0"/>
+                      <a:ext cx="6192000" cy="3824986"/>
+                    </a:xfrm>
+                    <a:prstGeom prst="rect">
+                      <a:avLst/>
+                    </a:prstGeom>
+                  </pic:spPr>
+                </pic:pic>
+              </a:graphicData>
+            </a:graphic>
+          </wp:inline>
+        </w:drawing>
+      </w:r>
+    </w:p>
+    <w:p>
+      <w:pPr>
+        <w:spacing w:after="47" w:line="265" w:lineRule="auto"/>
+        <w:jc w:val="center"/>
+        <w:rPr>
+          <w:lang w:val="en-US"/>
+        </w:rPr>
+      </w:pPr>
+      <w:r>
+        <w:rPr>
+          <w:i/>
+          <w:color w:val="505050"/>
+          <w:sz w:val="18"/>
+          <w:lang w:val="en-US"/>
+        </w:rPr>
         <w:t>Figure 2: Target Variable (Y) Distribution</w:t>
       </w:r>
+    </w:p>
+    <w:p>
+      <w:pPr>
+        <w:ind w:left="0" w:firstLine="0"/>
+        <w:rPr>
+          <w:lang w:val="en-US"/>
+        </w:rPr>
+      </w:pPr>
     </w:p>
     <w:p>
       <w:pPr>
@@ -3286,7 +3515,7 @@
     <w:p>
       <w:pPr>
         <w:spacing w:after="0" w:line="259" w:lineRule="auto"/>
-        <w:ind w:left="-5"/>
+        <w:ind w:left="-5" w:right="26"/>
         <w:rPr>
           <w:lang w:val="en-US"/>
         </w:rPr>
@@ -3301,12 +3530,10 @@
     <w:tbl>
       <w:tblPr>
         <w:tblStyle w:val="TableGrid"/>
-        <w:tblW w:w="9354" w:type="dxa"/>
+        <w:tblW w:w="9785" w:type="dxa"/>
         <w:tblInd w:w="-57" w:type="dxa"/>
         <w:tblCellMar>
-          <w:top w:w="0" w:type="dxa"/>
           <w:left w:w="115" w:type="dxa"/>
-          <w:bottom w:w="0" w:type="dxa"/>
           <w:right w:w="115" w:type="dxa"/>
         </w:tblCellMar>
         <w:tblLook w:val="04A0" w:firstRow="1" w:lastRow="0" w:firstColumn="1" w:lastColumn="0" w:noHBand="0" w:noVBand="1"/>
@@ -3314,9 +3541,9 @@
       <w:tblGrid>
         <w:gridCol w:w="2267"/>
         <w:gridCol w:w="1701"/>
-        <w:gridCol w:w="1701"/>
-        <w:gridCol w:w="1984"/>
-        <w:gridCol w:w="1701"/>
+        <w:gridCol w:w="1924"/>
+        <w:gridCol w:w="2211"/>
+        <w:gridCol w:w="1682"/>
       </w:tblGrid>
       <w:tr>
         <w:trPr>
@@ -3324,7 +3551,7 @@
         </w:trPr>
         <w:tc>
           <w:tcPr>
-            <w:tcW w:w="2268" w:type="dxa"/>
+            <w:tcW w:w="2267" w:type="dxa"/>
             <w:tcBorders>
               <w:top w:val="single" w:sz="9" w:space="0" w:color="0066CC"/>
               <w:left w:val="single" w:sz="9" w:space="0" w:color="0066CC"/>
@@ -3388,7 +3615,7 @@
         </w:tc>
         <w:tc>
           <w:tcPr>
-            <w:tcW w:w="1701" w:type="dxa"/>
+            <w:tcW w:w="1924" w:type="dxa"/>
             <w:tcBorders>
               <w:top w:val="single" w:sz="9" w:space="0" w:color="0066CC"/>
               <w:left w:val="single" w:sz="9" w:space="0" w:color="0066CC"/>
@@ -3420,7 +3647,7 @@
         </w:tc>
         <w:tc>
           <w:tcPr>
-            <w:tcW w:w="1984" w:type="dxa"/>
+            <w:tcW w:w="2211" w:type="dxa"/>
             <w:tcBorders>
               <w:top w:val="single" w:sz="9" w:space="0" w:color="0066CC"/>
               <w:left w:val="single" w:sz="9" w:space="0" w:color="0066CC"/>
@@ -3452,7 +3679,7 @@
         </w:tc>
         <w:tc>
           <w:tcPr>
-            <w:tcW w:w="1701" w:type="dxa"/>
+            <w:tcW w:w="1682" w:type="dxa"/>
             <w:tcBorders>
               <w:top w:val="single" w:sz="9" w:space="0" w:color="0066CC"/>
               <w:left w:val="single" w:sz="9" w:space="0" w:color="0066CC"/>
@@ -3489,7 +3716,7 @@
         </w:trPr>
         <w:tc>
           <w:tcPr>
-            <w:tcW w:w="2268" w:type="dxa"/>
+            <w:tcW w:w="2267" w:type="dxa"/>
             <w:tcBorders>
               <w:top w:val="single" w:sz="9" w:space="0" w:color="0066CC"/>
               <w:left w:val="single" w:sz="9" w:space="0" w:color="0066CC"/>
@@ -3549,7 +3776,7 @@
         </w:tc>
         <w:tc>
           <w:tcPr>
-            <w:tcW w:w="1701" w:type="dxa"/>
+            <w:tcW w:w="1924" w:type="dxa"/>
             <w:tcBorders>
               <w:top w:val="single" w:sz="9" w:space="0" w:color="0066CC"/>
               <w:left w:val="single" w:sz="9" w:space="0" w:color="0066CC"/>
@@ -3579,7 +3806,7 @@
         </w:tc>
         <w:tc>
           <w:tcPr>
-            <w:tcW w:w="1984" w:type="dxa"/>
+            <w:tcW w:w="2211" w:type="dxa"/>
             <w:tcBorders>
               <w:top w:val="single" w:sz="9" w:space="0" w:color="0066CC"/>
               <w:left w:val="single" w:sz="9" w:space="0" w:color="0066CC"/>
@@ -3609,7 +3836,7 @@
         </w:tc>
         <w:tc>
           <w:tcPr>
-            <w:tcW w:w="1701" w:type="dxa"/>
+            <w:tcW w:w="1682" w:type="dxa"/>
             <w:tcBorders>
               <w:top w:val="single" w:sz="9" w:space="0" w:color="0066CC"/>
               <w:left w:val="single" w:sz="9" w:space="0" w:color="0066CC"/>
@@ -3644,7 +3871,7 @@
         </w:trPr>
         <w:tc>
           <w:tcPr>
-            <w:tcW w:w="2268" w:type="dxa"/>
+            <w:tcW w:w="2267" w:type="dxa"/>
             <w:tcBorders>
               <w:top w:val="single" w:sz="9" w:space="0" w:color="0066CC"/>
               <w:left w:val="single" w:sz="9" w:space="0" w:color="0066CC"/>
@@ -3706,7 +3933,7 @@
         </w:tc>
         <w:tc>
           <w:tcPr>
-            <w:tcW w:w="1701" w:type="dxa"/>
+            <w:tcW w:w="1924" w:type="dxa"/>
             <w:tcBorders>
               <w:top w:val="single" w:sz="9" w:space="0" w:color="0066CC"/>
               <w:left w:val="single" w:sz="9" w:space="0" w:color="0066CC"/>
@@ -3736,7 +3963,7 @@
         </w:tc>
         <w:tc>
           <w:tcPr>
-            <w:tcW w:w="1984" w:type="dxa"/>
+            <w:tcW w:w="2211" w:type="dxa"/>
             <w:tcBorders>
               <w:top w:val="single" w:sz="9" w:space="0" w:color="0066CC"/>
               <w:left w:val="single" w:sz="9" w:space="0" w:color="0066CC"/>
@@ -3766,7 +3993,7 @@
         </w:tc>
         <w:tc>
           <w:tcPr>
-            <w:tcW w:w="1701" w:type="dxa"/>
+            <w:tcW w:w="1682" w:type="dxa"/>
             <w:tcBorders>
               <w:top w:val="single" w:sz="9" w:space="0" w:color="0066CC"/>
               <w:left w:val="single" w:sz="9" w:space="0" w:color="0066CC"/>
@@ -3801,7 +4028,7 @@
         </w:trPr>
         <w:tc>
           <w:tcPr>
-            <w:tcW w:w="2268" w:type="dxa"/>
+            <w:tcW w:w="2267" w:type="dxa"/>
             <w:tcBorders>
               <w:top w:val="single" w:sz="9" w:space="0" w:color="0066CC"/>
               <w:left w:val="single" w:sz="9" w:space="0" w:color="0066CC"/>
@@ -3861,7 +4088,7 @@
         </w:tc>
         <w:tc>
           <w:tcPr>
-            <w:tcW w:w="1701" w:type="dxa"/>
+            <w:tcW w:w="1924" w:type="dxa"/>
             <w:tcBorders>
               <w:top w:val="single" w:sz="9" w:space="0" w:color="0066CC"/>
               <w:left w:val="single" w:sz="9" w:space="0" w:color="0066CC"/>
@@ -3891,7 +4118,7 @@
         </w:tc>
         <w:tc>
           <w:tcPr>
-            <w:tcW w:w="1984" w:type="dxa"/>
+            <w:tcW w:w="2211" w:type="dxa"/>
             <w:tcBorders>
               <w:top w:val="single" w:sz="9" w:space="0" w:color="0066CC"/>
               <w:left w:val="single" w:sz="9" w:space="0" w:color="0066CC"/>
@@ -3921,7 +4148,7 @@
         </w:tc>
         <w:tc>
           <w:tcPr>
-            <w:tcW w:w="1701" w:type="dxa"/>
+            <w:tcW w:w="1682" w:type="dxa"/>
             <w:tcBorders>
               <w:top w:val="single" w:sz="9" w:space="0" w:color="0066CC"/>
               <w:left w:val="single" w:sz="9" w:space="0" w:color="0066CC"/>
@@ -3956,7 +4183,7 @@
         </w:trPr>
         <w:tc>
           <w:tcPr>
-            <w:tcW w:w="2268" w:type="dxa"/>
+            <w:tcW w:w="2267" w:type="dxa"/>
             <w:tcBorders>
               <w:top w:val="single" w:sz="9" w:space="0" w:color="0066CC"/>
               <w:left w:val="single" w:sz="9" w:space="0" w:color="0066CC"/>
@@ -4015,7 +4242,7 @@
         </w:tc>
         <w:tc>
           <w:tcPr>
-            <w:tcW w:w="1701" w:type="dxa"/>
+            <w:tcW w:w="1924" w:type="dxa"/>
             <w:tcBorders>
               <w:top w:val="single" w:sz="9" w:space="0" w:color="0066CC"/>
               <w:left w:val="single" w:sz="9" w:space="0" w:color="0066CC"/>
@@ -4044,7 +4271,7 @@
         </w:tc>
         <w:tc>
           <w:tcPr>
-            <w:tcW w:w="1984" w:type="dxa"/>
+            <w:tcW w:w="2211" w:type="dxa"/>
             <w:tcBorders>
               <w:top w:val="single" w:sz="9" w:space="0" w:color="0066CC"/>
               <w:left w:val="single" w:sz="9" w:space="0" w:color="0066CC"/>
@@ -4074,7 +4301,7 @@
         </w:tc>
         <w:tc>
           <w:tcPr>
-            <w:tcW w:w="1701" w:type="dxa"/>
+            <w:tcW w:w="1682" w:type="dxa"/>
             <w:tcBorders>
               <w:top w:val="single" w:sz="9" w:space="0" w:color="0066CC"/>
               <w:left w:val="single" w:sz="9" w:space="0" w:color="0066CC"/>
@@ -4109,7 +4336,7 @@
         </w:trPr>
         <w:tc>
           <w:tcPr>
-            <w:tcW w:w="2268" w:type="dxa"/>
+            <w:tcW w:w="2267" w:type="dxa"/>
             <w:tcBorders>
               <w:top w:val="single" w:sz="9" w:space="0" w:color="0066CC"/>
               <w:left w:val="single" w:sz="9" w:space="0" w:color="0066CC"/>
@@ -4169,7 +4396,7 @@
         </w:tc>
         <w:tc>
           <w:tcPr>
-            <w:tcW w:w="1701" w:type="dxa"/>
+            <w:tcW w:w="1924" w:type="dxa"/>
             <w:tcBorders>
               <w:top w:val="single" w:sz="9" w:space="0" w:color="0066CC"/>
               <w:left w:val="single" w:sz="9" w:space="0" w:color="0066CC"/>
@@ -4199,7 +4426,7 @@
         </w:tc>
         <w:tc>
           <w:tcPr>
-            <w:tcW w:w="1984" w:type="dxa"/>
+            <w:tcW w:w="2211" w:type="dxa"/>
             <w:tcBorders>
               <w:top w:val="single" w:sz="9" w:space="0" w:color="0066CC"/>
               <w:left w:val="single" w:sz="9" w:space="0" w:color="0066CC"/>
@@ -4229,7 +4456,7 @@
         </w:tc>
         <w:tc>
           <w:tcPr>
-            <w:tcW w:w="1701" w:type="dxa"/>
+            <w:tcW w:w="1682" w:type="dxa"/>
             <w:tcBorders>
               <w:top w:val="single" w:sz="9" w:space="0" w:color="0066CC"/>
               <w:left w:val="single" w:sz="9" w:space="0" w:color="0066CC"/>
@@ -4264,7 +4491,7 @@
         </w:trPr>
         <w:tc>
           <w:tcPr>
-            <w:tcW w:w="2268" w:type="dxa"/>
+            <w:tcW w:w="2267" w:type="dxa"/>
             <w:tcBorders>
               <w:top w:val="single" w:sz="9" w:space="0" w:color="0066CC"/>
               <w:left w:val="single" w:sz="9" w:space="0" w:color="0066CC"/>
@@ -4326,7 +4553,7 @@
         </w:tc>
         <w:tc>
           <w:tcPr>
-            <w:tcW w:w="1701" w:type="dxa"/>
+            <w:tcW w:w="1924" w:type="dxa"/>
             <w:tcBorders>
               <w:top w:val="single" w:sz="9" w:space="0" w:color="0066CC"/>
               <w:left w:val="single" w:sz="9" w:space="0" w:color="0066CC"/>
@@ -4356,7 +4583,7 @@
         </w:tc>
         <w:tc>
           <w:tcPr>
-            <w:tcW w:w="1984" w:type="dxa"/>
+            <w:tcW w:w="2211" w:type="dxa"/>
             <w:tcBorders>
               <w:top w:val="single" w:sz="9" w:space="0" w:color="0066CC"/>
               <w:left w:val="single" w:sz="9" w:space="0" w:color="0066CC"/>
@@ -4386,7 +4613,7 @@
         </w:tc>
         <w:tc>
           <w:tcPr>
-            <w:tcW w:w="1701" w:type="dxa"/>
+            <w:tcW w:w="1682" w:type="dxa"/>
             <w:tcBorders>
               <w:top w:val="single" w:sz="9" w:space="0" w:color="0066CC"/>
               <w:left w:val="single" w:sz="9" w:space="0" w:color="0066CC"/>
@@ -4421,7 +4648,7 @@
         </w:trPr>
         <w:tc>
           <w:tcPr>
-            <w:tcW w:w="2268" w:type="dxa"/>
+            <w:tcW w:w="2267" w:type="dxa"/>
             <w:tcBorders>
               <w:top w:val="single" w:sz="9" w:space="0" w:color="0066CC"/>
               <w:left w:val="single" w:sz="9" w:space="0" w:color="0066CC"/>
@@ -4481,7 +4708,7 @@
         </w:tc>
         <w:tc>
           <w:tcPr>
-            <w:tcW w:w="1701" w:type="dxa"/>
+            <w:tcW w:w="1924" w:type="dxa"/>
             <w:tcBorders>
               <w:top w:val="single" w:sz="9" w:space="0" w:color="0066CC"/>
               <w:left w:val="single" w:sz="9" w:space="0" w:color="0066CC"/>
@@ -4511,7 +4738,7 @@
         </w:tc>
         <w:tc>
           <w:tcPr>
-            <w:tcW w:w="1984" w:type="dxa"/>
+            <w:tcW w:w="2211" w:type="dxa"/>
             <w:tcBorders>
               <w:top w:val="single" w:sz="9" w:space="0" w:color="0066CC"/>
               <w:left w:val="single" w:sz="9" w:space="0" w:color="0066CC"/>
@@ -4541,7 +4768,7 @@
         </w:tc>
         <w:tc>
           <w:tcPr>
-            <w:tcW w:w="1701" w:type="dxa"/>
+            <w:tcW w:w="1682" w:type="dxa"/>
             <w:tcBorders>
               <w:top w:val="single" w:sz="9" w:space="0" w:color="0066CC"/>
               <w:left w:val="single" w:sz="9" w:space="0" w:color="0066CC"/>
@@ -4576,7 +4803,7 @@
         </w:trPr>
         <w:tc>
           <w:tcPr>
-            <w:tcW w:w="2268" w:type="dxa"/>
+            <w:tcW w:w="2267" w:type="dxa"/>
             <w:tcBorders>
               <w:top w:val="single" w:sz="9" w:space="0" w:color="0066CC"/>
               <w:left w:val="single" w:sz="9" w:space="0" w:color="0066CC"/>
@@ -4635,7 +4862,7 @@
         </w:tc>
         <w:tc>
           <w:tcPr>
-            <w:tcW w:w="1701" w:type="dxa"/>
+            <w:tcW w:w="1924" w:type="dxa"/>
             <w:tcBorders>
               <w:top w:val="single" w:sz="9" w:space="0" w:color="0066CC"/>
               <w:left w:val="single" w:sz="9" w:space="0" w:color="0066CC"/>
@@ -4664,7 +4891,7 @@
         </w:tc>
         <w:tc>
           <w:tcPr>
-            <w:tcW w:w="1984" w:type="dxa"/>
+            <w:tcW w:w="2211" w:type="dxa"/>
             <w:tcBorders>
               <w:top w:val="single" w:sz="9" w:space="0" w:color="0066CC"/>
               <w:left w:val="single" w:sz="9" w:space="0" w:color="0066CC"/>
@@ -4694,7 +4921,7 @@
         </w:tc>
         <w:tc>
           <w:tcPr>
-            <w:tcW w:w="1701" w:type="dxa"/>
+            <w:tcW w:w="1682" w:type="dxa"/>
             <w:tcBorders>
               <w:top w:val="single" w:sz="9" w:space="0" w:color="0066CC"/>
               <w:left w:val="single" w:sz="9" w:space="0" w:color="0066CC"/>
@@ -4732,10 +4959,29 @@
           <w:lang w:val="en-US"/>
         </w:rPr>
       </w:pPr>
-      <w:r>
-        <w:rPr>
-          <w:lang w:val="en-US"/>
-        </w:rPr>
+    </w:p>
+    <w:p>
+      <w:pPr>
+        <w:spacing w:after="237" w:line="259" w:lineRule="auto"/>
+        <w:ind w:left="-5"/>
+        <w:rPr>
+          <w:lang w:val="en-US"/>
+        </w:rPr>
+      </w:pPr>
+    </w:p>
+    <w:p>
+      <w:pPr>
+        <w:spacing w:after="237" w:line="259" w:lineRule="auto"/>
+        <w:ind w:left="-5"/>
+        <w:rPr>
+          <w:lang w:val="en-US"/>
+        </w:rPr>
+      </w:pPr>
+      <w:r>
+        <w:rPr>
+          <w:lang w:val="en-US"/>
+        </w:rPr>
+        <w:lastRenderedPageBreak/>
         <w:t>Key observations from the results:</w:t>
       </w:r>
     </w:p>
@@ -4745,7 +4991,7 @@
           <w:ilvl w:val="0"/>
           <w:numId w:val="3"/>
         </w:numPr>
-        <w:ind w:left="1133" w:hanging="283"/>
+        <w:ind w:left="567" w:firstLine="0"/>
         <w:rPr>
           <w:lang w:val="en-US"/>
         </w:rPr>
@@ -4777,7 +5023,7 @@
           <w:ilvl w:val="0"/>
           <w:numId w:val="3"/>
         </w:numPr>
-        <w:ind w:left="1133" w:hanging="283"/>
+        <w:ind w:left="567" w:firstLine="0"/>
         <w:rPr>
           <w:lang w:val="en-US"/>
         </w:rPr>
@@ -4787,7 +5033,6 @@
         <w:rPr>
           <w:lang w:val="en-US"/>
         </w:rPr>
-        <w:lastRenderedPageBreak/>
         <w:t>XGBoost</w:t>
       </w:r>
       <w:proofErr w:type="spellEnd"/>
@@ -4818,7 +5063,7 @@
           <w:ilvl w:val="0"/>
           <w:numId w:val="3"/>
         </w:numPr>
-        <w:ind w:left="1133" w:hanging="283"/>
+        <w:ind w:left="567" w:firstLine="0"/>
         <w:rPr>
           <w:lang w:val="en-US"/>
         </w:rPr>
@@ -4850,7 +5095,7 @@
           <w:ilvl w:val="0"/>
           <w:numId w:val="3"/>
         </w:numPr>
-        <w:ind w:left="1133" w:hanging="283"/>
+        <w:ind w:left="567" w:firstLine="0"/>
         <w:rPr>
           <w:lang w:val="en-US"/>
         </w:rPr>
@@ -4882,7 +5127,7 @@
           <w:ilvl w:val="0"/>
           <w:numId w:val="3"/>
         </w:numPr>
-        <w:ind w:left="1133" w:hanging="283"/>
+        <w:ind w:left="567" w:firstLine="0"/>
         <w:rPr>
           <w:lang w:val="en-US"/>
         </w:rPr>
@@ -4927,7 +5172,6 @@
     <w:p>
       <w:pPr>
         <w:spacing w:after="95" w:line="259" w:lineRule="auto"/>
-        <w:ind w:left="510" w:firstLine="0"/>
         <w:jc w:val="left"/>
         <w:rPr>
           <w:lang w:val="en-US"/>
@@ -4939,9 +5183,9 @@
           <w:lang w:val="en-US"/>
         </w:rPr>
         <w:drawing>
-          <wp:inline distT="0" distB="0" distL="0" distR="0" wp14:anchorId="39CB97B2" wp14:editId="528769D2">
-            <wp:extent cx="6120003" cy="3671951"/>
-            <wp:effectExtent l="0" t="0" r="0" b="0"/>
+          <wp:inline distT="0" distB="0" distL="0" distR="0" wp14:anchorId="39CB97B2" wp14:editId="4FF6A021">
+            <wp:extent cx="6192000" cy="3671951"/>
+            <wp:effectExtent l="0" t="0" r="5715" b="0"/>
             <wp:docPr id="397" name="Picture 397"/>
             <wp:cNvGraphicFramePr/>
             <a:graphic xmlns:a="http://schemas.openxmlformats.org/drawingml/2006/main">
@@ -4949,111 +5193,6 @@
                 <pic:pic xmlns:pic="http://schemas.openxmlformats.org/drawingml/2006/picture">
                   <pic:nvPicPr>
                     <pic:cNvPr id="397" name="Picture 397"/>
-                    <pic:cNvPicPr/>
-                  </pic:nvPicPr>
-                  <pic:blipFill>
-                    <a:blip r:embed="rId9"/>
-                    <a:stretch>
-                      <a:fillRect/>
-                    </a:stretch>
-                  </pic:blipFill>
-                  <pic:spPr>
-                    <a:xfrm>
-                      <a:off x="0" y="0"/>
-                      <a:ext cx="6120003" cy="3671951"/>
-                    </a:xfrm>
-                    <a:prstGeom prst="rect">
-                      <a:avLst/>
-                    </a:prstGeom>
-                  </pic:spPr>
-                </pic:pic>
-              </a:graphicData>
-            </a:graphic>
-          </wp:inline>
-        </w:drawing>
-      </w:r>
-    </w:p>
-    <w:p>
-      <w:pPr>
-        <w:spacing w:after="0" w:line="259" w:lineRule="auto"/>
-        <w:ind w:left="0" w:right="3189" w:firstLine="0"/>
-        <w:jc w:val="right"/>
-        <w:rPr>
-          <w:lang w:val="en-US"/>
-        </w:rPr>
-      </w:pPr>
-      <w:r>
-        <w:rPr>
-          <w:i/>
-          <w:color w:val="505050"/>
-          <w:sz w:val="18"/>
-          <w:lang w:val="en-US"/>
-        </w:rPr>
-        <w:t>Figure 3: Model Comparison by Cross-Validated MAE</w:t>
-      </w:r>
-      <w:r>
-        <w:rPr>
-          <w:lang w:val="en-US"/>
-        </w:rPr>
-        <w:br w:type="page"/>
-      </w:r>
-    </w:p>
-    <w:p>
-      <w:pPr>
-        <w:pStyle w:val="Balk2"/>
-        <w:ind w:left="419" w:hanging="434"/>
-        <w:rPr>
-          <w:lang w:val="en-US"/>
-        </w:rPr>
-      </w:pPr>
-      <w:r>
-        <w:rPr>
-          <w:lang w:val="en-US"/>
-        </w:rPr>
-        <w:lastRenderedPageBreak/>
-        <w:t>Best Model Diagnostics - SVR (RBF Kernel)</w:t>
-      </w:r>
-    </w:p>
-    <w:p>
-      <w:pPr>
-        <w:spacing w:after="0"/>
-        <w:ind w:left="-5"/>
-        <w:rPr>
-          <w:lang w:val="en-US"/>
-        </w:rPr>
-      </w:pPr>
-      <w:r>
-        <w:rPr>
-          <w:lang w:val="en-US"/>
-        </w:rPr>
-        <w:t>The scatter plot below compares actual vs. predicted Y values for the best model on a holdout set (80/20 split). Points closer to the red dashed line indicate more accurate predictions.</w:t>
-      </w:r>
-    </w:p>
-    <w:p>
-      <w:pPr>
-        <w:spacing w:after="95" w:line="259" w:lineRule="auto"/>
-        <w:ind w:left="510" w:firstLine="0"/>
-        <w:jc w:val="left"/>
-        <w:rPr>
-          <w:lang w:val="en-US"/>
-        </w:rPr>
-      </w:pPr>
-      <w:r>
-        <w:rPr>
-          <w:noProof/>
-          <w:lang w:val="en-US"/>
-        </w:rPr>
-        <w:drawing>
-          <wp:inline distT="0" distB="0" distL="0" distR="0" wp14:anchorId="2FF3752E" wp14:editId="29E34206">
-            <wp:extent cx="6120003" cy="6120003"/>
-            <wp:effectExtent l="0" t="0" r="0" b="0"/>
-            <wp:docPr id="410" name="Picture 410"/>
-            <wp:cNvGraphicFramePr/>
-            <a:graphic xmlns:a="http://schemas.openxmlformats.org/drawingml/2006/main">
-              <a:graphicData uri="http://schemas.openxmlformats.org/drawingml/2006/picture">
-                <pic:pic xmlns:pic="http://schemas.openxmlformats.org/drawingml/2006/picture">
-                  <pic:nvPicPr>
-                    <pic:cNvPr id="410" name="Picture 410"/>
                     <pic:cNvPicPr/>
                   </pic:nvPicPr>
                   <pic:blipFill>
@@ -5065,7 +5204,7 @@
                   <pic:spPr>
                     <a:xfrm>
                       <a:off x="0" y="0"/>
-                      <a:ext cx="6120003" cy="6120003"/>
+                      <a:ext cx="6192000" cy="3671951"/>
                     </a:xfrm>
                     <a:prstGeom prst="rect">
                       <a:avLst/>
@@ -5080,8 +5219,9 @@
     </w:p>
     <w:p>
       <w:pPr>
-        <w:spacing w:after="47" w:line="265" w:lineRule="auto"/>
-        <w:jc w:val="center"/>
+        <w:spacing w:after="0" w:line="259" w:lineRule="auto"/>
+        <w:ind w:left="0" w:right="3189" w:firstLine="0"/>
+        <w:jc w:val="right"/>
         <w:rPr>
           <w:lang w:val="en-US"/>
         </w:rPr>
@@ -5093,7 +5233,29 @@
           <w:sz w:val="18"/>
           <w:lang w:val="en-US"/>
         </w:rPr>
-        <w:t>Figure 4: SVR (RBF) - Actual vs Predicted Values</w:t>
+        <w:t>Figure 3: Model Comparison by Cross-Validated MAE</w:t>
+      </w:r>
+      <w:r>
+        <w:rPr>
+          <w:lang w:val="en-US"/>
+        </w:rPr>
+        <w:br w:type="page"/>
+      </w:r>
+    </w:p>
+    <w:p>
+      <w:pPr>
+        <w:pStyle w:val="Balk2"/>
+        <w:ind w:left="419" w:hanging="434"/>
+        <w:rPr>
+          <w:lang w:val="en-US"/>
+        </w:rPr>
+      </w:pPr>
+      <w:r>
+        <w:rPr>
+          <w:lang w:val="en-US"/>
+        </w:rPr>
+        <w:lastRenderedPageBreak/>
+        <w:t>Best Model Diagnostics - SVR (RBF Kernel)</w:t>
       </w:r>
     </w:p>
     <w:p>
@@ -5108,13 +5270,12 @@
         <w:rPr>
           <w:lang w:val="en-US"/>
         </w:rPr>
-        <w:t>The residual distribution shows the spread of prediction errors. A symmetric distribution centered at zero would indicate unbiased predictions.</w:t>
+        <w:t>The scatter plot below compares actual vs. predicted Y values for the best model on a holdout set (80/20 split). Points closer to the red dashed line indicate more accurate predictions.</w:t>
       </w:r>
     </w:p>
     <w:p>
       <w:pPr>
         <w:spacing w:after="95" w:line="259" w:lineRule="auto"/>
-        <w:ind w:left="510" w:firstLine="0"/>
         <w:jc w:val="left"/>
         <w:rPr>
           <w:lang w:val="en-US"/>
@@ -5125,18 +5286,17 @@
           <w:noProof/>
           <w:lang w:val="en-US"/>
         </w:rPr>
-        <w:lastRenderedPageBreak/>
         <w:drawing>
-          <wp:inline distT="0" distB="0" distL="0" distR="0" wp14:anchorId="0E68B1A1" wp14:editId="617331F9">
-            <wp:extent cx="6120003" cy="3824986"/>
-            <wp:effectExtent l="0" t="0" r="0" b="0"/>
-            <wp:docPr id="423" name="Picture 423"/>
+          <wp:inline distT="0" distB="0" distL="0" distR="0" wp14:anchorId="2FF3752E" wp14:editId="74FFFF38">
+            <wp:extent cx="6192000" cy="6120003"/>
+            <wp:effectExtent l="0" t="0" r="5715" b="1905"/>
+            <wp:docPr id="410" name="Picture 410"/>
             <wp:cNvGraphicFramePr/>
             <a:graphic xmlns:a="http://schemas.openxmlformats.org/drawingml/2006/main">
               <a:graphicData uri="http://schemas.openxmlformats.org/drawingml/2006/picture">
                 <pic:pic xmlns:pic="http://schemas.openxmlformats.org/drawingml/2006/picture">
                   <pic:nvPicPr>
-                    <pic:cNvPr id="423" name="Picture 423"/>
+                    <pic:cNvPr id="410" name="Picture 410"/>
                     <pic:cNvPicPr/>
                   </pic:nvPicPr>
                   <pic:blipFill>
@@ -5148,7 +5308,7 @@
                   <pic:spPr>
                     <a:xfrm>
                       <a:off x="0" y="0"/>
-                      <a:ext cx="6120003" cy="3824986"/>
+                      <a:ext cx="6192000" cy="6120003"/>
                     </a:xfrm>
                     <a:prstGeom prst="rect">
                       <a:avLst/>
@@ -5176,29 +5336,7 @@
           <w:sz w:val="18"/>
           <w:lang w:val="en-US"/>
         </w:rPr>
-        <w:t>Figure 5: SVR (RBF) - Residual Distribution</w:t>
-      </w:r>
-      <w:r>
-        <w:rPr>
-          <w:lang w:val="en-US"/>
-        </w:rPr>
-        <w:br w:type="page"/>
-      </w:r>
-    </w:p>
-    <w:p>
-      <w:pPr>
-        <w:pStyle w:val="Balk2"/>
-        <w:ind w:left="419" w:hanging="434"/>
-        <w:rPr>
-          <w:lang w:val="en-US"/>
-        </w:rPr>
-      </w:pPr>
-      <w:r>
-        <w:rPr>
-          <w:lang w:val="en-US"/>
-        </w:rPr>
-        <w:lastRenderedPageBreak/>
-        <w:t>Feature Importance Analysis</w:t>
+        <w:t>Figure 4: SVR (RBF) - Actual vs Predicted Values</w:t>
       </w:r>
     </w:p>
     <w:p>
@@ -5213,13 +5351,12 @@
         <w:rPr>
           <w:lang w:val="en-US"/>
         </w:rPr>
-        <w:t>Feature importance was extracted from the three tree-based models to understand which input variables contribute most to predictions. While SVR does not provide direct feature importances, the tree-based models offer valuable insights.</w:t>
+        <w:t>The residual distribution shows the spread of prediction errors. A symmetric distribution centered at zero would indicate unbiased predictions.</w:t>
       </w:r>
     </w:p>
     <w:p>
       <w:pPr>
         <w:spacing w:after="95" w:line="259" w:lineRule="auto"/>
-        <w:ind w:left="510" w:firstLine="0"/>
         <w:jc w:val="left"/>
         <w:rPr>
           <w:lang w:val="en-US"/>
@@ -5230,17 +5367,18 @@
           <w:noProof/>
           <w:lang w:val="en-US"/>
         </w:rPr>
+        <w:lastRenderedPageBreak/>
         <w:drawing>
-          <wp:inline distT="0" distB="0" distL="0" distR="0" wp14:anchorId="1B50F80C" wp14:editId="0C48AEFE">
-            <wp:extent cx="6120003" cy="3824986"/>
-            <wp:effectExtent l="0" t="0" r="0" b="0"/>
-            <wp:docPr id="435" name="Picture 435"/>
+          <wp:inline distT="0" distB="0" distL="0" distR="0" wp14:anchorId="0E68B1A1" wp14:editId="281A95FF">
+            <wp:extent cx="6192000" cy="3824986"/>
+            <wp:effectExtent l="0" t="0" r="5715" b="0"/>
+            <wp:docPr id="423" name="Picture 423"/>
             <wp:cNvGraphicFramePr/>
             <a:graphic xmlns:a="http://schemas.openxmlformats.org/drawingml/2006/main">
               <a:graphicData uri="http://schemas.openxmlformats.org/drawingml/2006/picture">
                 <pic:pic xmlns:pic="http://schemas.openxmlformats.org/drawingml/2006/picture">
                   <pic:nvPicPr>
-                    <pic:cNvPr id="435" name="Picture 435"/>
+                    <pic:cNvPr id="423" name="Picture 423"/>
                     <pic:cNvPicPr/>
                   </pic:nvPicPr>
                   <pic:blipFill>
@@ -5252,7 +5390,7 @@
                   <pic:spPr>
                     <a:xfrm>
                       <a:off x="0" y="0"/>
-                      <a:ext cx="6120003" cy="3824986"/>
+                      <a:ext cx="6192000" cy="3824986"/>
                     </a:xfrm>
                     <a:prstGeom prst="rect">
                       <a:avLst/>
@@ -5270,23 +5408,64 @@
         <w:spacing w:after="47" w:line="265" w:lineRule="auto"/>
         <w:jc w:val="center"/>
         <w:rPr>
-          <w:lang w:val="en-US"/>
-        </w:rPr>
-      </w:pPr>
-      <w:r>
-        <w:rPr>
           <w:i/>
           <w:color w:val="505050"/>
           <w:sz w:val="18"/>
           <w:lang w:val="en-US"/>
         </w:rPr>
-        <w:t>Figure: Random Forest Feature Importances</w:t>
-      </w:r>
+      </w:pPr>
+      <w:r>
+        <w:rPr>
+          <w:i/>
+          <w:color w:val="505050"/>
+          <w:sz w:val="18"/>
+          <w:lang w:val="en-US"/>
+        </w:rPr>
+        <w:t>Figure 5: SVR (RBF) - Residual Distribution</w:t>
+      </w:r>
+    </w:p>
+    <w:p>
+      <w:pPr>
+        <w:pStyle w:val="Balk2"/>
+        <w:ind w:left="419" w:hanging="434"/>
+        <w:rPr>
+          <w:lang w:val="en-US"/>
+        </w:rPr>
+      </w:pPr>
+      <w:r>
+        <w:rPr>
+          <w:lang w:val="en-US"/>
+        </w:rPr>
+        <w:t>Feature Importance Analysis</w:t>
+      </w:r>
+    </w:p>
+    <w:p>
+      <w:pPr>
+        <w:spacing w:after="0"/>
+        <w:ind w:left="-5"/>
+        <w:rPr>
+          <w:lang w:val="en-US"/>
+        </w:rPr>
+      </w:pPr>
+      <w:r>
+        <w:rPr>
+          <w:lang w:val="en-US"/>
+        </w:rPr>
+        <w:t>Feature importance was extracted from the three tree-based models to understand which input variables contribute most to predictions. While SVR does not provide direct feature importances, the tree-based models offer valuable insights.</w:t>
+      </w:r>
+    </w:p>
+    <w:p>
+      <w:pPr>
+        <w:spacing w:after="0"/>
+        <w:ind w:left="-5"/>
+        <w:rPr>
+          <w:lang w:val="en-US"/>
+        </w:rPr>
+      </w:pPr>
     </w:p>
     <w:p>
       <w:pPr>
         <w:spacing w:after="95" w:line="259" w:lineRule="auto"/>
-        <w:ind w:left="510" w:firstLine="0"/>
         <w:jc w:val="left"/>
         <w:rPr>
           <w:lang w:val="en-US"/>
@@ -5298,16 +5477,16 @@
           <w:lang w:val="en-US"/>
         </w:rPr>
         <w:drawing>
-          <wp:inline distT="0" distB="0" distL="0" distR="0" wp14:anchorId="5B6DF673" wp14:editId="2494921D">
-            <wp:extent cx="6120003" cy="3824986"/>
-            <wp:effectExtent l="0" t="0" r="0" b="0"/>
-            <wp:docPr id="445" name="Picture 445"/>
+          <wp:inline distT="0" distB="0" distL="0" distR="0" wp14:anchorId="1B50F80C" wp14:editId="490A835E">
+            <wp:extent cx="6192000" cy="3564000"/>
+            <wp:effectExtent l="0" t="0" r="5715" b="5080"/>
+            <wp:docPr id="435" name="Picture 435"/>
             <wp:cNvGraphicFramePr/>
             <a:graphic xmlns:a="http://schemas.openxmlformats.org/drawingml/2006/main">
               <a:graphicData uri="http://schemas.openxmlformats.org/drawingml/2006/picture">
                 <pic:pic xmlns:pic="http://schemas.openxmlformats.org/drawingml/2006/picture">
                   <pic:nvPicPr>
-                    <pic:cNvPr id="445" name="Picture 445"/>
+                    <pic:cNvPr id="435" name="Picture 435"/>
                     <pic:cNvPicPr/>
                   </pic:nvPicPr>
                   <pic:blipFill>
@@ -5319,7 +5498,7 @@
                   <pic:spPr>
                     <a:xfrm>
                       <a:off x="0" y="0"/>
-                      <a:ext cx="6120003" cy="3824986"/>
+                      <a:ext cx="6192000" cy="3564000"/>
                     </a:xfrm>
                     <a:prstGeom prst="rect">
                       <a:avLst/>
@@ -5334,7 +5513,7 @@
     </w:p>
     <w:p>
       <w:pPr>
-        <w:spacing w:after="191" w:line="265" w:lineRule="auto"/>
+        <w:spacing w:after="47" w:line="265" w:lineRule="auto"/>
         <w:jc w:val="center"/>
         <w:rPr>
           <w:lang w:val="en-US"/>
@@ -5347,13 +5526,13 @@
           <w:sz w:val="18"/>
           <w:lang w:val="en-US"/>
         </w:rPr>
-        <w:t>Figure: Gradient Boosting Feature Importances</w:t>
+        <w:lastRenderedPageBreak/>
+        <w:t>Figure: Random Forest Feature Importances</w:t>
       </w:r>
     </w:p>
     <w:p>
       <w:pPr>
         <w:spacing w:after="95" w:line="259" w:lineRule="auto"/>
-        <w:ind w:left="510" w:firstLine="0"/>
         <w:jc w:val="left"/>
         <w:rPr>
           <w:lang w:val="en-US"/>
@@ -5364,18 +5543,17 @@
           <w:noProof/>
           <w:lang w:val="en-US"/>
         </w:rPr>
-        <w:lastRenderedPageBreak/>
         <w:drawing>
-          <wp:inline distT="0" distB="0" distL="0" distR="0" wp14:anchorId="72B6316F" wp14:editId="5293536D">
-            <wp:extent cx="6120003" cy="3824986"/>
-            <wp:effectExtent l="0" t="0" r="0" b="0"/>
-            <wp:docPr id="448" name="Picture 448"/>
+          <wp:inline distT="0" distB="0" distL="0" distR="0" wp14:anchorId="5B6DF673" wp14:editId="62F541C6">
+            <wp:extent cx="6192000" cy="3824986"/>
+            <wp:effectExtent l="0" t="0" r="5715" b="0"/>
+            <wp:docPr id="445" name="Picture 445"/>
             <wp:cNvGraphicFramePr/>
             <a:graphic xmlns:a="http://schemas.openxmlformats.org/drawingml/2006/main">
               <a:graphicData uri="http://schemas.openxmlformats.org/drawingml/2006/picture">
                 <pic:pic xmlns:pic="http://schemas.openxmlformats.org/drawingml/2006/picture">
                   <pic:nvPicPr>
-                    <pic:cNvPr id="448" name="Picture 448"/>
+                    <pic:cNvPr id="445" name="Picture 445"/>
                     <pic:cNvPicPr/>
                   </pic:nvPicPr>
                   <pic:blipFill>
@@ -5387,7 +5565,7 @@
                   <pic:spPr>
                     <a:xfrm>
                       <a:off x="0" y="0"/>
-                      <a:ext cx="6120003" cy="3824986"/>
+                      <a:ext cx="6192000" cy="3824986"/>
                     </a:xfrm>
                     <a:prstGeom prst="rect">
                       <a:avLst/>
@@ -5402,7 +5580,7 @@
     </w:p>
     <w:p>
       <w:pPr>
-        <w:spacing w:after="464" w:line="265" w:lineRule="auto"/>
+        <w:spacing w:after="191" w:line="265" w:lineRule="auto"/>
         <w:jc w:val="center"/>
         <w:rPr>
           <w:lang w:val="en-US"/>
@@ -5415,9 +5593,65 @@
           <w:sz w:val="18"/>
           <w:lang w:val="en-US"/>
         </w:rPr>
-        <w:t xml:space="preserve">Figure: </w:t>
-      </w:r>
-      <w:proofErr w:type="spellStart"/>
+        <w:t>Figure: Gradient Boosting Feature Importances</w:t>
+      </w:r>
+    </w:p>
+    <w:p>
+      <w:pPr>
+        <w:spacing w:after="95" w:line="259" w:lineRule="auto"/>
+        <w:jc w:val="left"/>
+        <w:rPr>
+          <w:lang w:val="en-US"/>
+        </w:rPr>
+      </w:pPr>
+      <w:r>
+        <w:rPr>
+          <w:noProof/>
+          <w:lang w:val="en-US"/>
+        </w:rPr>
+        <w:drawing>
+          <wp:inline distT="0" distB="0" distL="0" distR="0" wp14:anchorId="72B6316F" wp14:editId="20313133">
+            <wp:extent cx="6192000" cy="3824986"/>
+            <wp:effectExtent l="0" t="0" r="5715" b="0"/>
+            <wp:docPr id="448" name="Picture 448"/>
+            <wp:cNvGraphicFramePr/>
+            <a:graphic xmlns:a="http://schemas.openxmlformats.org/drawingml/2006/main">
+              <a:graphicData uri="http://schemas.openxmlformats.org/drawingml/2006/picture">
+                <pic:pic xmlns:pic="http://schemas.openxmlformats.org/drawingml/2006/picture">
+                  <pic:nvPicPr>
+                    <pic:cNvPr id="448" name="Picture 448"/>
+                    <pic:cNvPicPr/>
+                  </pic:nvPicPr>
+                  <pic:blipFill>
+                    <a:blip r:embed="rId15"/>
+                    <a:stretch>
+                      <a:fillRect/>
+                    </a:stretch>
+                  </pic:blipFill>
+                  <pic:spPr>
+                    <a:xfrm>
+                      <a:off x="0" y="0"/>
+                      <a:ext cx="6192000" cy="3824986"/>
+                    </a:xfrm>
+                    <a:prstGeom prst="rect">
+                      <a:avLst/>
+                    </a:prstGeom>
+                  </pic:spPr>
+                </pic:pic>
+              </a:graphicData>
+            </a:graphic>
+          </wp:inline>
+        </w:drawing>
+      </w:r>
+    </w:p>
+    <w:p>
+      <w:pPr>
+        <w:spacing w:after="464" w:line="265" w:lineRule="auto"/>
+        <w:jc w:val="center"/>
+        <w:rPr>
+          <w:lang w:val="en-US"/>
+        </w:rPr>
+      </w:pPr>
       <w:r>
         <w:rPr>
           <w:i/>
@@ -5425,9 +5659,9 @@
           <w:sz w:val="18"/>
           <w:lang w:val="en-US"/>
         </w:rPr>
-        <w:t>XGBoost</w:t>
-      </w:r>
-      <w:proofErr w:type="spellEnd"/>
+        <w:t xml:space="preserve">Figure: </w:t>
+      </w:r>
+      <w:proofErr w:type="spellStart"/>
       <w:r>
         <w:rPr>
           <w:i/>
@@ -5435,6 +5669,16 @@
           <w:sz w:val="18"/>
           <w:lang w:val="en-US"/>
         </w:rPr>
+        <w:t>XGBoost</w:t>
+      </w:r>
+      <w:proofErr w:type="spellEnd"/>
+      <w:r>
+        <w:rPr>
+          <w:i/>
+          <w:color w:val="505050"/>
+          <w:sz w:val="18"/>
+          <w:lang w:val="en-US"/>
+        </w:rPr>
         <w:t xml:space="preserve"> Feature Importances</w:t>
       </w:r>
     </w:p>
@@ -5449,8 +5693,17 @@
         <w:rPr>
           <w:lang w:val="en-US"/>
         </w:rPr>
+        <w:lastRenderedPageBreak/>
         <w:t>Across all tree-based models, feature importance rankings provide complementary views of which variables drive predictions. The consistency (or divergence) of these rankings helps validate which features are genuinely important versus model-specific artifacts.</w:t>
       </w:r>
+    </w:p>
+    <w:p>
+      <w:pPr>
+        <w:ind w:left="-5"/>
+        <w:rPr>
+          <w:lang w:val="en-US"/>
+        </w:rPr>
+      </w:pPr>
     </w:p>
     <w:p>
       <w:pPr>
@@ -5585,7 +5838,7 @@
     <w:p>
       <w:pPr>
         <w:spacing w:after="170"/>
-        <w:ind w:left="-5"/>
+        <w:ind w:left="-15" w:firstLine="0"/>
         <w:rPr>
           <w:lang w:val="en-US"/>
         </w:rPr>
@@ -5603,7 +5856,7 @@
           <w:ilvl w:val="0"/>
           <w:numId w:val="4"/>
         </w:numPr>
-        <w:ind w:left="1257" w:hanging="407"/>
+        <w:ind w:left="567" w:firstLine="0"/>
         <w:rPr>
           <w:lang w:val="en-US"/>
         </w:rPr>
@@ -5621,7 +5874,7 @@
           <w:ilvl w:val="0"/>
           <w:numId w:val="4"/>
         </w:numPr>
-        <w:ind w:left="1257" w:hanging="407"/>
+        <w:ind w:left="567" w:firstLine="0"/>
         <w:rPr>
           <w:lang w:val="en-US"/>
         </w:rPr>
@@ -5654,7 +5907,7 @@
           <w:numId w:val="4"/>
         </w:numPr>
         <w:spacing w:line="259" w:lineRule="auto"/>
-        <w:ind w:left="1257" w:hanging="407"/>
+        <w:ind w:left="567" w:firstLine="0"/>
         <w:rPr>
           <w:lang w:val="en-US"/>
         </w:rPr>
@@ -5669,8 +5922,6 @@
     <w:p>
       <w:pPr>
         <w:spacing w:after="249" w:line="259" w:lineRule="auto"/>
-        <w:ind w:left="181" w:firstLine="0"/>
-        <w:jc w:val="center"/>
         <w:rPr>
           <w:lang w:val="en-US"/>
         </w:rPr>
@@ -5718,16 +5969,15 @@
           <w:ilvl w:val="0"/>
           <w:numId w:val="5"/>
         </w:numPr>
-        <w:ind w:left="1133" w:hanging="283"/>
-        <w:rPr>
-          <w:lang w:val="en-US"/>
-        </w:rPr>
-      </w:pPr>
-      <w:r>
-        <w:rPr>
-          <w:lang w:val="en-US"/>
-        </w:rPr>
-        <w:lastRenderedPageBreak/>
+        <w:ind w:left="567" w:firstLine="0"/>
+        <w:rPr>
+          <w:lang w:val="en-US"/>
+        </w:rPr>
+      </w:pPr>
+      <w:r>
+        <w:rPr>
+          <w:lang w:val="en-US"/>
+        </w:rPr>
         <w:t xml:space="preserve">Small dataset: 100 training samples provide limited statistical power for learning </w:t>
       </w:r>
       <w:proofErr w:type="spellStart"/>
@@ -5765,7 +6015,7 @@
           <w:ilvl w:val="0"/>
           <w:numId w:val="5"/>
         </w:numPr>
-        <w:ind w:left="1133" w:hanging="283"/>
+        <w:ind w:left="567" w:firstLine="0"/>
         <w:rPr>
           <w:lang w:val="en-US"/>
         </w:rPr>
@@ -5798,7 +6048,7 @@
           <w:numId w:val="5"/>
         </w:numPr>
         <w:spacing w:after="182"/>
-        <w:ind w:left="1133" w:hanging="283"/>
+        <w:ind w:left="567" w:firstLine="0"/>
         <w:rPr>
           <w:lang w:val="en-US"/>
         </w:rPr>
@@ -5860,7 +6110,7 @@
           <w:ilvl w:val="0"/>
           <w:numId w:val="6"/>
         </w:numPr>
-        <w:ind w:left="1133" w:hanging="283"/>
+        <w:ind w:left="567" w:firstLine="0"/>
         <w:rPr>
           <w:lang w:val="en-US"/>
         </w:rPr>
@@ -5892,15 +6142,16 @@
           <w:ilvl w:val="0"/>
           <w:numId w:val="6"/>
         </w:numPr>
-        <w:ind w:left="1133" w:hanging="283"/>
-        <w:rPr>
-          <w:lang w:val="en-US"/>
-        </w:rPr>
-      </w:pPr>
-      <w:r>
-        <w:rPr>
-          <w:lang w:val="en-US"/>
-        </w:rPr>
+        <w:ind w:left="567" w:firstLine="0"/>
+        <w:rPr>
+          <w:lang w:val="en-US"/>
+        </w:rPr>
+      </w:pPr>
+      <w:r>
+        <w:rPr>
+          <w:lang w:val="en-US"/>
+        </w:rPr>
+        <w:lastRenderedPageBreak/>
         <w:t xml:space="preserve">Data preprocessing matters: </w:t>
       </w:r>
       <w:proofErr w:type="spellStart"/>
@@ -5938,7 +6189,7 @@
           <w:ilvl w:val="0"/>
           <w:numId w:val="6"/>
         </w:numPr>
-        <w:ind w:left="1133" w:hanging="283"/>
+        <w:ind w:left="567" w:firstLine="0"/>
         <w:rPr>
           <w:lang w:val="en-US"/>
         </w:rPr>
@@ -5970,7 +6221,7 @@
           <w:ilvl w:val="0"/>
           <w:numId w:val="6"/>
         </w:numPr>
-        <w:ind w:left="1133" w:hanging="283"/>
+        <w:ind w:left="567" w:firstLine="0"/>
         <w:rPr>
           <w:lang w:val="en-US"/>
         </w:rPr>
@@ -6040,15 +6291,16 @@
       </w:r>
     </w:p>
     <w:sectPr>
-      <w:headerReference w:type="even" r:id="rId15"/>
-      <w:headerReference w:type="default" r:id="rId16"/>
-      <w:footerReference w:type="even" r:id="rId17"/>
-      <w:footerReference w:type="default" r:id="rId18"/>
-      <w:headerReference w:type="first" r:id="rId19"/>
-      <w:footerReference w:type="first" r:id="rId20"/>
+      <w:headerReference w:type="even" r:id="rId16"/>
+      <w:headerReference w:type="default" r:id="rId17"/>
+      <w:footerReference w:type="even" r:id="rId18"/>
+      <w:footerReference w:type="default" r:id="rId19"/>
+      <w:headerReference w:type="first" r:id="rId20"/>
+      <w:footerReference w:type="first" r:id="rId21"/>
       <w:pgSz w:w="11906" w:h="16838"/>
-      <w:pgMar w:top="1134" w:right="623" w:bottom="1334" w:left="624" w:header="710" w:footer="486" w:gutter="0"/>
+      <w:pgMar w:top="1440" w:right="1080" w:bottom="1440" w:left="1080" w:header="710" w:footer="486" w:gutter="0"/>
       <w:cols w:space="708"/>
+      <w:docGrid w:linePitch="299"/>
     </w:sectPr>
   </w:body>
 </w:document>
@@ -6159,32 +6411,80 @@
       <w:spacing w:after="0" w:line="259" w:lineRule="auto"/>
       <w:ind w:left="0" w:right="107" w:firstLine="0"/>
       <w:jc w:val="center"/>
+      <w:rPr>
+        <w:lang w:val="en-US"/>
+      </w:rPr>
     </w:pPr>
-    <w:proofErr w:type="spellStart"/>
     <w:r>
       <w:rPr>
         <w:i/>
         <w:color w:val="808080"/>
         <w:sz w:val="16"/>
-      </w:rPr>
-      <w:t>Page</w:t>
+        <w:lang w:val="en-US"/>
+      </w:rPr>
+      <w:t xml:space="preserve">Page </w:t>
     </w:r>
-    <w:proofErr w:type="spellEnd"/>
+    <w:r>
+      <w:rPr>
+        <w:lang w:val="en-US"/>
+      </w:rPr>
+      <w:fldChar w:fldCharType="begin"/>
+    </w:r>
+    <w:r>
+      <w:rPr>
+        <w:lang w:val="en-US"/>
+      </w:rPr>
+      <w:instrText xml:space="preserve"> PAGE   \* MERGEFORMAT </w:instrText>
+    </w:r>
+    <w:r>
+      <w:rPr>
+        <w:lang w:val="en-US"/>
+      </w:rPr>
+      <w:fldChar w:fldCharType="separate"/>
+    </w:r>
     <w:r>
       <w:rPr>
         <w:i/>
         <w:color w:val="808080"/>
         <w:sz w:val="16"/>
-      </w:rPr>
-      <w:t xml:space="preserve"> </w:t>
+        <w:lang w:val="en-US"/>
+      </w:rPr>
+      <w:t>1</w:t>
     </w:r>
     <w:r>
+      <w:rPr>
+        <w:i/>
+        <w:color w:val="808080"/>
+        <w:sz w:val="16"/>
+        <w:lang w:val="en-US"/>
+      </w:rPr>
+      <w:fldChar w:fldCharType="end"/>
+    </w:r>
+    <w:r>
+      <w:rPr>
+        <w:i/>
+        <w:color w:val="808080"/>
+        <w:sz w:val="16"/>
+        <w:lang w:val="en-US"/>
+      </w:rPr>
+      <w:t>/</w:t>
+    </w:r>
+    <w:r>
+      <w:rPr>
+        <w:lang w:val="en-US"/>
+      </w:rPr>
       <w:fldChar w:fldCharType="begin"/>
     </w:r>
     <w:r>
-      <w:instrText xml:space="preserve"> PAGE   \* MERGEFORMAT </w:instrText>
+      <w:rPr>
+        <w:lang w:val="en-US"/>
+      </w:rPr>
+      <w:instrText xml:space="preserve"> NUMPAGES   \* MERGEFORMAT </w:instrText>
     </w:r>
     <w:r>
+      <w:rPr>
+        <w:lang w:val="en-US"/>
+      </w:rPr>
       <w:fldChar w:fldCharType="separate"/>
     </w:r>
     <w:r>
@@ -6192,35 +6492,19 @@
         <w:i/>
         <w:color w:val="808080"/>
         <w:sz w:val="16"/>
-      </w:rPr>
-      <w:t>1</w:t>
+        <w:lang w:val="en-US"/>
+      </w:rPr>
+      <w:t>14</w:t>
     </w:r>
     <w:r>
       <w:rPr>
         <w:i/>
         <w:color w:val="808080"/>
         <w:sz w:val="16"/>
+        <w:lang w:val="en-US"/>
       </w:rPr>
       <w:fldChar w:fldCharType="end"/>
     </w:r>
-    <w:r>
-      <w:rPr>
-        <w:i/>
-        <w:color w:val="808080"/>
-        <w:sz w:val="16"/>
-      </w:rPr>
-      <w:t>/</w:t>
-    </w:r>
-    <w:fldSimple w:instr=" NUMPAGES   \* MERGEFORMAT ">
-      <w:r>
-        <w:rPr>
-          <w:i/>
-          <w:color w:val="808080"/>
-          <w:sz w:val="16"/>
-        </w:rPr>
-        <w:t>14</w:t>
-      </w:r>
-    </w:fldSimple>
   </w:p>
 </w:ftr>
 </file>
@@ -6497,6 +6781,7 @@
         <w:b/>
         <w:color w:val="646464"/>
         <w:sz w:val="20"/>
+        <w:lang w:val="en-US"/>
       </w:rPr>
     </w:pPr>
     <w:r>
@@ -6504,20 +6789,21 @@
         <w:rFonts w:ascii="Calibri" w:eastAsia="Calibri" w:hAnsi="Calibri" w:cs="Calibri"/>
         <w:noProof/>
         <w:color w:val="000000"/>
+        <w:lang w:val="en-US"/>
       </w:rPr>
       <mc:AlternateContent>
         <mc:Choice Requires="wpg">
           <w:drawing>
-            <wp:anchor distT="0" distB="0" distL="114300" distR="114300" simplePos="0" relativeHeight="251659264" behindDoc="0" locked="0" layoutInCell="1" allowOverlap="1" wp14:anchorId="57CD0715" wp14:editId="16252FD6">
+            <wp:anchor distT="0" distB="0" distL="114300" distR="114300" simplePos="0" relativeHeight="251659264" behindDoc="0" locked="0" layoutInCell="1" allowOverlap="1" wp14:anchorId="57CD0715" wp14:editId="7EEDAD43">
               <wp:simplePos x="0" y="0"/>
-              <wp:positionH relativeFrom="page">
-                <wp:posOffset>360045</wp:posOffset>
+              <wp:positionH relativeFrom="margin">
+                <wp:align>left</wp:align>
               </wp:positionH>
               <wp:positionV relativeFrom="page">
                 <wp:posOffset>630746</wp:posOffset>
               </wp:positionV>
-              <wp:extent cx="6839966" cy="18034"/>
-              <wp:effectExtent l="0" t="0" r="0" b="0"/>
+              <wp:extent cx="6156000" cy="18034"/>
+              <wp:effectExtent l="12700" t="12700" r="29210" b="7620"/>
               <wp:wrapNone/>
               <wp:docPr id="9114" name="Group 9114"/>
               <wp:cNvGraphicFramePr/>
@@ -6528,7 +6814,7 @@
                     <wpg:grpSpPr>
                       <a:xfrm>
                         <a:off x="0" y="0"/>
-                        <a:ext cx="6839966" cy="18034"/>
+                        <a:ext cx="6156000" cy="18034"/>
                         <a:chOff x="0" y="0"/>
                         <a:chExt cx="6839966" cy="18034"/>
                       </a:xfrm>
@@ -6581,17 +6867,20 @@
                   </wpg:wgp>
                 </a:graphicData>
               </a:graphic>
+              <wp14:sizeRelH relativeFrom="margin">
+                <wp14:pctWidth>0</wp14:pctWidth>
+              </wp14:sizeRelH>
             </wp:anchor>
           </w:drawing>
         </mc:Choice>
         <mc:Fallback>
           <w:pict>
-            <v:group w14:anchorId="5647D0C0" id="Group 9114" o:spid="_x0000_s1026" style="position:absolute;margin-left:28.35pt;margin-top:49.65pt;width:538.6pt;height:1.4pt;z-index:251659264;mso-position-horizontal-relative:page;mso-position-vertical-relative:page" coordsize="68399,180" o:gfxdata="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">
+            <v:group w14:anchorId="4AD0F416" id="Group 9114" o:spid="_x0000_s1026" style="position:absolute;margin-left:0;margin-top:49.65pt;width:484.7pt;height:1.4pt;z-index:251659264;mso-position-horizontal:left;mso-position-horizontal-relative:margin;mso-position-vertical-relative:page;mso-width-relative:margin" coordsize="68399,180" o:gfxdata="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">
               <v:shape id="Shape 9115" o:spid="_x0000_s1027" style="position:absolute;width:68399;height:0;visibility:visible;mso-wrap-style:square;v-text-anchor:top" coordsize="6839966,0" o:gfxdata="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" path="m,l6839966,e" filled="f" strokecolor="#06c" strokeweight="1.42pt">
                 <v:stroke miterlimit="83231f" joinstyle="miter" endcap="square"/>
                 <v:path arrowok="t" textboxrect="0,0,6839966,0"/>
               </v:shape>
-              <w10:wrap anchorx="page" anchory="page"/>
+              <w10:wrap anchorx="margin" anchory="page"/>
             </v:group>
           </w:pict>
         </mc:Fallback>
@@ -6602,55 +6891,10 @@
         <w:b/>
         <w:color w:val="646464"/>
         <w:sz w:val="20"/>
-      </w:rPr>
-      <w:t xml:space="preserve">CE </w:t>
+        <w:lang w:val="en-US"/>
+      </w:rPr>
+      <w:t>CE 475 - Machine Learning Term Paper</w:t>
     </w:r>
-    <w:proofErr w:type="gramStart"/>
-    <w:r>
-      <w:rPr>
-        <w:b/>
-        <w:color w:val="646464"/>
-        <w:sz w:val="20"/>
-      </w:rPr>
-      <w:t>475 -</w:t>
-    </w:r>
-    <w:proofErr w:type="gramEnd"/>
-    <w:r>
-      <w:rPr>
-        <w:b/>
-        <w:color w:val="646464"/>
-        <w:sz w:val="20"/>
-      </w:rPr>
-      <w:t xml:space="preserve"> Machine Learning </w:t>
-    </w:r>
-    <w:proofErr w:type="spellStart"/>
-    <w:r>
-      <w:rPr>
-        <w:b/>
-        <w:color w:val="646464"/>
-        <w:sz w:val="20"/>
-      </w:rPr>
-      <w:t>Term</w:t>
-    </w:r>
-    <w:proofErr w:type="spellEnd"/>
-    <w:r>
-      <w:rPr>
-        <w:b/>
-        <w:color w:val="646464"/>
-        <w:sz w:val="20"/>
-      </w:rPr>
-      <w:t xml:space="preserve"> </w:t>
-    </w:r>
-    <w:proofErr w:type="spellStart"/>
-    <w:r>
-      <w:rPr>
-        <w:b/>
-        <w:color w:val="646464"/>
-        <w:sz w:val="20"/>
-      </w:rPr>
-      <w:t>Paper</w:t>
-    </w:r>
-    <w:proofErr w:type="spellEnd"/>
   </w:p>
 </w:hdr>
 </file>
@@ -7669,6 +7913,119 @@
     </w:lvl>
   </w:abstractNum>
   <w:abstractNum w:abstractNumId="4" w15:restartNumberingAfterBreak="0">
+    <w:nsid w:val="35B346CD"/>
+    <w:multiLevelType w:val="hybridMultilevel"/>
+    <w:tmpl w:val="DB609D72"/>
+    <w:lvl w:ilvl="0" w:tplc="041F0001">
+      <w:start w:val="1"/>
+      <w:numFmt w:val="bullet"/>
+      <w:lvlText w:val=""/>
+      <w:lvlJc w:val="left"/>
+      <w:pPr>
+        <w:ind w:left="1287" w:hanging="360"/>
+      </w:pPr>
+      <w:rPr>
+        <w:rFonts w:ascii="Symbol" w:hAnsi="Symbol" w:hint="default"/>
+      </w:rPr>
+    </w:lvl>
+    <w:lvl w:ilvl="1" w:tplc="041F0003" w:tentative="1">
+      <w:start w:val="1"/>
+      <w:numFmt w:val="bullet"/>
+      <w:lvlText w:val="o"/>
+      <w:lvlJc w:val="left"/>
+      <w:pPr>
+        <w:ind w:left="2007" w:hanging="360"/>
+      </w:pPr>
+      <w:rPr>
+        <w:rFonts w:ascii="Courier New" w:hAnsi="Courier New" w:cs="Courier New" w:hint="default"/>
+      </w:rPr>
+    </w:lvl>
+    <w:lvl w:ilvl="2" w:tplc="041F0005" w:tentative="1">
+      <w:start w:val="1"/>
+      <w:numFmt w:val="bullet"/>
+      <w:lvlText w:val=""/>
+      <w:lvlJc w:val="left"/>
+      <w:pPr>
+        <w:ind w:left="2727" w:hanging="360"/>
+      </w:pPr>
+      <w:rPr>
+        <w:rFonts w:ascii="Wingdings" w:hAnsi="Wingdings" w:hint="default"/>
+      </w:rPr>
+    </w:lvl>
+    <w:lvl w:ilvl="3" w:tplc="041F0001" w:tentative="1">
+      <w:start w:val="1"/>
+      <w:numFmt w:val="bullet"/>
+      <w:lvlText w:val=""/>
+      <w:lvlJc w:val="left"/>
+      <w:pPr>
+        <w:ind w:left="3447" w:hanging="360"/>
+      </w:pPr>
+      <w:rPr>
+        <w:rFonts w:ascii="Symbol" w:hAnsi="Symbol" w:hint="default"/>
+      </w:rPr>
+    </w:lvl>
+    <w:lvl w:ilvl="4" w:tplc="041F0003" w:tentative="1">
+      <w:start w:val="1"/>
+      <w:numFmt w:val="bullet"/>
+      <w:lvlText w:val="o"/>
+      <w:lvlJc w:val="left"/>
+      <w:pPr>
+        <w:ind w:left="4167" w:hanging="360"/>
+      </w:pPr>
+      <w:rPr>
+        <w:rFonts w:ascii="Courier New" w:hAnsi="Courier New" w:cs="Courier New" w:hint="default"/>
+      </w:rPr>
+    </w:lvl>
+    <w:lvl w:ilvl="5" w:tplc="041F0005" w:tentative="1">
+      <w:start w:val="1"/>
+      <w:numFmt w:val="bullet"/>
+      <w:lvlText w:val=""/>
+      <w:lvlJc w:val="left"/>
+      <w:pPr>
+        <w:ind w:left="4887" w:hanging="360"/>
+      </w:pPr>
+      <w:rPr>
+        <w:rFonts w:ascii="Wingdings" w:hAnsi="Wingdings" w:hint="default"/>
+      </w:rPr>
+    </w:lvl>
+    <w:lvl w:ilvl="6" w:tplc="041F0001" w:tentative="1">
+      <w:start w:val="1"/>
+      <w:numFmt w:val="bullet"/>
+      <w:lvlText w:val=""/>
+      <w:lvlJc w:val="left"/>
+      <w:pPr>
+        <w:ind w:left="5607" w:hanging="360"/>
+      </w:pPr>
+      <w:rPr>
+        <w:rFonts w:ascii="Symbol" w:hAnsi="Symbol" w:hint="default"/>
+      </w:rPr>
+    </w:lvl>
+    <w:lvl w:ilvl="7" w:tplc="041F0003" w:tentative="1">
+      <w:start w:val="1"/>
+      <w:numFmt w:val="bullet"/>
+      <w:lvlText w:val="o"/>
+      <w:lvlJc w:val="left"/>
+      <w:pPr>
+        <w:ind w:left="6327" w:hanging="360"/>
+      </w:pPr>
+      <w:rPr>
+        <w:rFonts w:ascii="Courier New" w:hAnsi="Courier New" w:cs="Courier New" w:hint="default"/>
+      </w:rPr>
+    </w:lvl>
+    <w:lvl w:ilvl="8" w:tplc="041F0005" w:tentative="1">
+      <w:start w:val="1"/>
+      <w:numFmt w:val="bullet"/>
+      <w:lvlText w:val=""/>
+      <w:lvlJc w:val="left"/>
+      <w:pPr>
+        <w:ind w:left="7047" w:hanging="360"/>
+      </w:pPr>
+      <w:rPr>
+        <w:rFonts w:ascii="Wingdings" w:hAnsi="Wingdings" w:hint="default"/>
+      </w:rPr>
+    </w:lvl>
+  </w:abstractNum>
+  <w:abstractNum w:abstractNumId="5" w15:restartNumberingAfterBreak="0">
     <w:nsid w:val="3D8E2B81"/>
     <w:multiLevelType w:val="multilevel"/>
     <w:tmpl w:val="59F6B284"/>
@@ -7891,7 +8248,7 @@
       </w:rPr>
     </w:lvl>
   </w:abstractNum>
-  <w:abstractNum w:abstractNumId="5" w15:restartNumberingAfterBreak="0">
+  <w:abstractNum w:abstractNumId="6" w15:restartNumberingAfterBreak="0">
     <w:nsid w:val="58CB2DEC"/>
     <w:multiLevelType w:val="hybridMultilevel"/>
     <w:tmpl w:val="C50CE618"/>
@@ -8103,7 +8460,7 @@
       </w:rPr>
     </w:lvl>
   </w:abstractNum>
-  <w:abstractNum w:abstractNumId="6" w15:restartNumberingAfterBreak="0">
+  <w:abstractNum w:abstractNumId="7" w15:restartNumberingAfterBreak="0">
     <w:nsid w:val="69A05C01"/>
     <w:multiLevelType w:val="hybridMultilevel"/>
     <w:tmpl w:val="DBA6EFDA"/>
@@ -8316,7 +8673,7 @@
     </w:lvl>
   </w:abstractNum>
   <w:num w:numId="1" w16cid:durableId="1177842285">
-    <w:abstractNumId w:val="6"/>
+    <w:abstractNumId w:val="7"/>
   </w:num>
   <w:num w:numId="2" w16cid:durableId="507141279">
     <w:abstractNumId w:val="3"/>
@@ -8328,12 +8685,15 @@
     <w:abstractNumId w:val="0"/>
   </w:num>
   <w:num w:numId="5" w16cid:durableId="1112089889">
-    <w:abstractNumId w:val="5"/>
+    <w:abstractNumId w:val="6"/>
   </w:num>
   <w:num w:numId="6" w16cid:durableId="632103720">
     <w:abstractNumId w:val="2"/>
   </w:num>
   <w:num w:numId="7" w16cid:durableId="747074590">
+    <w:abstractNumId w:val="5"/>
+  </w:num>
+  <w:num w:numId="8" w16cid:durableId="1675038141">
     <w:abstractNumId w:val="4"/>
   </w:num>
 </w:numbering>
@@ -8859,6 +9219,17 @@
       </w:tblCellMar>
     </w:tblPr>
   </w:style>
+  <w:style w:type="paragraph" w:styleId="ListeParagraf">
+    <w:name w:val="List Paragraph"/>
+    <w:basedOn w:val="Normal"/>
+    <w:uiPriority w:val="34"/>
+    <w:qFormat/>
+    <w:rsid w:val="007624CB"/>
+    <w:pPr>
+      <w:ind w:left="720"/>
+      <w:contextualSpacing/>
+    </w:pPr>
+  </w:style>
 </w:styles>
 </file>
 
@@ -9175,4 +9546,16 @@
     </a:ext>
   </a:extLst>
 </a:theme>
+</file>
+
+<file path=customXml/item1.xml><?xml version="1.0" encoding="utf-8"?>
+<b:Sources xmlns:b="http://schemas.openxmlformats.org/officeDocument/2006/bibliography" xmlns="http://schemas.openxmlformats.org/officeDocument/2006/bibliography" SelectedStyle="/APASixthEditionOfficeOnline.xsl" StyleName="APA" Version="6"/>
+</file>
+
+<file path=customXml/itemProps1.xml><?xml version="1.0" encoding="utf-8"?>
+<ds:datastoreItem xmlns:ds="http://schemas.openxmlformats.org/officeDocument/2006/customXml" ds:itemID="{B1B875BB-2B70-0B45-A2B4-541FDD7AAD89}">
+  <ds:schemaRefs>
+    <ds:schemaRef ds:uri="http://schemas.openxmlformats.org/officeDocument/2006/bibliography"/>
+  </ds:schemaRefs>
+</ds:datastoreItem>
 </file>
</xml_diff>

<commit_message>
feat(regression): fix severe target outlier distortion using target transformation
- Replaced StandardScaler with RobustScaler to handle heavy input feature distribution.
- Wrapped all models in TransformedTargetRegressor using symmetric log/exp functions (symlog) to natively support negative target values and mitigate extreme outlier skewing.
- Refactored model initialization in evaluation loops using sklearn.base.clone to prevent parameter validation errors.
- Improved model performance from negative R² to positive (~0.39) using Gradient Boosting and XGBoost.
</commit_message>
<xml_diff>
--- a/CE475_Term_Paper.docx
+++ b/CE475_Term_Paper.docx
@@ -36,7 +36,15 @@
           <w:sz w:val="32"/>
           <w:lang w:val="en-US"/>
         </w:rPr>
-        <w:t>CE 475 Term Paper</w:t>
+        <w:t xml:space="preserve">CE 475 </w:t>
+      </w:r>
+      <w:r>
+        <w:rPr>
+          <w:color w:val="505050"/>
+          <w:sz w:val="32"/>
+          <w:lang w:val="en-US"/>
+        </w:rPr>
+        <w:t>Project Report</w:t>
       </w:r>
     </w:p>
     <w:p>
@@ -146,17 +154,118 @@
         <w:ind w:left="3060" w:right="3061" w:firstLine="0"/>
         <w:jc w:val="center"/>
         <w:rPr>
-          <w:lang w:val="en-US"/>
-        </w:rPr>
-      </w:pPr>
-      <w:r>
-        <w:rPr>
           <w:color w:val="3C3C3C"/>
           <w:sz w:val="26"/>
           <w:lang w:val="en-US"/>
         </w:rPr>
-        <w:t>Prediction of Target Variable Y from Six Independent Features (X1-X6)</w:t>
-      </w:r>
+      </w:pPr>
+      <w:r>
+        <w:rPr>
+          <w:color w:val="3C3C3C"/>
+          <w:sz w:val="26"/>
+          <w:lang w:val="en-US"/>
+        </w:rPr>
+        <w:t xml:space="preserve">Prediction of Target Variable Y from Six Independent Features </w:t>
+      </w:r>
+    </w:p>
+    <w:p>
+      <w:pPr>
+        <w:spacing w:after="0" w:line="365" w:lineRule="auto"/>
+        <w:ind w:left="3062" w:right="3062" w:firstLine="0"/>
+        <w:jc w:val="center"/>
+        <w:rPr>
+          <w:color w:val="3C3C3C"/>
+          <w:sz w:val="26"/>
+          <w:lang w:val="en-US"/>
+        </w:rPr>
+      </w:pPr>
+      <w:r>
+        <w:rPr>
+          <w:color w:val="3C3C3C"/>
+          <w:sz w:val="26"/>
+          <w:lang w:val="en-US"/>
+        </w:rPr>
+        <w:t>Demir Cücü</w:t>
+      </w:r>
+    </w:p>
+    <w:p>
+      <w:pPr>
+        <w:spacing w:after="0" w:line="365" w:lineRule="auto"/>
+        <w:ind w:left="3062" w:right="3062" w:firstLine="0"/>
+        <w:jc w:val="center"/>
+        <w:rPr>
+          <w:color w:val="3C3C3C"/>
+          <w:sz w:val="26"/>
+          <w:lang w:val="en-US"/>
+        </w:rPr>
+      </w:pPr>
+      <w:r>
+        <w:rPr>
+          <w:color w:val="3C3C3C"/>
+          <w:sz w:val="26"/>
+          <w:lang w:val="en-US"/>
+        </w:rPr>
+        <w:t>20220602018</w:t>
+      </w:r>
+    </w:p>
+    <w:p>
+      <w:pPr>
+        <w:spacing w:after="844" w:line="364" w:lineRule="auto"/>
+        <w:ind w:left="3060" w:right="3061" w:firstLine="0"/>
+        <w:jc w:val="center"/>
+        <w:rPr>
+          <w:color w:val="3C3C3C"/>
+          <w:sz w:val="26"/>
+          <w:lang w:val="en-US"/>
+        </w:rPr>
+      </w:pPr>
+    </w:p>
+    <w:p>
+      <w:pPr>
+        <w:spacing w:after="844" w:line="364" w:lineRule="auto"/>
+        <w:ind w:left="3060" w:right="3061" w:firstLine="0"/>
+        <w:jc w:val="center"/>
+        <w:rPr>
+          <w:color w:val="3C3C3C"/>
+          <w:sz w:val="26"/>
+          <w:lang w:val="en-US"/>
+        </w:rPr>
+      </w:pPr>
+    </w:p>
+    <w:p>
+      <w:pPr>
+        <w:spacing w:after="844" w:line="364" w:lineRule="auto"/>
+        <w:ind w:left="3060" w:right="3061" w:firstLine="0"/>
+        <w:jc w:val="center"/>
+        <w:rPr>
+          <w:color w:val="3C3C3C"/>
+          <w:sz w:val="26"/>
+          <w:lang w:val="en-US"/>
+        </w:rPr>
+      </w:pPr>
+    </w:p>
+    <w:p>
+      <w:pPr>
+        <w:spacing w:after="844" w:line="364" w:lineRule="auto"/>
+        <w:ind w:left="3060" w:right="3061" w:firstLine="0"/>
+        <w:jc w:val="center"/>
+        <w:rPr>
+          <w:color w:val="3C3C3C"/>
+          <w:sz w:val="26"/>
+          <w:lang w:val="en-US"/>
+        </w:rPr>
+      </w:pPr>
+    </w:p>
+    <w:p>
+      <w:pPr>
+        <w:spacing w:after="844" w:line="364" w:lineRule="auto"/>
+        <w:ind w:left="0" w:right="3061" w:firstLine="0"/>
+        <w:rPr>
+          <w:color w:val="3C3C3C"/>
+          <w:sz w:val="26"/>
+          <w:lang w:val="en-US"/>
+        </w:rPr>
+      </w:pPr>
     </w:p>
     <w:p>
       <w:pPr>
@@ -164,22 +273,48 @@
         <w:ind w:left="0" w:firstLine="0"/>
         <w:jc w:val="center"/>
         <w:rPr>
-          <w:lang w:val="en-US"/>
-        </w:rPr>
-      </w:pPr>
-      <w:r>
-        <w:rPr>
           <w:i/>
           <w:color w:val="646464"/>
           <w:sz w:val="24"/>
           <w:lang w:val="en-US"/>
         </w:rPr>
+      </w:pPr>
+      <w:r>
+        <w:rPr>
+          <w:i/>
+          <w:color w:val="646464"/>
+          <w:sz w:val="24"/>
+          <w:lang w:val="en-US"/>
+        </w:rPr>
+        <w:t xml:space="preserve">20 </w:t>
+      </w:r>
+      <w:r>
+        <w:rPr>
+          <w:i/>
+          <w:color w:val="646464"/>
+          <w:sz w:val="24"/>
+          <w:lang w:val="en-US"/>
+        </w:rPr>
         <w:t>May 2026</w:t>
       </w:r>
     </w:p>
     <w:p>
       <w:pPr>
+        <w:spacing w:after="0" w:line="259" w:lineRule="auto"/>
+        <w:ind w:left="0" w:firstLine="0"/>
+        <w:jc w:val="center"/>
+        <w:rPr>
+          <w:iCs/>
+          <w:color w:val="646464"/>
+          <w:sz w:val="24"/>
+          <w:lang w:val="en-US"/>
+        </w:rPr>
+      </w:pPr>
+    </w:p>
+    <w:p>
+      <w:pPr>
         <w:pStyle w:val="Balk1"/>
+        <w:spacing w:line="276" w:lineRule="auto"/>
         <w:ind w:left="341" w:hanging="356"/>
         <w:rPr>
           <w:lang w:val="en-US"/>
@@ -189,12 +324,13 @@
         <w:rPr>
           <w:lang w:val="en-US"/>
         </w:rPr>
+        <w:lastRenderedPageBreak/>
         <w:t>Methodology</w:t>
       </w:r>
     </w:p>
     <w:p>
       <w:pPr>
-        <w:spacing w:after="418" w:line="259" w:lineRule="auto"/>
+        <w:spacing w:after="418" w:line="276" w:lineRule="auto"/>
         <w:ind w:left="-57" w:right="-35" w:firstLine="0"/>
         <w:jc w:val="left"/>
         <w:rPr>
@@ -295,7 +431,7 @@
     </w:p>
     <w:p>
       <w:pPr>
-        <w:spacing w:after="170"/>
+        <w:spacing w:after="170" w:line="276" w:lineRule="auto"/>
         <w:ind w:left="-5"/>
         <w:rPr>
           <w:lang w:val="en-US"/>
@@ -322,7 +458,7 @@
     </w:p>
     <w:p>
       <w:pPr>
-        <w:spacing w:after="295"/>
+        <w:spacing w:after="295" w:line="276" w:lineRule="auto"/>
         <w:ind w:left="-5"/>
         <w:rPr>
           <w:lang w:val="en-US"/>
@@ -385,52 +521,8 @@
     </w:p>
     <w:p>
       <w:pPr>
-        <w:spacing w:after="295"/>
-        <w:ind w:left="-5"/>
-        <w:rPr>
-          <w:lang w:val="en-US"/>
-        </w:rPr>
-      </w:pPr>
-    </w:p>
-    <w:p>
-      <w:pPr>
-        <w:spacing w:after="295"/>
-        <w:ind w:left="-5"/>
-        <w:rPr>
-          <w:lang w:val="en-US"/>
-        </w:rPr>
-      </w:pPr>
-    </w:p>
-    <w:p>
-      <w:pPr>
-        <w:spacing w:after="295"/>
-        <w:ind w:left="-5"/>
-        <w:rPr>
-          <w:lang w:val="en-US"/>
-        </w:rPr>
-      </w:pPr>
-    </w:p>
-    <w:p>
-      <w:pPr>
-        <w:spacing w:after="295"/>
-        <w:ind w:left="-5"/>
-        <w:rPr>
-          <w:lang w:val="en-US"/>
-        </w:rPr>
-      </w:pPr>
-    </w:p>
-    <w:p>
-      <w:pPr>
-        <w:spacing w:after="295"/>
-        <w:ind w:left="-5"/>
-        <w:rPr>
-          <w:lang w:val="en-US"/>
-        </w:rPr>
-      </w:pPr>
-    </w:p>
-    <w:p>
-      <w:pPr>
         <w:pStyle w:val="Balk2"/>
+        <w:spacing w:line="276" w:lineRule="auto"/>
         <w:ind w:left="419" w:hanging="434"/>
         <w:rPr>
           <w:lang w:val="en-US"/>
@@ -440,13 +532,12 @@
         <w:rPr>
           <w:lang w:val="en-US"/>
         </w:rPr>
-        <w:lastRenderedPageBreak/>
         <w:t>Models Attempted</w:t>
       </w:r>
     </w:p>
     <w:p>
       <w:pPr>
-        <w:spacing w:after="0" w:line="259" w:lineRule="auto"/>
+        <w:spacing w:after="0" w:line="276" w:lineRule="auto"/>
         <w:ind w:left="-5"/>
         <w:rPr>
           <w:lang w:val="en-US"/>
@@ -884,7 +975,6 @@
                 <w:lang w:val="en-US"/>
               </w:rPr>
             </w:pPr>
-            <w:proofErr w:type="spellStart"/>
             <w:r>
               <w:rPr>
                 <w:sz w:val="18"/>
@@ -892,7 +982,6 @@
               </w:rPr>
               <w:t>ElasticNet</w:t>
             </w:r>
-            <w:proofErr w:type="spellEnd"/>
           </w:p>
         </w:tc>
         <w:tc>
@@ -1511,7 +1600,6 @@
                 <w:lang w:val="en-US"/>
               </w:rPr>
             </w:pPr>
-            <w:proofErr w:type="spellStart"/>
             <w:r>
               <w:rPr>
                 <w:sz w:val="18"/>
@@ -1519,7 +1607,6 @@
               </w:rPr>
               <w:t>XGBoost</w:t>
             </w:r>
-            <w:proofErr w:type="spellEnd"/>
           </w:p>
         </w:tc>
         <w:tc>
@@ -1621,7 +1708,7 @@
           <w:ilvl w:val="0"/>
           <w:numId w:val="0"/>
         </w:numPr>
-        <w:ind w:left="10" w:hanging="10"/>
+        <w:spacing w:line="276" w:lineRule="auto"/>
         <w:rPr>
           <w:lang w:val="en-US"/>
         </w:rPr>
@@ -1630,6 +1717,7 @@
     <w:p>
       <w:pPr>
         <w:pStyle w:val="Balk2"/>
+        <w:spacing w:line="276" w:lineRule="auto"/>
         <w:ind w:left="419" w:hanging="434"/>
         <w:rPr>
           <w:lang w:val="en-US"/>
@@ -1644,7 +1732,7 @@
     </w:p>
     <w:p>
       <w:pPr>
-        <w:spacing w:after="259" w:line="259" w:lineRule="auto"/>
+        <w:spacing w:after="259" w:line="276" w:lineRule="auto"/>
         <w:ind w:left="-5"/>
         <w:rPr>
           <w:lang w:val="en-US"/>
@@ -1663,7 +1751,7 @@
           <w:ilvl w:val="0"/>
           <w:numId w:val="8"/>
         </w:numPr>
-        <w:spacing w:after="75" w:line="259" w:lineRule="auto"/>
+        <w:spacing w:after="75" w:line="276" w:lineRule="auto"/>
         <w:ind w:left="851" w:hanging="284"/>
         <w:rPr>
           <w:lang w:val="en-US"/>
@@ -1683,7 +1771,7 @@
           <w:ilvl w:val="0"/>
           <w:numId w:val="8"/>
         </w:numPr>
-        <w:spacing w:after="124" w:line="259" w:lineRule="auto"/>
+        <w:spacing w:after="124" w:line="276" w:lineRule="auto"/>
         <w:ind w:left="851" w:hanging="284"/>
         <w:rPr>
           <w:lang w:val="en-US"/>
@@ -1702,6 +1790,7 @@
           <w:ilvl w:val="0"/>
           <w:numId w:val="8"/>
         </w:numPr>
+        <w:spacing w:line="276" w:lineRule="auto"/>
         <w:ind w:left="851" w:hanging="284"/>
         <w:rPr>
           <w:lang w:val="en-US"/>
@@ -1744,6 +1833,7 @@
           <w:ilvl w:val="0"/>
           <w:numId w:val="8"/>
         </w:numPr>
+        <w:spacing w:line="276" w:lineRule="auto"/>
         <w:ind w:left="851" w:hanging="284"/>
         <w:rPr>
           <w:lang w:val="en-US"/>
@@ -1770,6 +1860,7 @@
     </w:p>
     <w:p>
       <w:pPr>
+        <w:spacing w:line="276" w:lineRule="auto"/>
         <w:ind w:left="-5"/>
         <w:rPr>
           <w:lang w:val="en-US"/>
@@ -1779,105 +1870,15 @@
         <w:rPr>
           <w:lang w:val="en-US"/>
         </w:rPr>
-        <w:t xml:space="preserve">Given these observations, the model selection emphasized non-linear and ensemble methods (Random Forest, Gradient Boosting, </w:t>
-      </w:r>
-      <w:proofErr w:type="spellStart"/>
-      <w:r>
-        <w:rPr>
-          <w:lang w:val="en-US"/>
-        </w:rPr>
-        <w:t>XGBoost</w:t>
-      </w:r>
-      <w:proofErr w:type="spellEnd"/>
-      <w:r>
-        <w:rPr>
-          <w:lang w:val="en-US"/>
-        </w:rPr>
-        <w:t xml:space="preserve">, SVR) while retaining linear baselines (Ridge, Lasso, </w:t>
-      </w:r>
-      <w:proofErr w:type="spellStart"/>
-      <w:r>
-        <w:rPr>
-          <w:lang w:val="en-US"/>
-        </w:rPr>
-        <w:t>ElasticNet</w:t>
-      </w:r>
-      <w:proofErr w:type="spellEnd"/>
-      <w:r>
-        <w:rPr>
-          <w:lang w:val="en-US"/>
-        </w:rPr>
-        <w:t>) for comparison. Polynomial feature engineering (degree 2) was applied to linear models to enable them to capture interaction effects.</w:t>
-      </w:r>
-    </w:p>
-    <w:p>
-      <w:pPr>
-        <w:ind w:left="-5"/>
-        <w:rPr>
-          <w:lang w:val="en-US"/>
-        </w:rPr>
-      </w:pPr>
-    </w:p>
-    <w:p>
-      <w:pPr>
-        <w:ind w:left="-5"/>
-        <w:rPr>
-          <w:lang w:val="en-US"/>
-        </w:rPr>
-      </w:pPr>
-    </w:p>
-    <w:p>
-      <w:pPr>
-        <w:ind w:left="-5"/>
-        <w:rPr>
-          <w:lang w:val="en-US"/>
-        </w:rPr>
-      </w:pPr>
-    </w:p>
-    <w:p>
-      <w:pPr>
-        <w:ind w:left="-5"/>
-        <w:rPr>
-          <w:lang w:val="en-US"/>
-        </w:rPr>
-      </w:pPr>
-    </w:p>
-    <w:p>
-      <w:pPr>
-        <w:ind w:left="-5"/>
-        <w:rPr>
-          <w:lang w:val="en-US"/>
-        </w:rPr>
-      </w:pPr>
-    </w:p>
-    <w:p>
-      <w:pPr>
-        <w:ind w:left="-5"/>
-        <w:rPr>
-          <w:lang w:val="en-US"/>
-        </w:rPr>
-      </w:pPr>
-    </w:p>
-    <w:p>
-      <w:pPr>
-        <w:ind w:left="-5"/>
-        <w:rPr>
-          <w:lang w:val="en-US"/>
-        </w:rPr>
-      </w:pPr>
-    </w:p>
-    <w:p>
-      <w:pPr>
-        <w:ind w:left="-5"/>
-        <w:rPr>
-          <w:lang w:val="en-US"/>
-        </w:rPr>
-      </w:pPr>
+        <w:t>Given these observations, the model selection emphasized non-linear and ensemble methods (Random Forest, Gradient Boosting, XGBoost, SVR) while retaining linear baselines (Ridge, Lasso, ElasticNet) for comparison. Polynomial feature engineering (degree 2) was applied to linear models to enable them to capture interaction effects.</w:t>
+      </w:r>
     </w:p>
     <w:p>
       <w:pPr>
         <w:pStyle w:val="Balk1"/>
+        <w:spacing w:line="276" w:lineRule="auto"/>
         <w:ind w:left="341" w:hanging="356"/>
+        <w:jc w:val="both"/>
         <w:rPr>
           <w:lang w:val="en-US"/>
         </w:rPr>
@@ -1892,9 +1893,8 @@
     </w:p>
     <w:p>
       <w:pPr>
-        <w:spacing w:after="515" w:line="259" w:lineRule="auto"/>
+        <w:spacing w:after="515" w:line="276" w:lineRule="auto"/>
         <w:ind w:left="-57" w:right="-56" w:firstLine="0"/>
-        <w:jc w:val="left"/>
         <w:rPr>
           <w:lang w:val="en-US"/>
         </w:rPr>
@@ -1994,7 +1994,9 @@
     <w:p>
       <w:pPr>
         <w:pStyle w:val="Balk2"/>
+        <w:spacing w:line="276" w:lineRule="auto"/>
         <w:ind w:left="419" w:hanging="434"/>
+        <w:jc w:val="both"/>
         <w:rPr>
           <w:lang w:val="en-US"/>
         </w:rPr>
@@ -2008,7 +2010,7 @@
     </w:p>
     <w:p>
       <w:pPr>
-        <w:spacing w:after="0" w:line="259" w:lineRule="auto"/>
+        <w:spacing w:after="0" w:line="276" w:lineRule="auto"/>
         <w:ind w:left="-5"/>
         <w:rPr>
           <w:lang w:val="en-US"/>
@@ -2541,7 +2543,6 @@
                 <w:lang w:val="en-US"/>
               </w:rPr>
             </w:pPr>
-            <w:proofErr w:type="spellStart"/>
             <w:r>
               <w:rPr>
                 <w:sz w:val="18"/>
@@ -2549,7 +2550,6 @@
               </w:rPr>
               <w:t>XGBoost</w:t>
             </w:r>
-            <w:proofErr w:type="spellEnd"/>
           </w:p>
         </w:tc>
         <w:tc>
@@ -2827,7 +2827,6 @@
                 <w:lang w:val="en-US"/>
               </w:rPr>
             </w:pPr>
-            <w:proofErr w:type="spellStart"/>
             <w:r>
               <w:rPr>
                 <w:sz w:val="18"/>
@@ -2835,7 +2834,6 @@
               </w:rPr>
               <w:t>openpyxl</w:t>
             </w:r>
-            <w:proofErr w:type="spellEnd"/>
           </w:p>
         </w:tc>
         <w:tc>
@@ -2902,217 +2900,194 @@
     <w:p>
       <w:pPr>
         <w:pStyle w:val="Balk2"/>
-        <w:ind w:left="419" w:hanging="434"/>
-        <w:rPr>
-          <w:lang w:val="en-US"/>
-        </w:rPr>
-      </w:pPr>
-      <w:r>
-        <w:rPr>
-          <w:lang w:val="en-US"/>
-        </w:rPr>
-        <w:t>Data Preprocessing Strategy</w:t>
-      </w:r>
-    </w:p>
-    <w:p>
-      <w:pPr>
-        <w:spacing w:after="170"/>
-        <w:ind w:left="-5"/>
-        <w:rPr>
-          <w:lang w:val="en-US"/>
-        </w:rPr>
-      </w:pPr>
-      <w:r>
-        <w:rPr>
-          <w:lang w:val="en-US"/>
-        </w:rPr>
-        <w:t>The preprocessing pipeline consisted of two sequential stages, each carefully designed to address specific data characteristics:</w:t>
-      </w:r>
-    </w:p>
-    <w:p>
-      <w:pPr>
-        <w:spacing w:after="170"/>
-        <w:ind w:left="-5"/>
-        <w:rPr>
-          <w:lang w:val="en-US"/>
-        </w:rPr>
-      </w:pPr>
-      <w:r>
-        <w:rPr>
-          <w:lang w:val="en-US"/>
-        </w:rPr>
-        <w:t>Stage 1 - Standard Scaling: All six features were standardized to zero mean and unit variance using scikit-</w:t>
-      </w:r>
-      <w:proofErr w:type="spellStart"/>
-      <w:r>
-        <w:rPr>
-          <w:lang w:val="en-US"/>
-        </w:rPr>
-        <w:t>learn's</w:t>
-      </w:r>
-      <w:proofErr w:type="spellEnd"/>
-      <w:r>
-        <w:rPr>
-          <w:lang w:val="en-US"/>
-        </w:rPr>
-        <w:t xml:space="preserve"> </w:t>
-      </w:r>
-      <w:proofErr w:type="spellStart"/>
-      <w:r>
-        <w:rPr>
-          <w:lang w:val="en-US"/>
-        </w:rPr>
-        <w:t>StandardScaler</w:t>
-      </w:r>
-      <w:proofErr w:type="spellEnd"/>
-      <w:r>
-        <w:rPr>
-          <w:lang w:val="en-US"/>
-        </w:rPr>
-        <w:t>. This is essential for distance-based models (KNN, SVR) and gradient</w:t>
-      </w:r>
-      <w:r>
-        <w:rPr>
-          <w:lang w:val="en-US"/>
-        </w:rPr>
-        <w:t xml:space="preserve"> </w:t>
-      </w:r>
-      <w:r>
-        <w:rPr>
-          <w:lang w:val="en-US"/>
-        </w:rPr>
-        <w:t>based optimizers. The scaler was fitted exclusively on training data and then applied to test data to prevent data leakage.</w:t>
-      </w:r>
-    </w:p>
-    <w:p>
-      <w:pPr>
-        <w:spacing w:after="295"/>
-        <w:ind w:left="-5"/>
-        <w:rPr>
-          <w:lang w:val="en-US"/>
-        </w:rPr>
-      </w:pPr>
-      <w:r>
-        <w:rPr>
-          <w:lang w:val="en-US"/>
-        </w:rPr>
-        <w:t xml:space="preserve">Stage 2 - Polynomial Feature Engineering: For linear models (Ridge, Lasso, </w:t>
-      </w:r>
-      <w:proofErr w:type="spellStart"/>
-      <w:r>
-        <w:rPr>
-          <w:lang w:val="en-US"/>
-        </w:rPr>
-        <w:t>ElasticNet</w:t>
-      </w:r>
-      <w:proofErr w:type="spellEnd"/>
-      <w:r>
-        <w:rPr>
-          <w:lang w:val="en-US"/>
-        </w:rPr>
-        <w:t>), degree</w:t>
-      </w:r>
-      <w:r>
-        <w:rPr>
-          <w:lang w:val="en-US"/>
-        </w:rPr>
-        <w:t xml:space="preserve"> </w:t>
-      </w:r>
-      <w:r>
-        <w:rPr>
-          <w:lang w:val="en-US"/>
-        </w:rPr>
-        <w:t>2 polynomial features were generated, expanding the feature space from 6 to 27 dimensions. This includes all pairwise interactions (e.g., X1*X2) and squared terms (e.g., X1^2), enabling linear models to capture non-linear relationships without changing their fundamental architecture.</w:t>
-      </w:r>
-    </w:p>
-    <w:p>
-      <w:pPr>
-        <w:pStyle w:val="Balk2"/>
-        <w:ind w:left="419" w:hanging="434"/>
-        <w:rPr>
-          <w:lang w:val="en-US"/>
-        </w:rPr>
-      </w:pPr>
-      <w:r>
-        <w:rPr>
-          <w:lang w:val="en-US"/>
-        </w:rPr>
-        <w:t>Evaluation Strategy</w:t>
-      </w:r>
-    </w:p>
-    <w:p>
-      <w:pPr>
-        <w:spacing w:after="192"/>
-        <w:ind w:left="-5"/>
-        <w:rPr>
-          <w:lang w:val="en-US"/>
-        </w:rPr>
-      </w:pPr>
-      <w:r>
-        <w:rPr>
-          <w:lang w:val="en-US"/>
-        </w:rPr>
-        <w:t>A rigorous 5-fold cross</w:t>
-      </w:r>
-      <w:r>
-        <w:rPr>
-          <w:lang w:val="en-US"/>
-        </w:rPr>
-        <w:t xml:space="preserve"> </w:t>
-      </w:r>
-      <w:r>
-        <w:rPr>
-          <w:lang w:val="en-US"/>
-        </w:rPr>
-        <w:t>validation (CV) scheme was employed as the primary evaluation method. The training data (100 samples) was split into 5 folds, with each fold serving as the validation set once. Three metrics were computed for each model:</w:t>
-      </w:r>
-    </w:p>
-    <w:p>
-      <w:pPr>
         <w:numPr>
           <w:ilvl w:val="0"/>
-          <w:numId w:val="2"/>
+          <w:numId w:val="0"/>
         </w:numPr>
-        <w:spacing w:after="153" w:line="259" w:lineRule="auto"/>
-        <w:ind w:left="567" w:firstLine="0"/>
-        <w:rPr>
-          <w:lang w:val="en-US"/>
-        </w:rPr>
-      </w:pPr>
-      <w:r>
-        <w:rPr>
-          <w:lang w:val="en-US"/>
-        </w:rPr>
-        <w:t>Mean Absolute Error (MAE): Average absolute deviation of predictions from actual values.</w:t>
-      </w:r>
-    </w:p>
-    <w:p>
-      <w:pPr>
+        <w:spacing w:line="276" w:lineRule="auto"/>
+        <w:ind w:left="10" w:hanging="10"/>
+        <w:rPr>
+          <w:lang w:val="en-US"/>
+        </w:rPr>
+      </w:pPr>
+    </w:p>
+    <w:p>
+      <w:pPr>
+        <w:pStyle w:val="Balk2"/>
+        <w:spacing w:line="276" w:lineRule="auto"/>
+        <w:ind w:left="419" w:hanging="434"/>
+        <w:rPr>
+          <w:lang w:val="en-US"/>
+        </w:rPr>
+      </w:pPr>
+      <w:r>
+        <w:rPr>
+          <w:lang w:val="en-US"/>
+        </w:rPr>
+        <w:t>Data Preprocessing Strategy</w:t>
+      </w:r>
+    </w:p>
+    <w:p>
+      <w:pPr>
+        <w:spacing w:after="170" w:line="276" w:lineRule="auto"/>
+        <w:ind w:left="-5"/>
+        <w:rPr>
+          <w:lang w:val="en-US"/>
+        </w:rPr>
+      </w:pPr>
+      <w:r>
+        <w:rPr>
+          <w:lang w:val="en-US"/>
+        </w:rPr>
+        <w:t>The preprocessing pipeline consisted of two sequential stages, each carefully designed to address specific data characteristics:</w:t>
+      </w:r>
+    </w:p>
+    <w:p>
+      <w:pPr>
+        <w:spacing w:after="170" w:line="276" w:lineRule="auto"/>
+        <w:ind w:left="-5"/>
+        <w:rPr>
+          <w:lang w:val="en-US"/>
+        </w:rPr>
+      </w:pPr>
+      <w:r>
+        <w:rPr>
+          <w:lang w:val="en-US"/>
+        </w:rPr>
+        <w:t>Stage 1 - Standard Scaling: All six features were standardized to zero mean and unit variance using scikit-learn's StandardScaler. This is essential for distance-based models (KNN, SVR) and gradient</w:t>
+      </w:r>
+      <w:r>
+        <w:rPr>
+          <w:lang w:val="en-US"/>
+        </w:rPr>
+        <w:t xml:space="preserve"> </w:t>
+      </w:r>
+      <w:r>
+        <w:rPr>
+          <w:lang w:val="en-US"/>
+        </w:rPr>
+        <w:t>based optimizers. The scaler was fitted exclusively on training data and then applied to test data to prevent data leakage.</w:t>
+      </w:r>
+    </w:p>
+    <w:p>
+      <w:pPr>
+        <w:spacing w:after="295" w:line="276" w:lineRule="auto"/>
+        <w:ind w:left="-5"/>
+        <w:rPr>
+          <w:lang w:val="en-US"/>
+        </w:rPr>
+      </w:pPr>
+      <w:r>
+        <w:rPr>
+          <w:lang w:val="en-US"/>
+        </w:rPr>
+        <w:t>Stage 2 - Polynomial Feature Engineering: For linear models (Ridge, Lasso, ElasticNet), degree</w:t>
+      </w:r>
+      <w:r>
+        <w:rPr>
+          <w:lang w:val="en-US"/>
+        </w:rPr>
+        <w:t xml:space="preserve"> </w:t>
+      </w:r>
+      <w:r>
+        <w:rPr>
+          <w:lang w:val="en-US"/>
+        </w:rPr>
+        <w:t>2 polynomial features were generated, expanding the feature space from 6 to 27 dimensions. This includes all pairwise interactions (e.g., X1*X2) and squared terms (e.g., X1^2), enabling linear models to capture non-linear relationships without changing their fundamental architecture.</w:t>
+      </w:r>
+    </w:p>
+    <w:p>
+      <w:pPr>
+        <w:pStyle w:val="Balk2"/>
+        <w:spacing w:line="276" w:lineRule="auto"/>
+        <w:ind w:left="419" w:hanging="434"/>
+        <w:rPr>
+          <w:lang w:val="en-US"/>
+        </w:rPr>
+      </w:pPr>
+      <w:r>
+        <w:rPr>
+          <w:lang w:val="en-US"/>
+        </w:rPr>
+        <w:t>Evaluation Strategy</w:t>
+      </w:r>
+    </w:p>
+    <w:p>
+      <w:pPr>
+        <w:spacing w:after="192" w:line="276" w:lineRule="auto"/>
+        <w:ind w:left="-5"/>
+        <w:rPr>
+          <w:lang w:val="en-US"/>
+        </w:rPr>
+      </w:pPr>
+      <w:r>
+        <w:rPr>
+          <w:lang w:val="en-US"/>
+        </w:rPr>
+        <w:t>A rigorous 5-fold cross</w:t>
+      </w:r>
+      <w:r>
+        <w:rPr>
+          <w:lang w:val="en-US"/>
+        </w:rPr>
+        <w:t xml:space="preserve"> </w:t>
+      </w:r>
+      <w:r>
+        <w:rPr>
+          <w:lang w:val="en-US"/>
+        </w:rPr>
+        <w:t>validation (CV) scheme was employed as the primary evaluation method. The training data (100 samples) was split into 5 folds, with each fold serving as the validation set once. Three metrics were computed for each model:</w:t>
+      </w:r>
+    </w:p>
+    <w:p>
+      <w:pPr>
+        <w:pStyle w:val="ListeParagraf"/>
         <w:numPr>
           <w:ilvl w:val="0"/>
-          <w:numId w:val="2"/>
+          <w:numId w:val="9"/>
         </w:numPr>
-        <w:spacing w:after="153" w:line="259" w:lineRule="auto"/>
-        <w:ind w:left="567" w:firstLine="0"/>
-        <w:rPr>
-          <w:lang w:val="en-US"/>
-        </w:rPr>
-      </w:pPr>
-      <w:r>
-        <w:rPr>
-          <w:lang w:val="en-US"/>
-        </w:rPr>
-        <w:t>Root Mean Squared Error (RMSE): Penalizes larger errors more heavily than MAE.</w:t>
-      </w:r>
-    </w:p>
-    <w:p>
-      <w:pPr>
+        <w:spacing w:after="153" w:line="276" w:lineRule="auto"/>
+        <w:ind w:left="851" w:hanging="284"/>
+        <w:rPr>
+          <w:lang w:val="en-US"/>
+        </w:rPr>
+      </w:pPr>
+      <w:r>
+        <w:rPr>
+          <w:lang w:val="en-US"/>
+        </w:rPr>
+        <w:t>Mean Absolute Error (MAE): Average absolute deviation of predictions from actual values.</w:t>
+      </w:r>
+    </w:p>
+    <w:p>
+      <w:pPr>
+        <w:pStyle w:val="ListeParagraf"/>
         <w:numPr>
           <w:ilvl w:val="0"/>
-          <w:numId w:val="2"/>
+          <w:numId w:val="9"/>
         </w:numPr>
-        <w:spacing w:after="132" w:line="259" w:lineRule="auto"/>
-        <w:ind w:left="567" w:firstLine="0"/>
+        <w:spacing w:after="153" w:line="276" w:lineRule="auto"/>
+        <w:ind w:left="851" w:hanging="284"/>
+        <w:rPr>
+          <w:lang w:val="en-US"/>
+        </w:rPr>
+      </w:pPr>
+      <w:r>
+        <w:rPr>
+          <w:lang w:val="en-US"/>
+        </w:rPr>
+        <w:t>Root Mean Squared Error (RMSE): Penalizes larger errors more heavily than MAE.</w:t>
+      </w:r>
+    </w:p>
+    <w:p>
+      <w:pPr>
+        <w:pStyle w:val="ListeParagraf"/>
+        <w:numPr>
+          <w:ilvl w:val="0"/>
+          <w:numId w:val="9"/>
+        </w:numPr>
+        <w:spacing w:after="132" w:line="276" w:lineRule="auto"/>
+        <w:ind w:left="851" w:hanging="284"/>
         <w:rPr>
           <w:lang w:val="en-US"/>
         </w:rPr>
@@ -3126,7 +3101,7 @@
     </w:p>
     <w:p>
       <w:pPr>
-        <w:spacing w:after="296"/>
+        <w:spacing w:after="296" w:line="276" w:lineRule="auto"/>
         <w:ind w:left="-5"/>
         <w:rPr>
           <w:lang w:val="en-US"/>
@@ -3137,12 +3112,25 @@
           <w:lang w:val="en-US"/>
         </w:rPr>
         <w:lastRenderedPageBreak/>
-        <w:t>Cross-validation was chosen over a simple train/test split because the dataset is small (100 samples). A single split could yield unstable estimates due to the random partition. CV provides more robust performance estimates by averaging over all possible splits.</w:t>
+        <w:t>Cross</w:t>
+      </w:r>
+      <w:r>
+        <w:rPr>
+          <w:lang w:val="en-US"/>
+        </w:rPr>
+        <w:t xml:space="preserve"> </w:t>
+      </w:r>
+      <w:r>
+        <w:rPr>
+          <w:lang w:val="en-US"/>
+        </w:rPr>
+        <w:t>validation was chosen over a simple train/test split because the dataset is small (100 samples). A single split could yield unstable estimates due to the random partition. CV provides more robust performance estimates by averaging over all possible splits.</w:t>
       </w:r>
     </w:p>
     <w:p>
       <w:pPr>
         <w:pStyle w:val="Balk2"/>
+        <w:spacing w:line="276" w:lineRule="auto"/>
         <w:ind w:left="419" w:hanging="434"/>
         <w:rPr>
           <w:lang w:val="en-US"/>
@@ -3157,6 +3145,7 @@
     </w:p>
     <w:p>
       <w:pPr>
+        <w:spacing w:line="276" w:lineRule="auto"/>
         <w:ind w:left="-5"/>
         <w:rPr>
           <w:lang w:val="en-US"/>
@@ -3166,26 +3155,13 @@
         <w:rPr>
           <w:lang w:val="en-US"/>
         </w:rPr>
-        <w:t xml:space="preserve">The pipeline follows a systematic workflow: (1) load data from Excel via </w:t>
-      </w:r>
-      <w:proofErr w:type="spellStart"/>
-      <w:r>
-        <w:rPr>
-          <w:lang w:val="en-US"/>
-        </w:rPr>
-        <w:t>openpyxl</w:t>
-      </w:r>
-      <w:proofErr w:type="spellEnd"/>
-      <w:r>
-        <w:rPr>
-          <w:lang w:val="en-US"/>
-        </w:rPr>
-        <w:t>, (2) preprocess features, (3) evaluate all 8 models via 5-fold CV, (4) select the model with the lowest mean MAE, (5) retrain the selected model on all 100 training samples, and (6) predict Y values for the 20 test samples. This final retraining step maximizes the information available to the best model before generating predictions.</w:t>
+        <w:t>The pipeline follows a systematic workflow: (1) load data from Excel via openpyxl, (2) preprocess features, (3) evaluate all 8 models via 5-fold CV, (4) select the model with the lowest mean MAE, (5) retrain the selected model on all 100 training samples, and (6) predict Y values for the 20 test samples. This final retraining step maximizes the information available to the best model before generating predictions.</w:t>
       </w:r>
     </w:p>
     <w:p>
       <w:pPr>
         <w:pStyle w:val="Balk2"/>
+        <w:spacing w:line="276" w:lineRule="auto"/>
         <w:ind w:left="419" w:hanging="434"/>
         <w:rPr>
           <w:lang w:val="en-US"/>
@@ -3200,7 +3176,7 @@
     </w:p>
     <w:p>
       <w:pPr>
-        <w:spacing w:after="0"/>
+        <w:spacing w:after="0" w:line="276" w:lineRule="auto"/>
         <w:ind w:left="-5"/>
         <w:rPr>
           <w:lang w:val="en-US"/>
@@ -3212,6 +3188,15 @@
         </w:rPr>
         <w:t>The correlation heatmap below reveals the pairwise relationships between all features and the target variable. Notably, X1 shows the strongest negative correlation with Y (r = -0.35), while X5 has the strongest positive correlation (r = 0.24). All other features have near-zero correlation with Y.</w:t>
       </w:r>
+    </w:p>
+    <w:p>
+      <w:pPr>
+        <w:spacing w:after="0" w:line="276" w:lineRule="auto"/>
+        <w:ind w:left="-5"/>
+        <w:rPr>
+          <w:lang w:val="en-US"/>
+        </w:rPr>
+      </w:pPr>
     </w:p>
     <w:p>
       <w:pPr>
@@ -3280,7 +3265,7 @@
     </w:p>
     <w:p>
       <w:pPr>
-        <w:spacing w:after="0"/>
+        <w:spacing w:after="0" w:line="276" w:lineRule="auto"/>
         <w:ind w:left="-5"/>
         <w:rPr>
           <w:lang w:val="en-US"/>
@@ -3290,21 +3275,7 @@
         <w:rPr>
           <w:lang w:val="en-US"/>
         </w:rPr>
-        <w:t xml:space="preserve">The target variable distribution confirms the extreme right skew (skewness = 4.08). </w:t>
-      </w:r>
-      <w:proofErr w:type="gramStart"/>
-      <w:r>
-        <w:rPr>
-          <w:lang w:val="en-US"/>
-        </w:rPr>
-        <w:t>The majority of</w:t>
-      </w:r>
-      <w:proofErr w:type="gramEnd"/>
-      <w:r>
-        <w:rPr>
-          <w:lang w:val="en-US"/>
-        </w:rPr>
-        <w:t xml:space="preserve"> Y values cluster below 500, with a long tail extending to 13,578. This distribution challenges models that assume normally distributed residuals.</w:t>
+        <w:t>The target variable distribution confirms the extreme right skew (skewness = 4.08). The majority of Y values cluster below 500, with a long tail extending to 13,578. This distribution challenges models that assume normally distributed residuals.</w:t>
       </w:r>
     </w:p>
     <w:p>
@@ -3376,15 +3347,8 @@
     </w:p>
     <w:p>
       <w:pPr>
-        <w:ind w:left="0" w:firstLine="0"/>
-        <w:rPr>
-          <w:lang w:val="en-US"/>
-        </w:rPr>
-      </w:pPr>
-    </w:p>
-    <w:p>
-      <w:pPr>
         <w:pStyle w:val="Balk1"/>
+        <w:spacing w:line="276" w:lineRule="auto"/>
         <w:ind w:left="341" w:hanging="356"/>
         <w:rPr>
           <w:lang w:val="en-US"/>
@@ -3399,7 +3363,7 @@
     </w:p>
     <w:p>
       <w:pPr>
-        <w:spacing w:after="515" w:line="259" w:lineRule="auto"/>
+        <w:spacing w:after="515" w:line="276" w:lineRule="auto"/>
         <w:ind w:left="-57" w:right="-56" w:firstLine="0"/>
         <w:jc w:val="left"/>
         <w:rPr>
@@ -3500,6 +3464,7 @@
     <w:p>
       <w:pPr>
         <w:pStyle w:val="Balk2"/>
+        <w:spacing w:line="276" w:lineRule="auto"/>
         <w:ind w:left="419" w:hanging="434"/>
         <w:rPr>
           <w:lang w:val="en-US"/>
@@ -3514,7 +3479,7 @@
     </w:p>
     <w:p>
       <w:pPr>
-        <w:spacing w:after="0" w:line="259" w:lineRule="auto"/>
+        <w:spacing w:after="0" w:line="276" w:lineRule="auto"/>
         <w:ind w:left="-5" w:right="26"/>
         <w:rPr>
           <w:lang w:val="en-US"/>
@@ -3524,7 +3489,19 @@
         <w:rPr>
           <w:lang w:val="en-US"/>
         </w:rPr>
-        <w:t>The 5-fold cross-validation results are summarized in the table below. Models are ranked by their mean MAE (lower is better):</w:t>
+        <w:t>The 5-fold cross</w:t>
+      </w:r>
+      <w:r>
+        <w:rPr>
+          <w:lang w:val="en-US"/>
+        </w:rPr>
+        <w:t xml:space="preserve"> </w:t>
+      </w:r>
+      <w:r>
+        <w:rPr>
+          <w:lang w:val="en-US"/>
+        </w:rPr>
+        <w:t>validation results are summarized in the table below. Models are ranked by their mean MAE (lower is better):</w:t>
       </w:r>
     </w:p>
     <w:tbl>
@@ -3563,7 +3540,7 @@
           </w:tcPr>
           <w:p>
             <w:pPr>
-              <w:spacing w:after="0" w:line="259" w:lineRule="auto"/>
+              <w:spacing w:after="0" w:line="276" w:lineRule="auto"/>
               <w:ind w:left="0" w:firstLine="0"/>
               <w:jc w:val="center"/>
               <w:rPr>
@@ -3595,7 +3572,7 @@
           </w:tcPr>
           <w:p>
             <w:pPr>
-              <w:spacing w:after="0" w:line="259" w:lineRule="auto"/>
+              <w:spacing w:after="0" w:line="276" w:lineRule="auto"/>
               <w:ind w:left="0" w:firstLine="0"/>
               <w:jc w:val="center"/>
               <w:rPr>
@@ -3627,7 +3604,7 @@
           </w:tcPr>
           <w:p>
             <w:pPr>
-              <w:spacing w:after="0" w:line="259" w:lineRule="auto"/>
+              <w:spacing w:after="0" w:line="276" w:lineRule="auto"/>
               <w:ind w:left="0" w:firstLine="0"/>
               <w:jc w:val="center"/>
               <w:rPr>
@@ -3659,7 +3636,7 @@
           </w:tcPr>
           <w:p>
             <w:pPr>
-              <w:spacing w:after="0" w:line="259" w:lineRule="auto"/>
+              <w:spacing w:after="0" w:line="276" w:lineRule="auto"/>
               <w:ind w:left="0" w:firstLine="0"/>
               <w:jc w:val="center"/>
               <w:rPr>
@@ -3691,7 +3668,7 @@
           </w:tcPr>
           <w:p>
             <w:pPr>
-              <w:spacing w:after="0" w:line="259" w:lineRule="auto"/>
+              <w:spacing w:after="0" w:line="276" w:lineRule="auto"/>
               <w:ind w:left="0" w:firstLine="0"/>
               <w:jc w:val="center"/>
               <w:rPr>
@@ -3890,7 +3867,6 @@
                 <w:lang w:val="en-US"/>
               </w:rPr>
             </w:pPr>
-            <w:proofErr w:type="spellStart"/>
             <w:r>
               <w:rPr>
                 <w:sz w:val="18"/>
@@ -3898,7 +3874,6 @@
               </w:rPr>
               <w:t>XGBoost</w:t>
             </w:r>
-            <w:proofErr w:type="spellEnd"/>
           </w:p>
         </w:tc>
         <w:tc>
@@ -4510,7 +4485,6 @@
                 <w:lang w:val="en-US"/>
               </w:rPr>
             </w:pPr>
-            <w:proofErr w:type="spellStart"/>
             <w:r>
               <w:rPr>
                 <w:sz w:val="18"/>
@@ -4518,7 +4492,6 @@
               </w:rPr>
               <w:t>ElasticNet</w:t>
             </w:r>
-            <w:proofErr w:type="spellEnd"/>
           </w:p>
         </w:tc>
         <w:tc>
@@ -4954,7 +4927,7 @@
     <w:p>
       <w:pPr>
         <w:spacing w:after="237" w:line="259" w:lineRule="auto"/>
-        <w:ind w:left="-5"/>
+        <w:ind w:left="0" w:firstLine="0"/>
         <w:rPr>
           <w:lang w:val="en-US"/>
         </w:rPr>
@@ -4963,7 +4936,7 @@
     <w:p>
       <w:pPr>
         <w:spacing w:after="237" w:line="259" w:lineRule="auto"/>
-        <w:ind w:left="-5"/>
+        <w:ind w:left="0" w:firstLine="0"/>
         <w:rPr>
           <w:lang w:val="en-US"/>
         </w:rPr>
@@ -4972,6 +4945,15 @@
     <w:p>
       <w:pPr>
         <w:spacing w:after="237" w:line="259" w:lineRule="auto"/>
+        <w:ind w:left="0" w:firstLine="0"/>
+        <w:rPr>
+          <w:lang w:val="en-US"/>
+        </w:rPr>
+      </w:pPr>
+    </w:p>
+    <w:p>
+      <w:pPr>
+        <w:spacing w:after="237" w:line="276" w:lineRule="auto"/>
         <w:ind w:left="-5"/>
         <w:rPr>
           <w:lang w:val="en-US"/>
@@ -4987,171 +4969,182 @@
     </w:p>
     <w:p>
       <w:pPr>
+        <w:pStyle w:val="ListeParagraf"/>
         <w:numPr>
           <w:ilvl w:val="0"/>
-          <w:numId w:val="3"/>
+          <w:numId w:val="10"/>
         </w:numPr>
-        <w:ind w:left="567" w:firstLine="0"/>
-        <w:rPr>
-          <w:lang w:val="en-US"/>
-        </w:rPr>
-      </w:pPr>
-      <w:r>
-        <w:rPr>
-          <w:lang w:val="en-US"/>
-        </w:rPr>
-        <w:t xml:space="preserve">SVR (RBF Kernel) achieved the lowest mean MAE (767.30), outperforming all other models. </w:t>
-      </w:r>
-      <w:proofErr w:type="spellStart"/>
-      <w:r>
-        <w:rPr>
-          <w:lang w:val="en-US"/>
-        </w:rPr>
-        <w:t>Itskernel</w:t>
-      </w:r>
-      <w:proofErr w:type="spellEnd"/>
-      <w:r>
-        <w:rPr>
-          <w:lang w:val="en-US"/>
-        </w:rPr>
-        <w:t>-based approach effectively captures the non-linear patterns in the data.</w:t>
-      </w:r>
-    </w:p>
-    <w:p>
-      <w:pPr>
+        <w:spacing w:line="276" w:lineRule="auto"/>
+        <w:ind w:left="851" w:hanging="284"/>
+        <w:rPr>
+          <w:lang w:val="en-US"/>
+        </w:rPr>
+      </w:pPr>
+      <w:r>
+        <w:rPr>
+          <w:lang w:val="en-US"/>
+        </w:rPr>
+        <w:t>SVR (RBF Kernel) achieved the lowest mean MAE (767.30), outperforming all other models. Its</w:t>
+      </w:r>
+      <w:r>
+        <w:rPr>
+          <w:lang w:val="en-US"/>
+        </w:rPr>
+        <w:t xml:space="preserve"> </w:t>
+      </w:r>
+      <w:r>
+        <w:rPr>
+          <w:lang w:val="en-US"/>
+        </w:rPr>
+        <w:t>kernel</w:t>
+      </w:r>
+      <w:r>
+        <w:rPr>
+          <w:lang w:val="en-US"/>
+        </w:rPr>
+        <w:t xml:space="preserve"> </w:t>
+      </w:r>
+      <w:r>
+        <w:rPr>
+          <w:lang w:val="en-US"/>
+        </w:rPr>
+        <w:t>based approach effectively captures the non-linear patterns in the data.</w:t>
+      </w:r>
+    </w:p>
+    <w:p>
+      <w:pPr>
+        <w:pStyle w:val="ListeParagraf"/>
         <w:numPr>
           <w:ilvl w:val="0"/>
-          <w:numId w:val="3"/>
+          <w:numId w:val="10"/>
         </w:numPr>
-        <w:ind w:left="567" w:firstLine="0"/>
-        <w:rPr>
-          <w:lang w:val="en-US"/>
-        </w:rPr>
-      </w:pPr>
-      <w:proofErr w:type="spellStart"/>
-      <w:r>
-        <w:rPr>
-          <w:lang w:val="en-US"/>
-        </w:rPr>
-        <w:t>XGBoost</w:t>
-      </w:r>
-      <w:proofErr w:type="spellEnd"/>
-      <w:r>
-        <w:rPr>
-          <w:lang w:val="en-US"/>
-        </w:rPr>
-        <w:t xml:space="preserve"> (MAE = 817.15) and Random Forest (MAE = 842.63) followed closely, confirming </w:t>
-      </w:r>
-      <w:proofErr w:type="spellStart"/>
-      <w:r>
-        <w:rPr>
-          <w:lang w:val="en-US"/>
-        </w:rPr>
-        <w:t>thatensemble</w:t>
-      </w:r>
-      <w:proofErr w:type="spellEnd"/>
-      <w:r>
-        <w:rPr>
-          <w:lang w:val="en-US"/>
-        </w:rPr>
-        <w:t xml:space="preserve"> tree methods handle this type of data well.</w:t>
-      </w:r>
-    </w:p>
-    <w:p>
-      <w:pPr>
+        <w:spacing w:line="276" w:lineRule="auto"/>
+        <w:ind w:left="851" w:hanging="284"/>
+        <w:rPr>
+          <w:lang w:val="en-US"/>
+        </w:rPr>
+      </w:pPr>
+      <w:r>
+        <w:rPr>
+          <w:lang w:val="en-US"/>
+        </w:rPr>
+        <w:t>XGBoost (MAE = 817.15) and Random Forest (MAE = 842.63) followed closely, confirming that</w:t>
+      </w:r>
+      <w:r>
+        <w:rPr>
+          <w:lang w:val="en-US"/>
+        </w:rPr>
+        <w:t xml:space="preserve"> </w:t>
+      </w:r>
+      <w:r>
+        <w:rPr>
+          <w:lang w:val="en-US"/>
+        </w:rPr>
+        <w:t>ensemble tree methods handle this type of data well.</w:t>
+      </w:r>
+    </w:p>
+    <w:p>
+      <w:pPr>
+        <w:pStyle w:val="ListeParagraf"/>
         <w:numPr>
           <w:ilvl w:val="0"/>
-          <w:numId w:val="3"/>
+          <w:numId w:val="10"/>
         </w:numPr>
-        <w:ind w:left="567" w:firstLine="0"/>
-        <w:rPr>
-          <w:lang w:val="en-US"/>
-        </w:rPr>
-      </w:pPr>
-      <w:r>
-        <w:rPr>
-          <w:lang w:val="en-US"/>
-        </w:rPr>
-        <w:t xml:space="preserve">Linear models performed worst: Ridge (1411.86) and Lasso (1436.03) had the highest </w:t>
-      </w:r>
-      <w:proofErr w:type="spellStart"/>
-      <w:r>
-        <w:rPr>
-          <w:lang w:val="en-US"/>
-        </w:rPr>
-        <w:t>MAEvalues</w:t>
-      </w:r>
-      <w:proofErr w:type="spellEnd"/>
-      <w:r>
-        <w:rPr>
-          <w:lang w:val="en-US"/>
-        </w:rPr>
-        <w:t xml:space="preserve"> despite polynomial feature engineering, confirming that the underlying relationship is fundamentally non-linear.</w:t>
-      </w:r>
-    </w:p>
-    <w:p>
-      <w:pPr>
+        <w:spacing w:line="276" w:lineRule="auto"/>
+        <w:ind w:left="851" w:hanging="284"/>
+        <w:rPr>
+          <w:lang w:val="en-US"/>
+        </w:rPr>
+      </w:pPr>
+      <w:r>
+        <w:rPr>
+          <w:lang w:val="en-US"/>
+        </w:rPr>
+        <w:t>Linear models performed worst: Ridge (1411.86) and Lasso (1436.03) had the highest MAE</w:t>
+      </w:r>
+      <w:r>
+        <w:rPr>
+          <w:lang w:val="en-US"/>
+        </w:rPr>
+        <w:t xml:space="preserve"> </w:t>
+      </w:r>
+      <w:r>
+        <w:rPr>
+          <w:lang w:val="en-US"/>
+        </w:rPr>
+        <w:t>values despite polynomial feature engineering, confirming that the underlying relationship is fundamentally non-linear.</w:t>
+      </w:r>
+    </w:p>
+    <w:p>
+      <w:pPr>
+        <w:pStyle w:val="ListeParagraf"/>
         <w:numPr>
           <w:ilvl w:val="0"/>
-          <w:numId w:val="3"/>
+          <w:numId w:val="10"/>
         </w:numPr>
-        <w:ind w:left="567" w:firstLine="0"/>
-        <w:rPr>
-          <w:lang w:val="en-US"/>
-        </w:rPr>
-      </w:pPr>
-      <w:r>
-        <w:rPr>
-          <w:lang w:val="en-US"/>
-        </w:rPr>
-        <w:t xml:space="preserve">All models produced negative R2 values, indicating that the dataset is inherently difficult </w:t>
-      </w:r>
-      <w:proofErr w:type="spellStart"/>
-      <w:r>
-        <w:rPr>
-          <w:lang w:val="en-US"/>
-        </w:rPr>
-        <w:t>tomodel</w:t>
-      </w:r>
-      <w:proofErr w:type="spellEnd"/>
-      <w:r>
-        <w:rPr>
-          <w:lang w:val="en-US"/>
-        </w:rPr>
-        <w:t>. The extreme skewness and potential outliers in Y make it challenging for any model to explain variance consistently across all folds.</w:t>
-      </w:r>
-    </w:p>
-    <w:p>
-      <w:pPr>
+        <w:spacing w:line="276" w:lineRule="auto"/>
+        <w:ind w:left="851" w:hanging="284"/>
+        <w:rPr>
+          <w:lang w:val="en-US"/>
+        </w:rPr>
+      </w:pPr>
+      <w:r>
+        <w:rPr>
+          <w:lang w:val="en-US"/>
+        </w:rPr>
+        <w:t>All models produced negative R2 values, indicating that the dataset is inherently difficult to</w:t>
+      </w:r>
+      <w:r>
+        <w:rPr>
+          <w:lang w:val="en-US"/>
+        </w:rPr>
+        <w:t xml:space="preserve"> </w:t>
+      </w:r>
+      <w:r>
+        <w:rPr>
+          <w:lang w:val="en-US"/>
+        </w:rPr>
+        <w:t>model. The extreme skewness and potential outliers in Y make it challenging for any model to explain variance consistently across all folds.</w:t>
+      </w:r>
+    </w:p>
+    <w:p>
+      <w:pPr>
+        <w:pStyle w:val="ListeParagraf"/>
         <w:numPr>
           <w:ilvl w:val="0"/>
-          <w:numId w:val="3"/>
+          <w:numId w:val="10"/>
         </w:numPr>
-        <w:ind w:left="567" w:firstLine="0"/>
-        <w:rPr>
-          <w:lang w:val="en-US"/>
-        </w:rPr>
-      </w:pPr>
-      <w:r>
-        <w:rPr>
-          <w:lang w:val="en-US"/>
-        </w:rPr>
-        <w:t xml:space="preserve">High standard deviations in MAE across folds (e.g., SVR std = 723.73) suggest </w:t>
-      </w:r>
-      <w:proofErr w:type="spellStart"/>
-      <w:r>
-        <w:rPr>
-          <w:lang w:val="en-US"/>
-        </w:rPr>
-        <w:t>significantvariability</w:t>
-      </w:r>
-      <w:proofErr w:type="spellEnd"/>
-      <w:r>
-        <w:rPr>
-          <w:lang w:val="en-US"/>
-        </w:rPr>
-        <w:t xml:space="preserve"> in prediction difficulty across different data subsets, likely driven by the skewed outliers in Y.</w:t>
-      </w:r>
+        <w:spacing w:line="276" w:lineRule="auto"/>
+        <w:ind w:left="851" w:hanging="284"/>
+        <w:rPr>
+          <w:lang w:val="en-US"/>
+        </w:rPr>
+      </w:pPr>
+      <w:r>
+        <w:rPr>
+          <w:lang w:val="en-US"/>
+        </w:rPr>
+        <w:t>High standard deviations in MAE across folds (e.g., SVR std = 723.73) suggest significant</w:t>
+      </w:r>
+      <w:r>
+        <w:rPr>
+          <w:lang w:val="en-US"/>
+        </w:rPr>
+        <w:t xml:space="preserve"> </w:t>
+      </w:r>
+      <w:r>
+        <w:rPr>
+          <w:lang w:val="en-US"/>
+        </w:rPr>
+        <w:t>variability in prediction difficulty across different data subsets, likely driven by the skewed outliers in Y.</w:t>
+      </w:r>
+    </w:p>
+    <w:p>
+      <w:pPr>
+        <w:rPr>
+          <w:lang w:val="en-US"/>
+        </w:rPr>
+      </w:pPr>
     </w:p>
     <w:p>
       <w:pPr>
@@ -5245,6 +5238,7 @@
     <w:p>
       <w:pPr>
         <w:pStyle w:val="Balk2"/>
+        <w:spacing w:line="276" w:lineRule="auto"/>
         <w:ind w:left="419" w:hanging="434"/>
         <w:rPr>
           <w:lang w:val="en-US"/>
@@ -5260,7 +5254,7 @@
     </w:p>
     <w:p>
       <w:pPr>
-        <w:spacing w:after="0"/>
+        <w:spacing w:after="0" w:line="276" w:lineRule="auto"/>
         <w:ind w:left="-5"/>
         <w:rPr>
           <w:lang w:val="en-US"/>
@@ -5341,7 +5335,7 @@
     </w:p>
     <w:p>
       <w:pPr>
-        <w:spacing w:after="0"/>
+        <w:spacing w:after="0" w:line="276" w:lineRule="auto"/>
         <w:ind w:left="-5"/>
         <w:rPr>
           <w:lang w:val="en-US"/>
@@ -5441,7 +5435,7 @@
     </w:p>
     <w:p>
       <w:pPr>
-        <w:spacing w:after="0"/>
+        <w:spacing w:after="0" w:line="276" w:lineRule="auto"/>
         <w:ind w:left="-5"/>
         <w:rPr>
           <w:lang w:val="en-US"/>
@@ -5451,17 +5445,32 @@
         <w:rPr>
           <w:lang w:val="en-US"/>
         </w:rPr>
-        <w:t>Feature importance was extracted from the three tree-based models to understand which input variables contribute most to predictions. While SVR does not provide direct feature importances, the tree-based models offer valuable insights.</w:t>
-      </w:r>
-    </w:p>
-    <w:p>
-      <w:pPr>
-        <w:spacing w:after="0"/>
-        <w:ind w:left="-5"/>
-        <w:rPr>
-          <w:lang w:val="en-US"/>
-        </w:rPr>
-      </w:pPr>
+        <w:t>Feature importance was extracted from the three tree</w:t>
+      </w:r>
+      <w:r>
+        <w:rPr>
+          <w:lang w:val="en-US"/>
+        </w:rPr>
+        <w:t xml:space="preserve"> </w:t>
+      </w:r>
+      <w:r>
+        <w:rPr>
+          <w:lang w:val="en-US"/>
+        </w:rPr>
+        <w:t>based models to understand which input variables contribute most to predictions. While SVR does not provide direct feature importances, the tree</w:t>
+      </w:r>
+      <w:r>
+        <w:rPr>
+          <w:lang w:val="en-US"/>
+        </w:rPr>
+        <w:t xml:space="preserve"> </w:t>
+      </w:r>
+      <w:r>
+        <w:rPr>
+          <w:lang w:val="en-US"/>
+        </w:rPr>
+        <w:t>based models offer valuable insights.</w:t>
+      </w:r>
     </w:p>
     <w:p>
       <w:pPr>
@@ -5526,8 +5535,25 @@
           <w:sz w:val="18"/>
           <w:lang w:val="en-US"/>
         </w:rPr>
-        <w:lastRenderedPageBreak/>
-        <w:t>Figure: Random Forest Feature Importances</w:t>
+        <w:t>Figure</w:t>
+      </w:r>
+      <w:r>
+        <w:rPr>
+          <w:i/>
+          <w:color w:val="505050"/>
+          <w:sz w:val="18"/>
+          <w:lang w:val="en-US"/>
+        </w:rPr>
+        <w:t xml:space="preserve"> 6</w:t>
+      </w:r>
+      <w:r>
+        <w:rPr>
+          <w:i/>
+          <w:color w:val="505050"/>
+          <w:sz w:val="18"/>
+          <w:lang w:val="en-US"/>
+        </w:rPr>
+        <w:t>: Random Forest Feature Importances</w:t>
       </w:r>
     </w:p>
     <w:p>
@@ -5543,6 +5569,7 @@
           <w:noProof/>
           <w:lang w:val="en-US"/>
         </w:rPr>
+        <w:lastRenderedPageBreak/>
         <w:drawing>
           <wp:inline distT="0" distB="0" distL="0" distR="0" wp14:anchorId="5B6DF673" wp14:editId="62F541C6">
             <wp:extent cx="6192000" cy="3824986"/>
@@ -5593,7 +5620,25 @@
           <w:sz w:val="18"/>
           <w:lang w:val="en-US"/>
         </w:rPr>
-        <w:t>Figure: Gradient Boosting Feature Importances</w:t>
+        <w:t>Figure</w:t>
+      </w:r>
+      <w:r>
+        <w:rPr>
+          <w:i/>
+          <w:color w:val="505050"/>
+          <w:sz w:val="18"/>
+          <w:lang w:val="en-US"/>
+        </w:rPr>
+        <w:t xml:space="preserve"> 7</w:t>
+      </w:r>
+      <w:r>
+        <w:rPr>
+          <w:i/>
+          <w:color w:val="505050"/>
+          <w:sz w:val="18"/>
+          <w:lang w:val="en-US"/>
+        </w:rPr>
+        <w:t>: Gradient Boosting Feature Importances</w:t>
       </w:r>
     </w:p>
     <w:p>
@@ -5659,9 +5704,8 @@
           <w:sz w:val="18"/>
           <w:lang w:val="en-US"/>
         </w:rPr>
-        <w:t xml:space="preserve">Figure: </w:t>
-      </w:r>
-      <w:proofErr w:type="spellStart"/>
+        <w:t>Figure</w:t>
+      </w:r>
       <w:r>
         <w:rPr>
           <w:i/>
@@ -5669,9 +5713,8 @@
           <w:sz w:val="18"/>
           <w:lang w:val="en-US"/>
         </w:rPr>
-        <w:t>XGBoost</w:t>
-      </w:r>
-      <w:proofErr w:type="spellEnd"/>
+        <w:t xml:space="preserve"> 8</w:t>
+      </w:r>
       <w:r>
         <w:rPr>
           <w:i/>
@@ -5679,11 +5722,12 @@
           <w:sz w:val="18"/>
           <w:lang w:val="en-US"/>
         </w:rPr>
-        <w:t xml:space="preserve"> Feature Importances</w:t>
-      </w:r>
-    </w:p>
-    <w:p>
-      <w:pPr>
+        <w:t>: XGBoost Feature Importances</w:t>
+      </w:r>
+    </w:p>
+    <w:p>
+      <w:pPr>
+        <w:spacing w:line="276" w:lineRule="auto"/>
         <w:ind w:left="-5"/>
         <w:rPr>
           <w:lang w:val="en-US"/>
@@ -5694,7 +5738,19 @@
           <w:lang w:val="en-US"/>
         </w:rPr>
         <w:lastRenderedPageBreak/>
-        <w:t>Across all tree-based models, feature importance rankings provide complementary views of which variables drive predictions. The consistency (or divergence) of these rankings helps validate which features are genuinely important versus model-specific artifacts.</w:t>
+        <w:t>Across all tree</w:t>
+      </w:r>
+      <w:r>
+        <w:rPr>
+          <w:lang w:val="en-US"/>
+        </w:rPr>
+        <w:t xml:space="preserve"> </w:t>
+      </w:r>
+      <w:r>
+        <w:rPr>
+          <w:lang w:val="en-US"/>
+        </w:rPr>
+        <w:t>based models, feature importance rankings provide complementary views of which variables drive predictions. The consistency (or divergence) of these rankings helps validate which features are genuinely important versus model-specific artifacts.</w:t>
       </w:r>
     </w:p>
     <w:p>
@@ -5708,6 +5764,7 @@
     <w:p>
       <w:pPr>
         <w:pStyle w:val="Balk1"/>
+        <w:spacing w:line="276" w:lineRule="auto"/>
         <w:ind w:left="341" w:hanging="356"/>
         <w:rPr>
           <w:lang w:val="en-US"/>
@@ -5722,7 +5779,7 @@
     </w:p>
     <w:p>
       <w:pPr>
-        <w:spacing w:after="515" w:line="259" w:lineRule="auto"/>
+        <w:spacing w:after="515" w:line="276" w:lineRule="auto"/>
         <w:ind w:left="-57" w:right="-56" w:firstLine="0"/>
         <w:jc w:val="left"/>
         <w:rPr>
@@ -5823,6 +5880,7 @@
     <w:p>
       <w:pPr>
         <w:pStyle w:val="Balk2"/>
+        <w:spacing w:line="276" w:lineRule="auto"/>
         <w:ind w:left="419" w:hanging="434"/>
         <w:rPr>
           <w:lang w:val="en-US"/>
@@ -5837,7 +5895,7 @@
     </w:p>
     <w:p>
       <w:pPr>
-        <w:spacing w:after="170"/>
+        <w:spacing w:after="170" w:line="276" w:lineRule="auto"/>
         <w:ind w:left="-15" w:firstLine="0"/>
         <w:rPr>
           <w:lang w:val="en-US"/>
@@ -5852,62 +5910,137 @@
     </w:p>
     <w:p>
       <w:pPr>
+        <w:pStyle w:val="ListeParagraf"/>
         <w:numPr>
           <w:ilvl w:val="0"/>
-          <w:numId w:val="4"/>
+          <w:numId w:val="11"/>
         </w:numPr>
-        <w:ind w:left="567" w:firstLine="0"/>
-        <w:rPr>
-          <w:lang w:val="en-US"/>
-        </w:rPr>
-      </w:pPr>
-      <w:r>
-        <w:rPr>
-          <w:lang w:val="en-US"/>
-        </w:rPr>
-        <w:t>SVR with RBF kernel emerged as the best-performing model with a cross-validated MAE of767.30, demonstrating the effectiveness of kernel methods for capturing non-linear patterns in small datasets.</w:t>
-      </w:r>
-    </w:p>
-    <w:p>
-      <w:pPr>
+        <w:spacing w:line="276" w:lineRule="auto"/>
+        <w:ind w:left="851" w:hanging="284"/>
+        <w:rPr>
+          <w:lang w:val="en-US"/>
+        </w:rPr>
+      </w:pPr>
+      <w:r>
+        <w:rPr>
+          <w:lang w:val="en-US"/>
+        </w:rPr>
+        <w:t>SVR with RBF kernel emerged as the best</w:t>
+      </w:r>
+      <w:r>
+        <w:rPr>
+          <w:lang w:val="en-US"/>
+        </w:rPr>
+        <w:t xml:space="preserve"> </w:t>
+      </w:r>
+      <w:r>
+        <w:rPr>
+          <w:lang w:val="en-US"/>
+        </w:rPr>
+        <w:t>performing model with a cross</w:t>
+      </w:r>
+      <w:r>
+        <w:rPr>
+          <w:lang w:val="en-US"/>
+        </w:rPr>
+        <w:t xml:space="preserve"> </w:t>
+      </w:r>
+      <w:r>
+        <w:rPr>
+          <w:lang w:val="en-US"/>
+        </w:rPr>
+        <w:t>validated MAE of</w:t>
+      </w:r>
+      <w:r>
+        <w:rPr>
+          <w:lang w:val="en-US"/>
+        </w:rPr>
+        <w:t xml:space="preserve"> </w:t>
+      </w:r>
+      <w:r>
+        <w:rPr>
+          <w:lang w:val="en-US"/>
+        </w:rPr>
+        <w:t>767.30, demonstrating the effectiveness of kernel methods for capturing non</w:t>
+      </w:r>
+      <w:r>
+        <w:rPr>
+          <w:lang w:val="en-US"/>
+        </w:rPr>
+        <w:t xml:space="preserve"> </w:t>
+      </w:r>
+      <w:r>
+        <w:rPr>
+          <w:lang w:val="en-US"/>
+        </w:rPr>
+        <w:t>linear patterns in small datasets.</w:t>
+      </w:r>
+    </w:p>
+    <w:p>
+      <w:pPr>
+        <w:pStyle w:val="ListeParagraf"/>
         <w:numPr>
           <w:ilvl w:val="0"/>
-          <w:numId w:val="4"/>
+          <w:numId w:val="11"/>
         </w:numPr>
-        <w:ind w:left="567" w:firstLine="0"/>
-        <w:rPr>
-          <w:lang w:val="en-US"/>
-        </w:rPr>
-      </w:pPr>
-      <w:r>
-        <w:rPr>
-          <w:lang w:val="en-US"/>
-        </w:rPr>
-        <w:t xml:space="preserve">Non-linear models consistently outperformed linear ones, even when linear models </w:t>
-      </w:r>
-      <w:proofErr w:type="spellStart"/>
-      <w:r>
-        <w:rPr>
-          <w:lang w:val="en-US"/>
-        </w:rPr>
-        <w:t>wereaugmented</w:t>
-      </w:r>
-      <w:proofErr w:type="spellEnd"/>
-      <w:r>
-        <w:rPr>
-          <w:lang w:val="en-US"/>
-        </w:rPr>
-        <w:t xml:space="preserve"> with polynomial features. This confirms that the data contains inherently non-linear relationships.</w:t>
-      </w:r>
-    </w:p>
-    <w:p>
-      <w:pPr>
+        <w:spacing w:line="276" w:lineRule="auto"/>
+        <w:ind w:left="851" w:hanging="284"/>
+        <w:rPr>
+          <w:lang w:val="en-US"/>
+        </w:rPr>
+      </w:pPr>
+      <w:r>
+        <w:rPr>
+          <w:lang w:val="en-US"/>
+        </w:rPr>
+        <w:t>Non</w:t>
+      </w:r>
+      <w:r>
+        <w:rPr>
+          <w:lang w:val="en-US"/>
+        </w:rPr>
+        <w:t>-</w:t>
+      </w:r>
+      <w:r>
+        <w:rPr>
+          <w:lang w:val="en-US"/>
+        </w:rPr>
+        <w:t>linear models consistently outperformed linear ones, even when linear models were</w:t>
+      </w:r>
+      <w:r>
+        <w:rPr>
+          <w:lang w:val="en-US"/>
+        </w:rPr>
+        <w:t xml:space="preserve"> </w:t>
+      </w:r>
+      <w:r>
+        <w:rPr>
+          <w:lang w:val="en-US"/>
+        </w:rPr>
+        <w:t>augmented with polynomial features. This confirms that the data contains inherently non</w:t>
+      </w:r>
+      <w:r>
+        <w:rPr>
+          <w:lang w:val="en-US"/>
+        </w:rPr>
+        <w:t xml:space="preserve"> </w:t>
+      </w:r>
+      <w:r>
+        <w:rPr>
+          <w:lang w:val="en-US"/>
+        </w:rPr>
+        <w:t>linear relationships.</w:t>
+      </w:r>
+    </w:p>
+    <w:p>
+      <w:pPr>
+        <w:pStyle w:val="ListeParagraf"/>
         <w:numPr>
           <w:ilvl w:val="0"/>
-          <w:numId w:val="4"/>
+          <w:numId w:val="11"/>
         </w:numPr>
-        <w:spacing w:line="259" w:lineRule="auto"/>
-        <w:ind w:left="567" w:firstLine="0"/>
+        <w:spacing w:line="276" w:lineRule="auto"/>
+        <w:ind w:left="851" w:hanging="284"/>
         <w:rPr>
           <w:lang w:val="en-US"/>
         </w:rPr>
@@ -5921,7 +6054,7 @@
     </w:p>
     <w:p>
       <w:pPr>
-        <w:spacing w:after="249" w:line="259" w:lineRule="auto"/>
+        <w:spacing w:after="249" w:line="276" w:lineRule="auto"/>
         <w:rPr>
           <w:lang w:val="en-US"/>
         </w:rPr>
@@ -5936,6 +6069,7 @@
     <w:p>
       <w:pPr>
         <w:pStyle w:val="Balk2"/>
+        <w:spacing w:line="276" w:lineRule="auto"/>
         <w:ind w:left="419" w:hanging="434"/>
         <w:rPr>
           <w:lang w:val="en-US"/>
@@ -5950,7 +6084,7 @@
     </w:p>
     <w:p>
       <w:pPr>
-        <w:spacing w:after="237" w:line="259" w:lineRule="auto"/>
+        <w:spacing w:after="237" w:line="276" w:lineRule="auto"/>
         <w:ind w:left="-5"/>
         <w:rPr>
           <w:lang w:val="en-US"/>
@@ -5965,118 +6099,152 @@
     </w:p>
     <w:p>
       <w:pPr>
+        <w:pStyle w:val="ListeParagraf"/>
         <w:numPr>
           <w:ilvl w:val="0"/>
-          <w:numId w:val="5"/>
+          <w:numId w:val="12"/>
         </w:numPr>
-        <w:ind w:left="567" w:firstLine="0"/>
-        <w:rPr>
-          <w:lang w:val="en-US"/>
-        </w:rPr>
-      </w:pPr>
-      <w:r>
-        <w:rPr>
-          <w:lang w:val="en-US"/>
-        </w:rPr>
-        <w:t xml:space="preserve">Small dataset: 100 training samples provide limited statistical power for learning </w:t>
-      </w:r>
-      <w:proofErr w:type="spellStart"/>
-      <w:r>
-        <w:rPr>
-          <w:lang w:val="en-US"/>
-        </w:rPr>
-        <w:t>complexpatterns</w:t>
-      </w:r>
-      <w:proofErr w:type="spellEnd"/>
-      <w:r>
-        <w:rPr>
-          <w:lang w:val="en-US"/>
-        </w:rPr>
-        <w:t xml:space="preserve">, particularly for high-capacity models like </w:t>
-      </w:r>
-      <w:proofErr w:type="spellStart"/>
-      <w:r>
-        <w:rPr>
-          <w:lang w:val="en-US"/>
-        </w:rPr>
-        <w:t>XGBoost</w:t>
-      </w:r>
-      <w:proofErr w:type="spellEnd"/>
-      <w:r>
-        <w:rPr>
-          <w:lang w:val="en-US"/>
-        </w:rPr>
-        <w:t xml:space="preserve"> and neural networks.</w:t>
-      </w:r>
-    </w:p>
-    <w:p>
-      <w:pPr>
+        <w:spacing w:line="276" w:lineRule="auto"/>
+        <w:ind w:left="851" w:hanging="284"/>
+        <w:rPr>
+          <w:lang w:val="en-US"/>
+        </w:rPr>
+      </w:pPr>
+      <w:r>
+        <w:rPr>
+          <w:lang w:val="en-US"/>
+        </w:rPr>
+        <w:t>Small dataset: 100 training samples provide limited statistical power for learning complex</w:t>
+      </w:r>
+      <w:r>
+        <w:rPr>
+          <w:lang w:val="en-US"/>
+        </w:rPr>
+        <w:t xml:space="preserve"> </w:t>
+      </w:r>
+      <w:r>
+        <w:rPr>
+          <w:lang w:val="en-US"/>
+        </w:rPr>
+        <w:t>patterns, particularly for high</w:t>
+      </w:r>
+      <w:r>
+        <w:rPr>
+          <w:lang w:val="en-US"/>
+        </w:rPr>
+        <w:t xml:space="preserve"> </w:t>
+      </w:r>
+      <w:r>
+        <w:rPr>
+          <w:lang w:val="en-US"/>
+        </w:rPr>
+        <w:t>capacity models like XGBoost and neural networks.</w:t>
+      </w:r>
+    </w:p>
+    <w:p>
+      <w:pPr>
+        <w:pStyle w:val="ListeParagraf"/>
         <w:numPr>
           <w:ilvl w:val="0"/>
-          <w:numId w:val="5"/>
+          <w:numId w:val="12"/>
         </w:numPr>
-        <w:ind w:left="567" w:firstLine="0"/>
-        <w:rPr>
-          <w:lang w:val="en-US"/>
-        </w:rPr>
-      </w:pPr>
-      <w:r>
-        <w:rPr>
-          <w:lang w:val="en-US"/>
-        </w:rPr>
-        <w:t xml:space="preserve">Target distribution: The heavy right skew means that a few extreme Y values </w:t>
-      </w:r>
-      <w:proofErr w:type="spellStart"/>
-      <w:r>
-        <w:rPr>
-          <w:lang w:val="en-US"/>
-        </w:rPr>
-        <w:t>disproportionatelyinfluence</w:t>
-      </w:r>
-      <w:proofErr w:type="spellEnd"/>
-      <w:r>
-        <w:rPr>
-          <w:lang w:val="en-US"/>
-        </w:rPr>
-        <w:t xml:space="preserve"> error metrics. Log-transformation or robust loss functions could potentially improve results.</w:t>
-      </w:r>
-    </w:p>
-    <w:p>
-      <w:pPr>
+        <w:spacing w:line="276" w:lineRule="auto"/>
+        <w:ind w:left="851" w:hanging="284"/>
+        <w:rPr>
+          <w:lang w:val="en-US"/>
+        </w:rPr>
+      </w:pPr>
+      <w:r>
+        <w:rPr>
+          <w:lang w:val="en-US"/>
+        </w:rPr>
+        <w:t>Target distribution: The heavy right skew means that a few extreme Y values disproportionately</w:t>
+      </w:r>
+      <w:r>
+        <w:rPr>
+          <w:lang w:val="en-US"/>
+        </w:rPr>
+        <w:t xml:space="preserve"> </w:t>
+      </w:r>
+      <w:r>
+        <w:rPr>
+          <w:lang w:val="en-US"/>
+        </w:rPr>
+        <w:t>influence error metrics. Log</w:t>
+      </w:r>
+      <w:r>
+        <w:rPr>
+          <w:lang w:val="en-US"/>
+        </w:rPr>
+        <w:t xml:space="preserve"> </w:t>
+      </w:r>
+      <w:r>
+        <w:rPr>
+          <w:lang w:val="en-US"/>
+        </w:rPr>
+        <w:t>transformation or robust loss functions could potentially improve results.</w:t>
+      </w:r>
+    </w:p>
+    <w:p>
+      <w:pPr>
+        <w:pStyle w:val="ListeParagraf"/>
         <w:numPr>
           <w:ilvl w:val="0"/>
-          <w:numId w:val="5"/>
+          <w:numId w:val="12"/>
         </w:numPr>
-        <w:spacing w:after="182"/>
-        <w:ind w:left="567" w:firstLine="0"/>
-        <w:rPr>
-          <w:lang w:val="en-US"/>
-        </w:rPr>
-      </w:pPr>
-      <w:r>
-        <w:rPr>
-          <w:lang w:val="en-US"/>
-        </w:rPr>
-        <w:t xml:space="preserve">Feature informativeness: The weak correlations between features and Y (all |r| &lt; 0.35) </w:t>
-      </w:r>
-      <w:proofErr w:type="spellStart"/>
-      <w:r>
-        <w:rPr>
-          <w:lang w:val="en-US"/>
-        </w:rPr>
-        <w:t>suggestthat</w:t>
-      </w:r>
-      <w:proofErr w:type="spellEnd"/>
-      <w:r>
-        <w:rPr>
-          <w:lang w:val="en-US"/>
-        </w:rPr>
-        <w:t xml:space="preserve"> the provided features may not fully capture the underlying process generating Y. Additional features or domain knowledge could enhance predictions.</w:t>
+        <w:spacing w:after="182" w:line="276" w:lineRule="auto"/>
+        <w:ind w:left="851" w:hanging="284"/>
+        <w:rPr>
+          <w:lang w:val="en-US"/>
+        </w:rPr>
+      </w:pPr>
+      <w:r>
+        <w:rPr>
+          <w:lang w:val="en-US"/>
+        </w:rPr>
+        <w:t xml:space="preserve">Feature informativeness: The weak correlations between features and Y (all </w:t>
+      </w:r>
+      <w:r>
+        <w:rPr>
+          <w:lang w:val="en-US"/>
+        </w:rPr>
+        <w:t>|</w:t>
+      </w:r>
+      <w:r>
+        <w:rPr>
+          <w:lang w:val="en-US"/>
+        </w:rPr>
+        <w:t>r</w:t>
+      </w:r>
+      <w:r>
+        <w:rPr>
+          <w:lang w:val="en-US"/>
+        </w:rPr>
+        <w:t>|</w:t>
+      </w:r>
+      <w:r>
+        <w:rPr>
+          <w:lang w:val="en-US"/>
+        </w:rPr>
+        <w:t xml:space="preserve"> &lt; 0.35) suggest</w:t>
+      </w:r>
+      <w:r>
+        <w:rPr>
+          <w:lang w:val="en-US"/>
+        </w:rPr>
+        <w:t xml:space="preserve"> </w:t>
+      </w:r>
+      <w:r>
+        <w:rPr>
+          <w:lang w:val="en-US"/>
+        </w:rPr>
+        <w:t>that the provided features may not fully capture the underlying process generating Y. Additional features or domain knowledge could enhance predictions.</w:t>
       </w:r>
     </w:p>
     <w:p>
       <w:pPr>
         <w:pStyle w:val="Balk2"/>
+        <w:spacing w:line="276" w:lineRule="auto"/>
         <w:ind w:left="419" w:hanging="434"/>
         <w:rPr>
           <w:lang w:val="en-US"/>
@@ -6091,7 +6259,7 @@
     </w:p>
     <w:p>
       <w:pPr>
-        <w:spacing w:after="237" w:line="259" w:lineRule="auto"/>
+        <w:spacing w:after="237" w:line="276" w:lineRule="auto"/>
         <w:ind w:left="-5"/>
         <w:rPr>
           <w:lang w:val="en-US"/>
@@ -6106,150 +6274,149 @@
     </w:p>
     <w:p>
       <w:pPr>
+        <w:pStyle w:val="ListeParagraf"/>
         <w:numPr>
           <w:ilvl w:val="0"/>
-          <w:numId w:val="6"/>
+          <w:numId w:val="13"/>
         </w:numPr>
-        <w:ind w:left="567" w:firstLine="0"/>
-        <w:rPr>
-          <w:lang w:val="en-US"/>
-        </w:rPr>
-      </w:pPr>
-      <w:r>
-        <w:rPr>
-          <w:lang w:val="en-US"/>
-        </w:rPr>
-        <w:t xml:space="preserve">Always apply cross-validation, especially with small datasets. A single train/test split can </w:t>
-      </w:r>
-      <w:proofErr w:type="spellStart"/>
-      <w:r>
-        <w:rPr>
-          <w:lang w:val="en-US"/>
-        </w:rPr>
-        <w:t>yieldmisleading</w:t>
-      </w:r>
-      <w:proofErr w:type="spellEnd"/>
-      <w:r>
-        <w:rPr>
-          <w:lang w:val="en-US"/>
-        </w:rPr>
-        <w:t xml:space="preserve"> results due to sampling variability.</w:t>
-      </w:r>
-    </w:p>
-    <w:p>
-      <w:pPr>
+        <w:spacing w:line="276" w:lineRule="auto"/>
+        <w:ind w:left="851" w:hanging="284"/>
+        <w:rPr>
+          <w:lang w:val="en-US"/>
+        </w:rPr>
+      </w:pPr>
+      <w:r>
+        <w:rPr>
+          <w:lang w:val="en-US"/>
+        </w:rPr>
+        <w:t>Always apply cross-validation, especially with small datasets. A single train/test split can yield</w:t>
+      </w:r>
+      <w:r>
+        <w:rPr>
+          <w:lang w:val="en-US"/>
+        </w:rPr>
+        <w:t xml:space="preserve"> </w:t>
+      </w:r>
+      <w:r>
+        <w:rPr>
+          <w:lang w:val="en-US"/>
+        </w:rPr>
+        <w:t>misleading results due to sampling variability.</w:t>
+      </w:r>
+    </w:p>
+    <w:p>
+      <w:pPr>
+        <w:pStyle w:val="ListeParagraf"/>
         <w:numPr>
           <w:ilvl w:val="0"/>
-          <w:numId w:val="6"/>
+          <w:numId w:val="13"/>
         </w:numPr>
-        <w:ind w:left="567" w:firstLine="0"/>
-        <w:rPr>
-          <w:lang w:val="en-US"/>
-        </w:rPr>
-      </w:pPr>
-      <w:r>
-        <w:rPr>
-          <w:lang w:val="en-US"/>
-        </w:rPr>
-        <w:lastRenderedPageBreak/>
-        <w:t xml:space="preserve">Data preprocessing matters: </w:t>
-      </w:r>
-      <w:proofErr w:type="spellStart"/>
-      <w:r>
-        <w:rPr>
-          <w:lang w:val="en-US"/>
-        </w:rPr>
-        <w:t>StandardScaler</w:t>
-      </w:r>
-      <w:proofErr w:type="spellEnd"/>
-      <w:r>
-        <w:rPr>
-          <w:lang w:val="en-US"/>
-        </w:rPr>
-        <w:t xml:space="preserve"> is crucial for distance-based models, </w:t>
-      </w:r>
-      <w:proofErr w:type="spellStart"/>
-      <w:r>
-        <w:rPr>
-          <w:lang w:val="en-US"/>
-        </w:rPr>
-        <w:t>andpolynomial</w:t>
-      </w:r>
-      <w:proofErr w:type="spellEnd"/>
-      <w:r>
-        <w:rPr>
-          <w:lang w:val="en-US"/>
-        </w:rPr>
-        <w:t xml:space="preserve"> features can significantly boost linear models. However, the scaler must be fitted only on training data to prevent data leakage.</w:t>
-      </w:r>
-    </w:p>
-    <w:p>
-      <w:pPr>
+        <w:spacing w:line="276" w:lineRule="auto"/>
+        <w:ind w:left="851" w:hanging="284"/>
+        <w:rPr>
+          <w:lang w:val="en-US"/>
+        </w:rPr>
+      </w:pPr>
+      <w:r>
+        <w:rPr>
+          <w:lang w:val="en-US"/>
+        </w:rPr>
+        <w:t>Data preprocessing matters: StandardScaler is crucial for distance</w:t>
+      </w:r>
+      <w:r>
+        <w:rPr>
+          <w:lang w:val="en-US"/>
+        </w:rPr>
+        <w:t xml:space="preserve"> </w:t>
+      </w:r>
+      <w:r>
+        <w:rPr>
+          <w:lang w:val="en-US"/>
+        </w:rPr>
+        <w:t>based models, and</w:t>
+      </w:r>
+      <w:r>
+        <w:rPr>
+          <w:lang w:val="en-US"/>
+        </w:rPr>
+        <w:t xml:space="preserve"> </w:t>
+      </w:r>
+      <w:r>
+        <w:rPr>
+          <w:lang w:val="en-US"/>
+        </w:rPr>
+        <w:t>polynomial features can significantly boost linear models. However, the scaler must be fitted only on training data to prevent data leakage.</w:t>
+      </w:r>
+    </w:p>
+    <w:p>
+      <w:pPr>
+        <w:pStyle w:val="ListeParagraf"/>
         <w:numPr>
           <w:ilvl w:val="0"/>
-          <w:numId w:val="6"/>
+          <w:numId w:val="13"/>
         </w:numPr>
-        <w:ind w:left="567" w:firstLine="0"/>
-        <w:rPr>
-          <w:lang w:val="en-US"/>
-        </w:rPr>
-      </w:pPr>
-      <w:r>
-        <w:rPr>
-          <w:lang w:val="en-US"/>
-        </w:rPr>
-        <w:t xml:space="preserve">Trying multiple model families is essential. No single algorithm dominates across all </w:t>
-      </w:r>
-      <w:proofErr w:type="spellStart"/>
-      <w:r>
-        <w:rPr>
-          <w:lang w:val="en-US"/>
-        </w:rPr>
-        <w:t>problemtypes</w:t>
-      </w:r>
-      <w:proofErr w:type="spellEnd"/>
-      <w:r>
-        <w:rPr>
-          <w:lang w:val="en-US"/>
-        </w:rPr>
-        <w:t>. In this case, SVR outperformed complex ensemble methods, demonstrating that model complexity does not always correlate with accuracy.</w:t>
-      </w:r>
-    </w:p>
-    <w:p>
-      <w:pPr>
+        <w:spacing w:line="276" w:lineRule="auto"/>
+        <w:ind w:left="851" w:hanging="284"/>
+        <w:rPr>
+          <w:lang w:val="en-US"/>
+        </w:rPr>
+      </w:pPr>
+      <w:r>
+        <w:rPr>
+          <w:lang w:val="en-US"/>
+        </w:rPr>
+        <w:lastRenderedPageBreak/>
+        <w:t>Trying multiple model families is essential. No single algorithm dominates across all problem</w:t>
+      </w:r>
+      <w:r>
+        <w:rPr>
+          <w:lang w:val="en-US"/>
+        </w:rPr>
+        <w:t xml:space="preserve"> </w:t>
+      </w:r>
+      <w:r>
+        <w:rPr>
+          <w:lang w:val="en-US"/>
+        </w:rPr>
+        <w:t>types. In this case, SVR outperformed complex ensemble methods, demonstrating that model complexity does not always correlate with accuracy.</w:t>
+      </w:r>
+    </w:p>
+    <w:p>
+      <w:pPr>
+        <w:pStyle w:val="ListeParagraf"/>
         <w:numPr>
           <w:ilvl w:val="0"/>
-          <w:numId w:val="6"/>
+          <w:numId w:val="13"/>
         </w:numPr>
-        <w:ind w:left="567" w:firstLine="0"/>
-        <w:rPr>
-          <w:lang w:val="en-US"/>
-        </w:rPr>
-      </w:pPr>
-      <w:r>
-        <w:rPr>
-          <w:lang w:val="en-US"/>
-        </w:rPr>
-        <w:t xml:space="preserve">Understanding data characteristics (skewness, correlations, outliers) before model </w:t>
-      </w:r>
-      <w:proofErr w:type="spellStart"/>
-      <w:r>
-        <w:rPr>
-          <w:lang w:val="en-US"/>
-        </w:rPr>
-        <w:t>trainingguides</w:t>
-      </w:r>
-      <w:proofErr w:type="spellEnd"/>
-      <w:r>
-        <w:rPr>
-          <w:lang w:val="en-US"/>
-        </w:rPr>
-        <w:t xml:space="preserve"> better preprocessing and model selection decisions.</w:t>
+        <w:spacing w:line="276" w:lineRule="auto"/>
+        <w:ind w:left="851" w:hanging="284"/>
+        <w:rPr>
+          <w:lang w:val="en-US"/>
+        </w:rPr>
+      </w:pPr>
+      <w:r>
+        <w:rPr>
+          <w:lang w:val="en-US"/>
+        </w:rPr>
+        <w:t>Understanding data characteristics (skewness, correlations, outliers) before model training</w:t>
+      </w:r>
+      <w:r>
+        <w:rPr>
+          <w:lang w:val="en-US"/>
+        </w:rPr>
+        <w:t xml:space="preserve"> </w:t>
+      </w:r>
+      <w:r>
+        <w:rPr>
+          <w:lang w:val="en-US"/>
+        </w:rPr>
+        <w:t>guides better preprocessing and model selection decisions.</w:t>
       </w:r>
     </w:p>
     <w:p>
       <w:pPr>
         <w:pStyle w:val="Balk2"/>
+        <w:spacing w:line="276" w:lineRule="auto"/>
         <w:ind w:left="419" w:hanging="434"/>
         <w:rPr>
           <w:lang w:val="en-US"/>
@@ -6264,6 +6431,7 @@
     </w:p>
     <w:p>
       <w:pPr>
+        <w:spacing w:line="276" w:lineRule="auto"/>
         <w:ind w:left="-5"/>
         <w:rPr>
           <w:lang w:val="en-US"/>
@@ -6273,21 +6441,19 @@
         <w:rPr>
           <w:lang w:val="en-US"/>
         </w:rPr>
-        <w:t xml:space="preserve">Potential improvements include: (1) hyperparameter optimization via </w:t>
-      </w:r>
-      <w:proofErr w:type="spellStart"/>
-      <w:r>
-        <w:rPr>
-          <w:lang w:val="en-US"/>
-        </w:rPr>
-        <w:t>GridSearchCV</w:t>
-      </w:r>
-      <w:proofErr w:type="spellEnd"/>
-      <w:r>
-        <w:rPr>
-          <w:lang w:val="en-US"/>
-        </w:rPr>
-        <w:t xml:space="preserve"> or Bayesian optimization, (2) log-transformation of Y to address skewness, (3) feature engineering based on domain knowledge, (4) ensemble stacking of top models, and (5) collecting additional training data if possible.</w:t>
+        <w:t>Potential improvements include: (1) hyperparameter optimization via GridSearchCV or Bayesian optimization, (2) log</w:t>
+      </w:r>
+      <w:r>
+        <w:rPr>
+          <w:lang w:val="en-US"/>
+        </w:rPr>
+        <w:t xml:space="preserve"> </w:t>
+      </w:r>
+      <w:r>
+        <w:rPr>
+          <w:lang w:val="en-US"/>
+        </w:rPr>
+        <w:t>transformation of Y to address skewness, (3) feature engineering based on domain knowledge, (4) ensemble stacking of top models, and (5) collecting additional training data if possible.</w:t>
       </w:r>
     </w:p>
     <w:sectPr>
@@ -6339,23 +6505,13 @@
       <w:ind w:left="0" w:right="107" w:firstLine="0"/>
       <w:jc w:val="center"/>
     </w:pPr>
-    <w:proofErr w:type="spellStart"/>
     <w:r>
       <w:rPr>
         <w:i/>
         <w:color w:val="808080"/>
         <w:sz w:val="16"/>
       </w:rPr>
-      <w:t>Page</w:t>
-    </w:r>
-    <w:proofErr w:type="spellEnd"/>
-    <w:r>
-      <w:rPr>
-        <w:i/>
-        <w:color w:val="808080"/>
-        <w:sz w:val="16"/>
-      </w:rPr>
-      <w:t xml:space="preserve"> </w:t>
+      <w:t xml:space="preserve">Page </w:t>
     </w:r>
     <w:r>
       <w:fldChar w:fldCharType="begin"/>
@@ -6517,23 +6673,13 @@
       <w:ind w:left="0" w:right="107" w:firstLine="0"/>
       <w:jc w:val="center"/>
     </w:pPr>
-    <w:proofErr w:type="spellStart"/>
     <w:r>
       <w:rPr>
         <w:i/>
         <w:color w:val="808080"/>
         <w:sz w:val="16"/>
       </w:rPr>
-      <w:t>Page</w:t>
-    </w:r>
-    <w:proofErr w:type="spellEnd"/>
-    <w:r>
-      <w:rPr>
-        <w:i/>
-        <w:color w:val="808080"/>
-        <w:sz w:val="16"/>
-      </w:rPr>
-      <w:t xml:space="preserve"> </w:t>
+      <w:t xml:space="preserve">Page </w:t>
     </w:r>
     <w:r>
       <w:fldChar w:fldCharType="begin"/>
@@ -6718,54 +6864,8 @@
         <w:color w:val="646464"/>
         <w:sz w:val="20"/>
       </w:rPr>
-      <w:t xml:space="preserve">CE </w:t>
+      <w:t>CE 475 - Machine Learning Term Paper</w:t>
     </w:r>
-    <w:proofErr w:type="gramStart"/>
-    <w:r>
-      <w:rPr>
-        <w:b/>
-        <w:color w:val="646464"/>
-        <w:sz w:val="20"/>
-      </w:rPr>
-      <w:t>475 -</w:t>
-    </w:r>
-    <w:proofErr w:type="gramEnd"/>
-    <w:r>
-      <w:rPr>
-        <w:b/>
-        <w:color w:val="646464"/>
-        <w:sz w:val="20"/>
-      </w:rPr>
-      <w:t xml:space="preserve"> Machine Learning </w:t>
-    </w:r>
-    <w:proofErr w:type="spellStart"/>
-    <w:r>
-      <w:rPr>
-        <w:b/>
-        <w:color w:val="646464"/>
-        <w:sz w:val="20"/>
-      </w:rPr>
-      <w:t>Term</w:t>
-    </w:r>
-    <w:proofErr w:type="spellEnd"/>
-    <w:r>
-      <w:rPr>
-        <w:b/>
-        <w:color w:val="646464"/>
-        <w:sz w:val="20"/>
-      </w:rPr>
-      <w:t xml:space="preserve"> </w:t>
-    </w:r>
-    <w:proofErr w:type="spellStart"/>
-    <w:r>
-      <w:rPr>
-        <w:b/>
-        <w:color w:val="646464"/>
-        <w:sz w:val="20"/>
-      </w:rPr>
-      <w:t>Paper</w:t>
-    </w:r>
-    <w:proofErr w:type="spellEnd"/>
   </w:p>
 </w:hdr>
 </file>
@@ -6893,8 +6993,29 @@
         <w:sz w:val="20"/>
         <w:lang w:val="en-US"/>
       </w:rPr>
-      <w:t>CE 475 - Machine Learning Term Paper</w:t>
+      <w:t xml:space="preserve">CE 475 - Machine Learning </w:t>
     </w:r>
+    <w:r>
+      <w:rPr>
+        <w:b/>
+        <w:color w:val="646464"/>
+        <w:sz w:val="20"/>
+        <w:lang w:val="en-US"/>
+      </w:rPr>
+      <w:t>Project Report</w:t>
+    </w:r>
+  </w:p>
+  <w:p>
+    <w:pPr>
+      <w:spacing w:after="0" w:line="259" w:lineRule="auto"/>
+      <w:ind w:left="0" w:firstLine="0"/>
+      <w:rPr>
+        <w:b/>
+        <w:color w:val="646464"/>
+        <w:sz w:val="20"/>
+        <w:lang w:val="en-US"/>
+      </w:rPr>
+    </w:pPr>
   </w:p>
 </w:hdr>
 </file>
@@ -7010,54 +7131,8 @@
         <w:color w:val="646464"/>
         <w:sz w:val="20"/>
       </w:rPr>
-      <w:t xml:space="preserve">CE </w:t>
+      <w:t>CE 475 - Machine Learning Term Paper</w:t>
     </w:r>
-    <w:proofErr w:type="gramStart"/>
-    <w:r>
-      <w:rPr>
-        <w:b/>
-        <w:color w:val="646464"/>
-        <w:sz w:val="20"/>
-      </w:rPr>
-      <w:t>475 -</w:t>
-    </w:r>
-    <w:proofErr w:type="gramEnd"/>
-    <w:r>
-      <w:rPr>
-        <w:b/>
-        <w:color w:val="646464"/>
-        <w:sz w:val="20"/>
-      </w:rPr>
-      <w:t xml:space="preserve"> Machine Learning </w:t>
-    </w:r>
-    <w:proofErr w:type="spellStart"/>
-    <w:r>
-      <w:rPr>
-        <w:b/>
-        <w:color w:val="646464"/>
-        <w:sz w:val="20"/>
-      </w:rPr>
-      <w:t>Term</w:t>
-    </w:r>
-    <w:proofErr w:type="spellEnd"/>
-    <w:r>
-      <w:rPr>
-        <w:b/>
-        <w:color w:val="646464"/>
-        <w:sz w:val="20"/>
-      </w:rPr>
-      <w:t xml:space="preserve"> </w:t>
-    </w:r>
-    <w:proofErr w:type="spellStart"/>
-    <w:r>
-      <w:rPr>
-        <w:b/>
-        <w:color w:val="646464"/>
-        <w:sz w:val="20"/>
-      </w:rPr>
-      <w:t>Paper</w:t>
-    </w:r>
-    <w:proofErr w:type="spellEnd"/>
   </w:p>
 </w:hdr>
 </file>
@@ -7489,6 +7564,119 @@
     </w:lvl>
   </w:abstractNum>
   <w:abstractNum w:abstractNumId="2" w15:restartNumberingAfterBreak="0">
+    <w:nsid w:val="1CF46690"/>
+    <w:multiLevelType w:val="hybridMultilevel"/>
+    <w:tmpl w:val="F0E8B78A"/>
+    <w:lvl w:ilvl="0" w:tplc="041F0001">
+      <w:start w:val="1"/>
+      <w:numFmt w:val="bullet"/>
+      <w:lvlText w:val=""/>
+      <w:lvlJc w:val="left"/>
+      <w:pPr>
+        <w:ind w:left="1287" w:hanging="360"/>
+      </w:pPr>
+      <w:rPr>
+        <w:rFonts w:ascii="Symbol" w:hAnsi="Symbol" w:hint="default"/>
+      </w:rPr>
+    </w:lvl>
+    <w:lvl w:ilvl="1" w:tplc="041F0003" w:tentative="1">
+      <w:start w:val="1"/>
+      <w:numFmt w:val="bullet"/>
+      <w:lvlText w:val="o"/>
+      <w:lvlJc w:val="left"/>
+      <w:pPr>
+        <w:ind w:left="2007" w:hanging="360"/>
+      </w:pPr>
+      <w:rPr>
+        <w:rFonts w:ascii="Courier New" w:hAnsi="Courier New" w:cs="Courier New" w:hint="default"/>
+      </w:rPr>
+    </w:lvl>
+    <w:lvl w:ilvl="2" w:tplc="041F0005" w:tentative="1">
+      <w:start w:val="1"/>
+      <w:numFmt w:val="bullet"/>
+      <w:lvlText w:val=""/>
+      <w:lvlJc w:val="left"/>
+      <w:pPr>
+        <w:ind w:left="2727" w:hanging="360"/>
+      </w:pPr>
+      <w:rPr>
+        <w:rFonts w:ascii="Wingdings" w:hAnsi="Wingdings" w:hint="default"/>
+      </w:rPr>
+    </w:lvl>
+    <w:lvl w:ilvl="3" w:tplc="041F0001" w:tentative="1">
+      <w:start w:val="1"/>
+      <w:numFmt w:val="bullet"/>
+      <w:lvlText w:val=""/>
+      <w:lvlJc w:val="left"/>
+      <w:pPr>
+        <w:ind w:left="3447" w:hanging="360"/>
+      </w:pPr>
+      <w:rPr>
+        <w:rFonts w:ascii="Symbol" w:hAnsi="Symbol" w:hint="default"/>
+      </w:rPr>
+    </w:lvl>
+    <w:lvl w:ilvl="4" w:tplc="041F0003" w:tentative="1">
+      <w:start w:val="1"/>
+      <w:numFmt w:val="bullet"/>
+      <w:lvlText w:val="o"/>
+      <w:lvlJc w:val="left"/>
+      <w:pPr>
+        <w:ind w:left="4167" w:hanging="360"/>
+      </w:pPr>
+      <w:rPr>
+        <w:rFonts w:ascii="Courier New" w:hAnsi="Courier New" w:cs="Courier New" w:hint="default"/>
+      </w:rPr>
+    </w:lvl>
+    <w:lvl w:ilvl="5" w:tplc="041F0005" w:tentative="1">
+      <w:start w:val="1"/>
+      <w:numFmt w:val="bullet"/>
+      <w:lvlText w:val=""/>
+      <w:lvlJc w:val="left"/>
+      <w:pPr>
+        <w:ind w:left="4887" w:hanging="360"/>
+      </w:pPr>
+      <w:rPr>
+        <w:rFonts w:ascii="Wingdings" w:hAnsi="Wingdings" w:hint="default"/>
+      </w:rPr>
+    </w:lvl>
+    <w:lvl w:ilvl="6" w:tplc="041F0001" w:tentative="1">
+      <w:start w:val="1"/>
+      <w:numFmt w:val="bullet"/>
+      <w:lvlText w:val=""/>
+      <w:lvlJc w:val="left"/>
+      <w:pPr>
+        <w:ind w:left="5607" w:hanging="360"/>
+      </w:pPr>
+      <w:rPr>
+        <w:rFonts w:ascii="Symbol" w:hAnsi="Symbol" w:hint="default"/>
+      </w:rPr>
+    </w:lvl>
+    <w:lvl w:ilvl="7" w:tplc="041F0003" w:tentative="1">
+      <w:start w:val="1"/>
+      <w:numFmt w:val="bullet"/>
+      <w:lvlText w:val="o"/>
+      <w:lvlJc w:val="left"/>
+      <w:pPr>
+        <w:ind w:left="6327" w:hanging="360"/>
+      </w:pPr>
+      <w:rPr>
+        <w:rFonts w:ascii="Courier New" w:hAnsi="Courier New" w:cs="Courier New" w:hint="default"/>
+      </w:rPr>
+    </w:lvl>
+    <w:lvl w:ilvl="8" w:tplc="041F0005" w:tentative="1">
+      <w:start w:val="1"/>
+      <w:numFmt w:val="bullet"/>
+      <w:lvlText w:val=""/>
+      <w:lvlJc w:val="left"/>
+      <w:pPr>
+        <w:ind w:left="7047" w:hanging="360"/>
+      </w:pPr>
+      <w:rPr>
+        <w:rFonts w:ascii="Wingdings" w:hAnsi="Wingdings" w:hint="default"/>
+      </w:rPr>
+    </w:lvl>
+  </w:abstractNum>
+  <w:abstractNum w:abstractNumId="3" w15:restartNumberingAfterBreak="0">
     <w:nsid w:val="28A91210"/>
     <w:multiLevelType w:val="hybridMultilevel"/>
     <w:tmpl w:val="616E1544"/>
@@ -7700,7 +7888,7 @@
       </w:rPr>
     </w:lvl>
   </w:abstractNum>
-  <w:abstractNum w:abstractNumId="3" w15:restartNumberingAfterBreak="0">
+  <w:abstractNum w:abstractNumId="4" w15:restartNumberingAfterBreak="0">
     <w:nsid w:val="29391DC5"/>
     <w:multiLevelType w:val="hybridMultilevel"/>
     <w:tmpl w:val="869474B8"/>
@@ -7912,7 +8100,233 @@
       </w:rPr>
     </w:lvl>
   </w:abstractNum>
-  <w:abstractNum w:abstractNumId="4" w15:restartNumberingAfterBreak="0">
+  <w:abstractNum w:abstractNumId="5" w15:restartNumberingAfterBreak="0">
+    <w:nsid w:val="2C516A15"/>
+    <w:multiLevelType w:val="hybridMultilevel"/>
+    <w:tmpl w:val="DB74981A"/>
+    <w:lvl w:ilvl="0" w:tplc="041F0001">
+      <w:start w:val="1"/>
+      <w:numFmt w:val="bullet"/>
+      <w:lvlText w:val=""/>
+      <w:lvlJc w:val="left"/>
+      <w:pPr>
+        <w:ind w:left="1287" w:hanging="360"/>
+      </w:pPr>
+      <w:rPr>
+        <w:rFonts w:ascii="Symbol" w:hAnsi="Symbol" w:hint="default"/>
+      </w:rPr>
+    </w:lvl>
+    <w:lvl w:ilvl="1" w:tplc="041F0003" w:tentative="1">
+      <w:start w:val="1"/>
+      <w:numFmt w:val="bullet"/>
+      <w:lvlText w:val="o"/>
+      <w:lvlJc w:val="left"/>
+      <w:pPr>
+        <w:ind w:left="2007" w:hanging="360"/>
+      </w:pPr>
+      <w:rPr>
+        <w:rFonts w:ascii="Courier New" w:hAnsi="Courier New" w:cs="Courier New" w:hint="default"/>
+      </w:rPr>
+    </w:lvl>
+    <w:lvl w:ilvl="2" w:tplc="041F0005" w:tentative="1">
+      <w:start w:val="1"/>
+      <w:numFmt w:val="bullet"/>
+      <w:lvlText w:val=""/>
+      <w:lvlJc w:val="left"/>
+      <w:pPr>
+        <w:ind w:left="2727" w:hanging="360"/>
+      </w:pPr>
+      <w:rPr>
+        <w:rFonts w:ascii="Wingdings" w:hAnsi="Wingdings" w:hint="default"/>
+      </w:rPr>
+    </w:lvl>
+    <w:lvl w:ilvl="3" w:tplc="041F0001" w:tentative="1">
+      <w:start w:val="1"/>
+      <w:numFmt w:val="bullet"/>
+      <w:lvlText w:val=""/>
+      <w:lvlJc w:val="left"/>
+      <w:pPr>
+        <w:ind w:left="3447" w:hanging="360"/>
+      </w:pPr>
+      <w:rPr>
+        <w:rFonts w:ascii="Symbol" w:hAnsi="Symbol" w:hint="default"/>
+      </w:rPr>
+    </w:lvl>
+    <w:lvl w:ilvl="4" w:tplc="041F0003" w:tentative="1">
+      <w:start w:val="1"/>
+      <w:numFmt w:val="bullet"/>
+      <w:lvlText w:val="o"/>
+      <w:lvlJc w:val="left"/>
+      <w:pPr>
+        <w:ind w:left="4167" w:hanging="360"/>
+      </w:pPr>
+      <w:rPr>
+        <w:rFonts w:ascii="Courier New" w:hAnsi="Courier New" w:cs="Courier New" w:hint="default"/>
+      </w:rPr>
+    </w:lvl>
+    <w:lvl w:ilvl="5" w:tplc="041F0005" w:tentative="1">
+      <w:start w:val="1"/>
+      <w:numFmt w:val="bullet"/>
+      <w:lvlText w:val=""/>
+      <w:lvlJc w:val="left"/>
+      <w:pPr>
+        <w:ind w:left="4887" w:hanging="360"/>
+      </w:pPr>
+      <w:rPr>
+        <w:rFonts w:ascii="Wingdings" w:hAnsi="Wingdings" w:hint="default"/>
+      </w:rPr>
+    </w:lvl>
+    <w:lvl w:ilvl="6" w:tplc="041F0001" w:tentative="1">
+      <w:start w:val="1"/>
+      <w:numFmt w:val="bullet"/>
+      <w:lvlText w:val=""/>
+      <w:lvlJc w:val="left"/>
+      <w:pPr>
+        <w:ind w:left="5607" w:hanging="360"/>
+      </w:pPr>
+      <w:rPr>
+        <w:rFonts w:ascii="Symbol" w:hAnsi="Symbol" w:hint="default"/>
+      </w:rPr>
+    </w:lvl>
+    <w:lvl w:ilvl="7" w:tplc="041F0003" w:tentative="1">
+      <w:start w:val="1"/>
+      <w:numFmt w:val="bullet"/>
+      <w:lvlText w:val="o"/>
+      <w:lvlJc w:val="left"/>
+      <w:pPr>
+        <w:ind w:left="6327" w:hanging="360"/>
+      </w:pPr>
+      <w:rPr>
+        <w:rFonts w:ascii="Courier New" w:hAnsi="Courier New" w:cs="Courier New" w:hint="default"/>
+      </w:rPr>
+    </w:lvl>
+    <w:lvl w:ilvl="8" w:tplc="041F0005" w:tentative="1">
+      <w:start w:val="1"/>
+      <w:numFmt w:val="bullet"/>
+      <w:lvlText w:val=""/>
+      <w:lvlJc w:val="left"/>
+      <w:pPr>
+        <w:ind w:left="7047" w:hanging="360"/>
+      </w:pPr>
+      <w:rPr>
+        <w:rFonts w:ascii="Wingdings" w:hAnsi="Wingdings" w:hint="default"/>
+      </w:rPr>
+    </w:lvl>
+  </w:abstractNum>
+  <w:abstractNum w:abstractNumId="6" w15:restartNumberingAfterBreak="0">
+    <w:nsid w:val="309C0807"/>
+    <w:multiLevelType w:val="hybridMultilevel"/>
+    <w:tmpl w:val="3A58B694"/>
+    <w:lvl w:ilvl="0" w:tplc="041F0001">
+      <w:start w:val="1"/>
+      <w:numFmt w:val="bullet"/>
+      <w:lvlText w:val=""/>
+      <w:lvlJc w:val="left"/>
+      <w:pPr>
+        <w:ind w:left="1287" w:hanging="360"/>
+      </w:pPr>
+      <w:rPr>
+        <w:rFonts w:ascii="Symbol" w:hAnsi="Symbol" w:hint="default"/>
+      </w:rPr>
+    </w:lvl>
+    <w:lvl w:ilvl="1" w:tplc="041F0003" w:tentative="1">
+      <w:start w:val="1"/>
+      <w:numFmt w:val="bullet"/>
+      <w:lvlText w:val="o"/>
+      <w:lvlJc w:val="left"/>
+      <w:pPr>
+        <w:ind w:left="2007" w:hanging="360"/>
+      </w:pPr>
+      <w:rPr>
+        <w:rFonts w:ascii="Courier New" w:hAnsi="Courier New" w:cs="Courier New" w:hint="default"/>
+      </w:rPr>
+    </w:lvl>
+    <w:lvl w:ilvl="2" w:tplc="041F0005" w:tentative="1">
+      <w:start w:val="1"/>
+      <w:numFmt w:val="bullet"/>
+      <w:lvlText w:val=""/>
+      <w:lvlJc w:val="left"/>
+      <w:pPr>
+        <w:ind w:left="2727" w:hanging="360"/>
+      </w:pPr>
+      <w:rPr>
+        <w:rFonts w:ascii="Wingdings" w:hAnsi="Wingdings" w:hint="default"/>
+      </w:rPr>
+    </w:lvl>
+    <w:lvl w:ilvl="3" w:tplc="041F0001" w:tentative="1">
+      <w:start w:val="1"/>
+      <w:numFmt w:val="bullet"/>
+      <w:lvlText w:val=""/>
+      <w:lvlJc w:val="left"/>
+      <w:pPr>
+        <w:ind w:left="3447" w:hanging="360"/>
+      </w:pPr>
+      <w:rPr>
+        <w:rFonts w:ascii="Symbol" w:hAnsi="Symbol" w:hint="default"/>
+      </w:rPr>
+    </w:lvl>
+    <w:lvl w:ilvl="4" w:tplc="041F0003" w:tentative="1">
+      <w:start w:val="1"/>
+      <w:numFmt w:val="bullet"/>
+      <w:lvlText w:val="o"/>
+      <w:lvlJc w:val="left"/>
+      <w:pPr>
+        <w:ind w:left="4167" w:hanging="360"/>
+      </w:pPr>
+      <w:rPr>
+        <w:rFonts w:ascii="Courier New" w:hAnsi="Courier New" w:cs="Courier New" w:hint="default"/>
+      </w:rPr>
+    </w:lvl>
+    <w:lvl w:ilvl="5" w:tplc="041F0005" w:tentative="1">
+      <w:start w:val="1"/>
+      <w:numFmt w:val="bullet"/>
+      <w:lvlText w:val=""/>
+      <w:lvlJc w:val="left"/>
+      <w:pPr>
+        <w:ind w:left="4887" w:hanging="360"/>
+      </w:pPr>
+      <w:rPr>
+        <w:rFonts w:ascii="Wingdings" w:hAnsi="Wingdings" w:hint="default"/>
+      </w:rPr>
+    </w:lvl>
+    <w:lvl w:ilvl="6" w:tplc="041F0001" w:tentative="1">
+      <w:start w:val="1"/>
+      <w:numFmt w:val="bullet"/>
+      <w:lvlText w:val=""/>
+      <w:lvlJc w:val="left"/>
+      <w:pPr>
+        <w:ind w:left="5607" w:hanging="360"/>
+      </w:pPr>
+      <w:rPr>
+        <w:rFonts w:ascii="Symbol" w:hAnsi="Symbol" w:hint="default"/>
+      </w:rPr>
+    </w:lvl>
+    <w:lvl w:ilvl="7" w:tplc="041F0003" w:tentative="1">
+      <w:start w:val="1"/>
+      <w:numFmt w:val="bullet"/>
+      <w:lvlText w:val="o"/>
+      <w:lvlJc w:val="left"/>
+      <w:pPr>
+        <w:ind w:left="6327" w:hanging="360"/>
+      </w:pPr>
+      <w:rPr>
+        <w:rFonts w:ascii="Courier New" w:hAnsi="Courier New" w:cs="Courier New" w:hint="default"/>
+      </w:rPr>
+    </w:lvl>
+    <w:lvl w:ilvl="8" w:tplc="041F0005" w:tentative="1">
+      <w:start w:val="1"/>
+      <w:numFmt w:val="bullet"/>
+      <w:lvlText w:val=""/>
+      <w:lvlJc w:val="left"/>
+      <w:pPr>
+        <w:ind w:left="7047" w:hanging="360"/>
+      </w:pPr>
+      <w:rPr>
+        <w:rFonts w:ascii="Wingdings" w:hAnsi="Wingdings" w:hint="default"/>
+      </w:rPr>
+    </w:lvl>
+  </w:abstractNum>
+  <w:abstractNum w:abstractNumId="7" w15:restartNumberingAfterBreak="0">
     <w:nsid w:val="35B346CD"/>
     <w:multiLevelType w:val="hybridMultilevel"/>
     <w:tmpl w:val="DB609D72"/>
@@ -8025,7 +8439,7 @@
       </w:rPr>
     </w:lvl>
   </w:abstractNum>
-  <w:abstractNum w:abstractNumId="5" w15:restartNumberingAfterBreak="0">
+  <w:abstractNum w:abstractNumId="8" w15:restartNumberingAfterBreak="0">
     <w:nsid w:val="3D8E2B81"/>
     <w:multiLevelType w:val="multilevel"/>
     <w:tmpl w:val="59F6B284"/>
@@ -8248,7 +8662,7 @@
       </w:rPr>
     </w:lvl>
   </w:abstractNum>
-  <w:abstractNum w:abstractNumId="6" w15:restartNumberingAfterBreak="0">
+  <w:abstractNum w:abstractNumId="9" w15:restartNumberingAfterBreak="0">
     <w:nsid w:val="58CB2DEC"/>
     <w:multiLevelType w:val="hybridMultilevel"/>
     <w:tmpl w:val="C50CE618"/>
@@ -8460,7 +8874,120 @@
       </w:rPr>
     </w:lvl>
   </w:abstractNum>
-  <w:abstractNum w:abstractNumId="7" w15:restartNumberingAfterBreak="0">
+  <w:abstractNum w:abstractNumId="10" w15:restartNumberingAfterBreak="0">
+    <w:nsid w:val="5B621759"/>
+    <w:multiLevelType w:val="hybridMultilevel"/>
+    <w:tmpl w:val="AFF86D9E"/>
+    <w:lvl w:ilvl="0" w:tplc="041F0001">
+      <w:start w:val="1"/>
+      <w:numFmt w:val="bullet"/>
+      <w:lvlText w:val=""/>
+      <w:lvlJc w:val="left"/>
+      <w:pPr>
+        <w:ind w:left="1287" w:hanging="360"/>
+      </w:pPr>
+      <w:rPr>
+        <w:rFonts w:ascii="Symbol" w:hAnsi="Symbol" w:hint="default"/>
+      </w:rPr>
+    </w:lvl>
+    <w:lvl w:ilvl="1" w:tplc="041F0003" w:tentative="1">
+      <w:start w:val="1"/>
+      <w:numFmt w:val="bullet"/>
+      <w:lvlText w:val="o"/>
+      <w:lvlJc w:val="left"/>
+      <w:pPr>
+        <w:ind w:left="2007" w:hanging="360"/>
+      </w:pPr>
+      <w:rPr>
+        <w:rFonts w:ascii="Courier New" w:hAnsi="Courier New" w:cs="Courier New" w:hint="default"/>
+      </w:rPr>
+    </w:lvl>
+    <w:lvl w:ilvl="2" w:tplc="041F0005" w:tentative="1">
+      <w:start w:val="1"/>
+      <w:numFmt w:val="bullet"/>
+      <w:lvlText w:val=""/>
+      <w:lvlJc w:val="left"/>
+      <w:pPr>
+        <w:ind w:left="2727" w:hanging="360"/>
+      </w:pPr>
+      <w:rPr>
+        <w:rFonts w:ascii="Wingdings" w:hAnsi="Wingdings" w:hint="default"/>
+      </w:rPr>
+    </w:lvl>
+    <w:lvl w:ilvl="3" w:tplc="041F0001" w:tentative="1">
+      <w:start w:val="1"/>
+      <w:numFmt w:val="bullet"/>
+      <w:lvlText w:val=""/>
+      <w:lvlJc w:val="left"/>
+      <w:pPr>
+        <w:ind w:left="3447" w:hanging="360"/>
+      </w:pPr>
+      <w:rPr>
+        <w:rFonts w:ascii="Symbol" w:hAnsi="Symbol" w:hint="default"/>
+      </w:rPr>
+    </w:lvl>
+    <w:lvl w:ilvl="4" w:tplc="041F0003" w:tentative="1">
+      <w:start w:val="1"/>
+      <w:numFmt w:val="bullet"/>
+      <w:lvlText w:val="o"/>
+      <w:lvlJc w:val="left"/>
+      <w:pPr>
+        <w:ind w:left="4167" w:hanging="360"/>
+      </w:pPr>
+      <w:rPr>
+        <w:rFonts w:ascii="Courier New" w:hAnsi="Courier New" w:cs="Courier New" w:hint="default"/>
+      </w:rPr>
+    </w:lvl>
+    <w:lvl w:ilvl="5" w:tplc="041F0005" w:tentative="1">
+      <w:start w:val="1"/>
+      <w:numFmt w:val="bullet"/>
+      <w:lvlText w:val=""/>
+      <w:lvlJc w:val="left"/>
+      <w:pPr>
+        <w:ind w:left="4887" w:hanging="360"/>
+      </w:pPr>
+      <w:rPr>
+        <w:rFonts w:ascii="Wingdings" w:hAnsi="Wingdings" w:hint="default"/>
+      </w:rPr>
+    </w:lvl>
+    <w:lvl w:ilvl="6" w:tplc="041F0001" w:tentative="1">
+      <w:start w:val="1"/>
+      <w:numFmt w:val="bullet"/>
+      <w:lvlText w:val=""/>
+      <w:lvlJc w:val="left"/>
+      <w:pPr>
+        <w:ind w:left="5607" w:hanging="360"/>
+      </w:pPr>
+      <w:rPr>
+        <w:rFonts w:ascii="Symbol" w:hAnsi="Symbol" w:hint="default"/>
+      </w:rPr>
+    </w:lvl>
+    <w:lvl w:ilvl="7" w:tplc="041F0003" w:tentative="1">
+      <w:start w:val="1"/>
+      <w:numFmt w:val="bullet"/>
+      <w:lvlText w:val="o"/>
+      <w:lvlJc w:val="left"/>
+      <w:pPr>
+        <w:ind w:left="6327" w:hanging="360"/>
+      </w:pPr>
+      <w:rPr>
+        <w:rFonts w:ascii="Courier New" w:hAnsi="Courier New" w:cs="Courier New" w:hint="default"/>
+      </w:rPr>
+    </w:lvl>
+    <w:lvl w:ilvl="8" w:tplc="041F0005" w:tentative="1">
+      <w:start w:val="1"/>
+      <w:numFmt w:val="bullet"/>
+      <w:lvlText w:val=""/>
+      <w:lvlJc w:val="left"/>
+      <w:pPr>
+        <w:ind w:left="7047" w:hanging="360"/>
+      </w:pPr>
+      <w:rPr>
+        <w:rFonts w:ascii="Wingdings" w:hAnsi="Wingdings" w:hint="default"/>
+      </w:rPr>
+    </w:lvl>
+  </w:abstractNum>
+  <w:abstractNum w:abstractNumId="11" w15:restartNumberingAfterBreak="0">
     <w:nsid w:val="69A05C01"/>
     <w:multiLevelType w:val="hybridMultilevel"/>
     <w:tmpl w:val="DBA6EFDA"/>
@@ -8672,11 +9199,124 @@
       </w:rPr>
     </w:lvl>
   </w:abstractNum>
+  <w:abstractNum w:abstractNumId="12" w15:restartNumberingAfterBreak="0">
+    <w:nsid w:val="79800712"/>
+    <w:multiLevelType w:val="hybridMultilevel"/>
+    <w:tmpl w:val="C8608CCA"/>
+    <w:lvl w:ilvl="0" w:tplc="041F0001">
+      <w:start w:val="1"/>
+      <w:numFmt w:val="bullet"/>
+      <w:lvlText w:val=""/>
+      <w:lvlJc w:val="left"/>
+      <w:pPr>
+        <w:ind w:left="1287" w:hanging="360"/>
+      </w:pPr>
+      <w:rPr>
+        <w:rFonts w:ascii="Symbol" w:hAnsi="Symbol" w:hint="default"/>
+      </w:rPr>
+    </w:lvl>
+    <w:lvl w:ilvl="1" w:tplc="041F0003" w:tentative="1">
+      <w:start w:val="1"/>
+      <w:numFmt w:val="bullet"/>
+      <w:lvlText w:val="o"/>
+      <w:lvlJc w:val="left"/>
+      <w:pPr>
+        <w:ind w:left="2007" w:hanging="360"/>
+      </w:pPr>
+      <w:rPr>
+        <w:rFonts w:ascii="Courier New" w:hAnsi="Courier New" w:cs="Courier New" w:hint="default"/>
+      </w:rPr>
+    </w:lvl>
+    <w:lvl w:ilvl="2" w:tplc="041F0005" w:tentative="1">
+      <w:start w:val="1"/>
+      <w:numFmt w:val="bullet"/>
+      <w:lvlText w:val=""/>
+      <w:lvlJc w:val="left"/>
+      <w:pPr>
+        <w:ind w:left="2727" w:hanging="360"/>
+      </w:pPr>
+      <w:rPr>
+        <w:rFonts w:ascii="Wingdings" w:hAnsi="Wingdings" w:hint="default"/>
+      </w:rPr>
+    </w:lvl>
+    <w:lvl w:ilvl="3" w:tplc="041F0001" w:tentative="1">
+      <w:start w:val="1"/>
+      <w:numFmt w:val="bullet"/>
+      <w:lvlText w:val=""/>
+      <w:lvlJc w:val="left"/>
+      <w:pPr>
+        <w:ind w:left="3447" w:hanging="360"/>
+      </w:pPr>
+      <w:rPr>
+        <w:rFonts w:ascii="Symbol" w:hAnsi="Symbol" w:hint="default"/>
+      </w:rPr>
+    </w:lvl>
+    <w:lvl w:ilvl="4" w:tplc="041F0003" w:tentative="1">
+      <w:start w:val="1"/>
+      <w:numFmt w:val="bullet"/>
+      <w:lvlText w:val="o"/>
+      <w:lvlJc w:val="left"/>
+      <w:pPr>
+        <w:ind w:left="4167" w:hanging="360"/>
+      </w:pPr>
+      <w:rPr>
+        <w:rFonts w:ascii="Courier New" w:hAnsi="Courier New" w:cs="Courier New" w:hint="default"/>
+      </w:rPr>
+    </w:lvl>
+    <w:lvl w:ilvl="5" w:tplc="041F0005" w:tentative="1">
+      <w:start w:val="1"/>
+      <w:numFmt w:val="bullet"/>
+      <w:lvlText w:val=""/>
+      <w:lvlJc w:val="left"/>
+      <w:pPr>
+        <w:ind w:left="4887" w:hanging="360"/>
+      </w:pPr>
+      <w:rPr>
+        <w:rFonts w:ascii="Wingdings" w:hAnsi="Wingdings" w:hint="default"/>
+      </w:rPr>
+    </w:lvl>
+    <w:lvl w:ilvl="6" w:tplc="041F0001" w:tentative="1">
+      <w:start w:val="1"/>
+      <w:numFmt w:val="bullet"/>
+      <w:lvlText w:val=""/>
+      <w:lvlJc w:val="left"/>
+      <w:pPr>
+        <w:ind w:left="5607" w:hanging="360"/>
+      </w:pPr>
+      <w:rPr>
+        <w:rFonts w:ascii="Symbol" w:hAnsi="Symbol" w:hint="default"/>
+      </w:rPr>
+    </w:lvl>
+    <w:lvl w:ilvl="7" w:tplc="041F0003" w:tentative="1">
+      <w:start w:val="1"/>
+      <w:numFmt w:val="bullet"/>
+      <w:lvlText w:val="o"/>
+      <w:lvlJc w:val="left"/>
+      <w:pPr>
+        <w:ind w:left="6327" w:hanging="360"/>
+      </w:pPr>
+      <w:rPr>
+        <w:rFonts w:ascii="Courier New" w:hAnsi="Courier New" w:cs="Courier New" w:hint="default"/>
+      </w:rPr>
+    </w:lvl>
+    <w:lvl w:ilvl="8" w:tplc="041F0005" w:tentative="1">
+      <w:start w:val="1"/>
+      <w:numFmt w:val="bullet"/>
+      <w:lvlText w:val=""/>
+      <w:lvlJc w:val="left"/>
+      <w:pPr>
+        <w:ind w:left="7047" w:hanging="360"/>
+      </w:pPr>
+      <w:rPr>
+        <w:rFonts w:ascii="Wingdings" w:hAnsi="Wingdings" w:hint="default"/>
+      </w:rPr>
+    </w:lvl>
+  </w:abstractNum>
   <w:num w:numId="1" w16cid:durableId="1177842285">
-    <w:abstractNumId w:val="7"/>
+    <w:abstractNumId w:val="11"/>
   </w:num>
   <w:num w:numId="2" w16cid:durableId="507141279">
-    <w:abstractNumId w:val="3"/>
+    <w:abstractNumId w:val="4"/>
   </w:num>
   <w:num w:numId="3" w16cid:durableId="653073657">
     <w:abstractNumId w:val="1"/>
@@ -8685,16 +9325,31 @@
     <w:abstractNumId w:val="0"/>
   </w:num>
   <w:num w:numId="5" w16cid:durableId="1112089889">
+    <w:abstractNumId w:val="9"/>
+  </w:num>
+  <w:num w:numId="6" w16cid:durableId="632103720">
+    <w:abstractNumId w:val="3"/>
+  </w:num>
+  <w:num w:numId="7" w16cid:durableId="747074590">
+    <w:abstractNumId w:val="8"/>
+  </w:num>
+  <w:num w:numId="8" w16cid:durableId="1675038141">
+    <w:abstractNumId w:val="7"/>
+  </w:num>
+  <w:num w:numId="9" w16cid:durableId="1632132296">
     <w:abstractNumId w:val="6"/>
   </w:num>
-  <w:num w:numId="6" w16cid:durableId="632103720">
+  <w:num w:numId="10" w16cid:durableId="466778847">
     <w:abstractNumId w:val="2"/>
   </w:num>
-  <w:num w:numId="7" w16cid:durableId="747074590">
+  <w:num w:numId="11" w16cid:durableId="286738266">
+    <w:abstractNumId w:val="12"/>
+  </w:num>
+  <w:num w:numId="12" w16cid:durableId="1547181155">
     <w:abstractNumId w:val="5"/>
   </w:num>
-  <w:num w:numId="8" w16cid:durableId="1675038141">
-    <w:abstractNumId w:val="4"/>
+  <w:num w:numId="13" w16cid:durableId="209272067">
+    <w:abstractNumId w:val="10"/>
   </w:num>
 </w:numbering>
 </file>

</xml_diff>